<commit_message>
Cover notification setup and adding members in the setup guide
The guide told testers that reminders only fire while the app is open,
which stopped being true when push shipped. It now walks through
enabling notifications — including that the button is unavailable from
a Safari tab, the failure people will actually hit — and what arrives
when.

Adds an administrator section for registering a new tester's Gmail
address, so that no longer has to be relayed each time.

Co-Authored-By: Claude Opus 5 <noreply@anthropic.com>
</commit_message>
<xml_diff>
--- a/docs/setup-guide.docx
+++ b/docs/setup-guide.docx
@@ -47,7 +47,7 @@
           <w:sz w:val="20"/>
           <w:szCs w:val="20"/>
         </w:rPr>
-        <w:t xml:space="preserve">Googleカレンダーとの連携、スマホからのワンタップ起動、iPhoneカレンダーをお使いの方の移行手順まで。所要時間はおよそ10分です。</w:t>
+        <w:t xml:space="preserve">Googleカレンダーとの連携、スマホからのワンタップ起動、お知らせの受け取り設定、iPhoneカレンダーをお使いの方の移行手順まで。所要時間はおよそ10分です。</w:t>
       </w:r>
     </w:p>
     <w:p>
@@ -84,7 +84,7 @@
         </w:rPr>
         <w:t xml:space="preserve">アプリのURL：</w:t>
       </w:r>
-      <w:hyperlink w:history="1" r:id="rIdf_vhchh7x24ki6qfspa-0">
+      <w:hyperlink w:history="1" r:id="rIdvbhknaftx5ouryf87p2gc">
         <w:r>
           <w:rPr>
             <w:rFonts w:ascii="Consolas" w:cs="Consolas" w:eastAsia="Consolas" w:hAnsi="Consolas"/>
@@ -1158,7 +1158,278 @@
           <w:sz w:val="24"/>
           <w:szCs w:val="24"/>
         </w:rPr>
-        <w:t xml:space="preserve">リマインダーについて</w:t>
+        <w:t xml:space="preserve">お知らせを受け取る設定（この設定だけは必須です）</w:t>
+      </w:r>
+    </w:p>
+    <w:p>
+      <w:pPr>
+        <w:spacing w:after="120" w:line="300"/>
+      </w:pPr>
+      <w:r>
+        <w:rPr>
+          <w:rFonts w:ascii="Yu Gothic" w:cs="Yu Gothic" w:eastAsia="Yu Gothic" w:hAnsi="Yu Gothic"/>
+          <w:sz w:val="20"/>
+          <w:szCs w:val="20"/>
+        </w:rPr>
+        <w:t xml:space="preserve">アプリを閉じていてもご予定の前にお知らせが届くようにします。</w:t>
+      </w:r>
+      <w:r>
+        <w:rPr>
+          <w:rFonts w:ascii="Yu Gothic" w:cs="Yu Gothic" w:eastAsia="Yu Gothic" w:hAnsi="Yu Gothic"/>
+          <w:b/>
+          <w:bCs/>
+          <w:sz w:val="20"/>
+          <w:szCs w:val="20"/>
+        </w:rPr>
+        <w:t xml:space="preserve">この設定をしないと通知は鳴りません。</w:t>
+      </w:r>
+      <w:r>
+        <w:rPr>
+          <w:rFonts w:ascii="Yu Gothic" w:cs="Yu Gothic" w:eastAsia="Yu Gothic" w:hAnsi="Yu Gothic"/>
+          <w:sz w:val="20"/>
+          <w:szCs w:val="20"/>
+        </w:rPr>
+        <w:t xml:space="preserve">ホーム画面への追加を済ませてから行ってください。</w:t>
+      </w:r>
+    </w:p>
+    <w:p>
+      <w:pPr>
+        <w:pStyle w:val="ListParagraph"/>
+        <w:numPr>
+          <w:ilvl w:val="0"/>
+          <w:numId w:val="6"/>
+        </w:numPr>
+        <w:spacing w:after="100" w:line="300"/>
+      </w:pPr>
+      <w:r>
+        <w:rPr>
+          <w:rFonts w:ascii="Yu Gothic" w:cs="Yu Gothic" w:eastAsia="Yu Gothic" w:hAnsi="Yu Gothic"/>
+          <w:b/>
+          <w:bCs/>
+          <w:sz w:val="20"/>
+          <w:szCs w:val="20"/>
+        </w:rPr>
+        <w:t xml:space="preserve">ホーム画面のアイコンからアプリを開く</w:t>
+      </w:r>
+    </w:p>
+    <w:p>
+      <w:pPr>
+        <w:spacing w:after="140" w:line="300"/>
+        <w:ind w:left="720"/>
+      </w:pPr>
+      <w:r>
+        <w:rPr>
+          <w:rFonts w:ascii="Yu Gothic" w:cs="Yu Gothic" w:eastAsia="Yu Gothic" w:hAnsi="Yu Gothic"/>
+          <w:sz w:val="20"/>
+          <w:szCs w:val="20"/>
+        </w:rPr>
+        <w:t xml:space="preserve">Safariのタブから開いた状態では設定できません。</w:t>
+      </w:r>
+      <w:r>
+        <w:rPr>
+          <w:rFonts w:ascii="Yu Gothic" w:cs="Yu Gothic" w:eastAsia="Yu Gothic" w:hAnsi="Yu Gothic"/>
+          <w:b/>
+          <w:bCs/>
+          <w:sz w:val="20"/>
+          <w:szCs w:val="20"/>
+        </w:rPr>
+        <w:t xml:space="preserve">必ずホーム画面のアイコンから</w:t>
+      </w:r>
+      <w:r>
+        <w:rPr>
+          <w:rFonts w:ascii="Yu Gothic" w:cs="Yu Gothic" w:eastAsia="Yu Gothic" w:hAnsi="Yu Gothic"/>
+          <w:sz w:val="20"/>
+          <w:szCs w:val="20"/>
+        </w:rPr>
+        <w:t xml:space="preserve">起動してください（iPhoneの仕様です）。</w:t>
+      </w:r>
+    </w:p>
+    <w:p>
+      <w:pPr>
+        <w:pStyle w:val="ListParagraph"/>
+        <w:numPr>
+          <w:ilvl w:val="0"/>
+          <w:numId w:val="6"/>
+        </w:numPr>
+        <w:spacing w:after="100" w:line="300"/>
+      </w:pPr>
+      <w:r>
+        <w:rPr>
+          <w:rFonts w:ascii="Yu Gothic" w:cs="Yu Gothic" w:eastAsia="Yu Gothic" w:hAnsi="Yu Gothic"/>
+          <w:b/>
+          <w:bCs/>
+          <w:sz w:val="20"/>
+          <w:szCs w:val="20"/>
+        </w:rPr>
+        <w:t xml:space="preserve">「PROFILE」（設定）→「リマインダー」を開く</w:t>
+      </w:r>
+    </w:p>
+    <w:p>
+      <w:pPr>
+        <w:spacing w:after="140" w:line="300"/>
+        <w:ind w:left="720"/>
+      </w:pPr>
+      <w:r>
+        <w:rPr>
+          <w:rFonts w:ascii="Yu Gothic" w:cs="Yu Gothic" w:eastAsia="Yu Gothic" w:hAnsi="Yu Gothic"/>
+          <w:sz w:val="20"/>
+          <w:szCs w:val="20"/>
+        </w:rPr>
+        <w:t xml:space="preserve">いちばん下に「端末へのお知らせ」という項目があります。</w:t>
+      </w:r>
+    </w:p>
+    <w:p>
+      <w:pPr>
+        <w:pStyle w:val="ListParagraph"/>
+        <w:numPr>
+          <w:ilvl w:val="0"/>
+          <w:numId w:val="6"/>
+        </w:numPr>
+        <w:spacing w:after="100" w:line="300"/>
+      </w:pPr>
+      <w:r>
+        <w:rPr>
+          <w:rFonts w:ascii="Yu Gothic" w:cs="Yu Gothic" w:eastAsia="Yu Gothic" w:hAnsi="Yu Gothic"/>
+          <w:b/>
+          <w:bCs/>
+          <w:sz w:val="20"/>
+          <w:szCs w:val="20"/>
+        </w:rPr>
+        <w:t xml:space="preserve">「有効にする」を押して、許可する</w:t>
+      </w:r>
+    </w:p>
+    <w:p>
+      <w:pPr>
+        <w:spacing w:after="140" w:line="300"/>
+        <w:ind w:left="720"/>
+      </w:pPr>
+      <w:r>
+        <w:rPr>
+          <w:rFonts w:ascii="Yu Gothic" w:cs="Yu Gothic" w:eastAsia="Yu Gothic" w:hAnsi="Yu Gothic"/>
+          <w:sz w:val="20"/>
+          <w:szCs w:val="20"/>
+        </w:rPr>
+        <w:t xml:space="preserve">「通知を送信します。よろしいですか？」と聞かれるので「許可」を押します。</w:t>
+      </w:r>
+    </w:p>
+    <w:p>
+      <w:pPr>
+        <w:pStyle w:val="ListParagraph"/>
+        <w:numPr>
+          <w:ilvl w:val="0"/>
+          <w:numId w:val="6"/>
+        </w:numPr>
+        <w:spacing w:after="100" w:line="300"/>
+      </w:pPr>
+      <w:r>
+        <w:rPr>
+          <w:rFonts w:ascii="Yu Gothic" w:cs="Yu Gothic" w:eastAsia="Yu Gothic" w:hAnsi="Yu Gothic"/>
+          <w:b/>
+          <w:bCs/>
+          <w:sz w:val="20"/>
+          <w:szCs w:val="20"/>
+        </w:rPr>
+        <w:t xml:space="preserve">「テスト通知を送る」で確認する</w:t>
+      </w:r>
+    </w:p>
+    <w:p>
+      <w:pPr>
+        <w:spacing w:after="140" w:line="300"/>
+        <w:ind w:left="720"/>
+      </w:pPr>
+      <w:r>
+        <w:rPr>
+          <w:rFonts w:ascii="Yu Gothic" w:cs="Yu Gothic" w:eastAsia="Yu Gothic" w:hAnsi="Yu Gothic"/>
+          <w:sz w:val="20"/>
+          <w:szCs w:val="20"/>
+        </w:rPr>
+        <w:t xml:space="preserve">通知が届けば設定完了です。以降はご予定の前と、毎朝のブリーフィング時刻にお知らせが届きます。</w:t>
+      </w:r>
+    </w:p>
+    <w:p>
+      <w:pPr>
+        <w:pBdr>
+          <w:top w:val="single" w:color="856732" w:sz="4" w:space="8"/>
+          <w:bottom w:val="single" w:color="856732" w:sz="4" w:space="8"/>
+          <w:left w:val="single" w:color="856732" w:sz="18" w:space="10"/>
+          <w:right w:val="single" w:color="856732" w:sz="4" w:space="8"/>
+        </w:pBdr>
+        <w:shd w:fill="FBF7EB" w:val="clear"/>
+        <w:spacing w:after="0" w:before="160" w:line="280"/>
+        <w:ind w:left="200" w:right="200"/>
+      </w:pPr>
+      <w:r>
+        <w:rPr>
+          <w:rFonts w:ascii="Yu Gothic" w:cs="Yu Gothic" w:eastAsia="Yu Gothic" w:hAnsi="Yu Gothic"/>
+          <w:b/>
+          <w:bCs/>
+          <w:color w:val="856732"/>
+          <w:sz w:val="18"/>
+          <w:szCs w:val="18"/>
+        </w:rPr>
+        <w:t xml:space="preserve">お知らせが届くタイミング</w:t>
+      </w:r>
+    </w:p>
+    <w:p>
+      <w:pPr>
+        <w:pBdr>
+          <w:top w:val="single" w:color="856732" w:sz="4" w:space="8"/>
+          <w:bottom w:val="single" w:color="856732" w:sz="4" w:space="8"/>
+          <w:left w:val="single" w:color="856732" w:sz="18" w:space="10"/>
+          <w:right w:val="single" w:color="856732" w:sz="4" w:space="8"/>
+        </w:pBdr>
+        <w:shd w:fill="FBF7EB" w:val="clear"/>
+        <w:spacing w:after="60" w:line="280"/>
+        <w:ind w:left="200" w:right="200"/>
+      </w:pPr>
+      <w:r>
+        <w:rPr>
+          <w:rFonts w:ascii="Yu Gothic" w:cs="Yu Gothic" w:eastAsia="Yu Gothic" w:hAnsi="Yu Gothic"/>
+          <w:b/>
+          <w:bCs/>
+          <w:sz w:val="20"/>
+          <w:szCs w:val="20"/>
+        </w:rPr>
+        <w:t xml:space="preserve">ご予定の前</w:t>
+      </w:r>
+      <w:r>
+        <w:rPr>
+          <w:rFonts w:ascii="Yu Gothic" w:cs="Yu Gothic" w:eastAsia="Yu Gothic" w:hAnsi="Yu Gothic"/>
+          <w:sz w:val="20"/>
+          <w:szCs w:val="20"/>
+        </w:rPr>
+        <w:t xml:space="preserve">— 設定した分数（既定は5分前）にお知らせします。分数は同じ「リマインダー」欄で変更できます。</w:t>
+      </w:r>
+    </w:p>
+    <w:p>
+      <w:pPr>
+        <w:pBdr>
+          <w:top w:val="single" w:color="856732" w:sz="4" w:space="8"/>
+          <w:bottom w:val="single" w:color="856732" w:sz="4" w:space="8"/>
+          <w:left w:val="single" w:color="856732" w:sz="18" w:space="10"/>
+          <w:right w:val="single" w:color="856732" w:sz="4" w:space="8"/>
+        </w:pBdr>
+        <w:shd w:fill="FBF7EB" w:val="clear"/>
+        <w:spacing w:after="200" w:line="280"/>
+        <w:ind w:left="200" w:right="200"/>
+      </w:pPr>
+      <w:r>
+        <w:rPr>
+          <w:rFonts w:ascii="Yu Gothic" w:cs="Yu Gothic" w:eastAsia="Yu Gothic" w:hAnsi="Yu Gothic"/>
+          <w:b/>
+          <w:bCs/>
+          <w:sz w:val="20"/>
+          <w:szCs w:val="20"/>
+        </w:rPr>
+        <w:t xml:space="preserve">毎朝</w:t>
+      </w:r>
+      <w:r>
+        <w:rPr>
+          <w:rFonts w:ascii="Yu Gothic" w:cs="Yu Gothic" w:eastAsia="Yu Gothic" w:hAnsi="Yu Gothic"/>
+          <w:sz w:val="20"/>
+          <w:szCs w:val="20"/>
+        </w:rPr>
+        <w:t xml:space="preserve">— 設定した時刻に、その日のご予定と期限の近いタスクをまとめてお知らせします。</w:t>
       </w:r>
     </w:p>
     <w:p>
@@ -1182,7 +1453,7 @@
           <w:sz w:val="18"/>
           <w:szCs w:val="18"/>
         </w:rPr>
-        <w:t xml:space="preserve">今のところ、アプリを開いている間だけ鳴ります</w:t>
+        <w:t xml:space="preserve">うまくいかないとき</w:t>
       </w:r>
     </w:p>
     <w:p>
@@ -1200,10 +1471,20 @@
       <w:r>
         <w:rPr>
           <w:rFonts w:ascii="Yu Gothic" w:cs="Yu Gothic" w:eastAsia="Yu Gothic" w:hAnsi="Yu Gothic"/>
-          <w:sz w:val="20"/>
-          <w:szCs w:val="20"/>
-        </w:rPr>
-        <w:t xml:space="preserve">予定前のお知らせは、アプリを開いている状態で画面に出る仕組みです。アプリを閉じている間にスマホへ通知を飛ばす機能はまだ入っていません。</w:t>
+          <w:b/>
+          <w:bCs/>
+          <w:sz w:val="20"/>
+          <w:szCs w:val="20"/>
+        </w:rPr>
+        <w:t xml:space="preserve">「有効にする」が押せない</w:t>
+      </w:r>
+      <w:r>
+        <w:rPr>
+          <w:rFonts w:ascii="Yu Gothic" w:cs="Yu Gothic" w:eastAsia="Yu Gothic" w:hAnsi="Yu Gothic"/>
+          <w:sz w:val="20"/>
+          <w:szCs w:val="20"/>
+        </w:rPr>
+        <w:t xml:space="preserve">— Safariのタブから開いています。ホーム画面のアイコンから開き直してください。</w:t>
       </w:r>
     </w:p>
     <w:p>
@@ -1215,34 +1496,57 @@
           <w:right w:val="single" w:color="9B3D3D" w:sz="4" w:space="8"/>
         </w:pBdr>
         <w:shd w:fill="FBF1EF" w:val="clear"/>
+        <w:spacing w:after="60" w:line="280"/>
+        <w:ind w:left="200" w:right="200"/>
+      </w:pPr>
+      <w:r>
+        <w:rPr>
+          <w:rFonts w:ascii="Yu Gothic" w:cs="Yu Gothic" w:eastAsia="Yu Gothic" w:hAnsi="Yu Gothic"/>
+          <w:b/>
+          <w:bCs/>
+          <w:sz w:val="20"/>
+          <w:szCs w:val="20"/>
+        </w:rPr>
+        <w:t xml:space="preserve">ボタンが見当たらない・許可が出ない</w:t>
+      </w:r>
+      <w:r>
+        <w:rPr>
+          <w:rFonts w:ascii="Yu Gothic" w:cs="Yu Gothic" w:eastAsia="Yu Gothic" w:hAnsi="Yu Gothic"/>
+          <w:sz w:val="20"/>
+          <w:szCs w:val="20"/>
+        </w:rPr>
+        <w:t xml:space="preserve">— 以前にホーム画面へ追加した方は、一度アイコンを削除してから追加し直してください。</w:t>
+      </w:r>
+    </w:p>
+    <w:p>
+      <w:pPr>
+        <w:pBdr>
+          <w:top w:val="single" w:color="9B3D3D" w:sz="4" w:space="8"/>
+          <w:bottom w:val="single" w:color="9B3D3D" w:sz="4" w:space="8"/>
+          <w:left w:val="single" w:color="9B3D3D" w:sz="18" w:space="10"/>
+          <w:right w:val="single" w:color="9B3D3D" w:sz="4" w:space="8"/>
+        </w:pBdr>
+        <w:shd w:fill="FBF1EF" w:val="clear"/>
         <w:spacing w:after="200" w:line="280"/>
         <w:ind w:left="200" w:right="200"/>
       </w:pPr>
       <w:r>
         <w:rPr>
           <w:rFonts w:ascii="Yu Gothic" w:cs="Yu Gothic" w:eastAsia="Yu Gothic" w:hAnsi="Yu Gothic"/>
-          <w:sz w:val="20"/>
-          <w:szCs w:val="20"/>
-        </w:rPr>
-        <w:t xml:space="preserve">そのぶん、リマインダーをオンにしている間は</w:t>
-      </w:r>
-      <w:r>
-        <w:rPr>
-          <w:rFonts w:ascii="Yu Gothic" w:cs="Yu Gothic" w:eastAsia="Yu Gothic" w:hAnsi="Yu Gothic"/>
-          <w:b/>
-          <w:bCs/>
-          <w:sz w:val="20"/>
-          <w:szCs w:val="20"/>
-        </w:rPr>
-        <w:t xml:space="preserve">画面が自動で暗くならない</w:t>
-      </w:r>
-      <w:r>
-        <w:rPr>
-          <w:rFonts w:ascii="Yu Gothic" w:cs="Yu Gothic" w:eastAsia="Yu Gothic" w:hAnsi="Yu Gothic"/>
-          <w:sz w:val="20"/>
-          <w:szCs w:val="20"/>
-        </w:rPr>
-        <w:t xml:space="preserve">ようにしてあります。会議前に開いたまま置いておけば見逃しません。</w:t>
+          <w:b/>
+          <w:bCs/>
+          <w:sz w:val="20"/>
+          <w:szCs w:val="20"/>
+        </w:rPr>
+        <w:t xml:space="preserve">それでも届かない</w:t>
+      </w:r>
+      <w:r>
+        <w:rPr>
+          <w:rFonts w:ascii="Yu Gothic" w:cs="Yu Gothic" w:eastAsia="Yu Gothic" w:hAnsi="Yu Gothic"/>
+          <w:sz w:val="20"/>
+          <w:szCs w:val="20"/>
+        </w:rPr>
+        <w:t xml:space="preserve">— iPhoneの「設定」→「通知」に THE CONCIERGE があるかご確認ください。</w:t>
       </w:r>
     </w:p>
     <w:p>
@@ -2210,6 +2514,315 @@
           <w:sz w:val="30"/>
           <w:szCs w:val="30"/>
         </w:rPr>
+        <w:t xml:space="preserve">管理者の方へ　メンバーを追加する</w:t>
+      </w:r>
+    </w:p>
+    <w:p>
+      <w:pPr>
+        <w:spacing w:after="120" w:line="300"/>
+      </w:pPr>
+      <w:r>
+        <w:rPr>
+          <w:rFonts w:ascii="Yu Gothic" w:cs="Yu Gothic" w:eastAsia="Yu Gothic" w:hAnsi="Yu Gothic"/>
+          <w:color w:val="5C739A"/>
+          <w:sz w:val="20"/>
+          <w:szCs w:val="20"/>
+        </w:rPr>
+        <w:t xml:space="preserve">新しく使う方が増えたときの作業です。ご利用される方はこの章を読み飛ばしていただいて構いません。</w:t>
+      </w:r>
+    </w:p>
+    <w:p>
+      <w:pPr>
+        <w:pBdr>
+          <w:top w:val="single" w:color="856732" w:sz="4" w:space="8"/>
+          <w:bottom w:val="single" w:color="856732" w:sz="4" w:space="8"/>
+          <w:left w:val="single" w:color="856732" w:sz="18" w:space="10"/>
+          <w:right w:val="single" w:color="856732" w:sz="4" w:space="8"/>
+        </w:pBdr>
+        <w:shd w:fill="FBF7EB" w:val="clear"/>
+        <w:spacing w:after="0" w:before="160" w:line="280"/>
+        <w:ind w:left="200" w:right="200"/>
+      </w:pPr>
+      <w:r>
+        <w:rPr>
+          <w:rFonts w:ascii="Yu Gothic" w:cs="Yu Gothic" w:eastAsia="Yu Gothic" w:hAnsi="Yu Gothic"/>
+          <w:b/>
+          <w:bCs/>
+          <w:color w:val="856732"/>
+          <w:sz w:val="18"/>
+          <w:szCs w:val="18"/>
+        </w:rPr>
+        <w:t xml:space="preserve">アプリ側の作業は不要です</w:t>
+      </w:r>
+    </w:p>
+    <w:p>
+      <w:pPr>
+        <w:pBdr>
+          <w:top w:val="single" w:color="856732" w:sz="4" w:space="8"/>
+          <w:bottom w:val="single" w:color="856732" w:sz="4" w:space="8"/>
+          <w:left w:val="single" w:color="856732" w:sz="18" w:space="10"/>
+          <w:right w:val="single" w:color="856732" w:sz="4" w:space="8"/>
+        </w:pBdr>
+        <w:shd w:fill="FBF7EB" w:val="clear"/>
+        <w:spacing w:after="200" w:line="280"/>
+        <w:ind w:left="200" w:right="200"/>
+      </w:pPr>
+      <w:r>
+        <w:rPr>
+          <w:rFonts w:ascii="Yu Gothic" w:cs="Yu Gothic" w:eastAsia="Yu Gothic" w:hAnsi="Yu Gothic"/>
+          <w:sz w:val="20"/>
+          <w:szCs w:val="20"/>
+        </w:rPr>
+        <w:t xml:space="preserve">追加した方がご自身のGoogleアカウントで連携すれば、その方専用のデータ領域が自動で作られます。必要なのは、Googleの利用許可リストに1名を加えることだけです。</w:t>
+      </w:r>
+    </w:p>
+    <w:p>
+      <w:pPr>
+        <w:pStyle w:val="ListParagraph"/>
+        <w:numPr>
+          <w:ilvl w:val="0"/>
+          <w:numId w:val="9"/>
+        </w:numPr>
+        <w:spacing w:after="100" w:line="300"/>
+      </w:pPr>
+      <w:r>
+        <w:rPr>
+          <w:rFonts w:ascii="Yu Gothic" w:cs="Yu Gothic" w:eastAsia="Yu Gothic" w:hAnsi="Yu Gothic"/>
+          <w:b/>
+          <w:bCs/>
+          <w:sz w:val="20"/>
+          <w:szCs w:val="20"/>
+        </w:rPr>
+        <w:t xml:space="preserve">Google Cloud Console を開く</w:t>
+      </w:r>
+    </w:p>
+    <w:p>
+      <w:pPr>
+        <w:spacing w:after="140" w:line="300"/>
+        <w:ind w:left="720"/>
+      </w:pPr>
+      <w:r>
+        <w:rPr>
+          <w:rFonts w:ascii="Yu Gothic" w:cs="Yu Gothic" w:eastAsia="Yu Gothic" w:hAnsi="Yu Gothic"/>
+          <w:sz w:val="20"/>
+          <w:szCs w:val="20"/>
+        </w:rPr>
+        <w:t xml:space="preserve">console.cloud.google.com を開き、画面上部でこのアプリのプロジェクトが選ばれているかご確認ください。</w:t>
+      </w:r>
+    </w:p>
+    <w:p>
+      <w:pPr>
+        <w:pStyle w:val="ListParagraph"/>
+        <w:numPr>
+          <w:ilvl w:val="0"/>
+          <w:numId w:val="9"/>
+        </w:numPr>
+        <w:spacing w:after="100" w:line="300"/>
+      </w:pPr>
+      <w:r>
+        <w:rPr>
+          <w:rFonts w:ascii="Yu Gothic" w:cs="Yu Gothic" w:eastAsia="Yu Gothic" w:hAnsi="Yu Gothic"/>
+          <w:b/>
+          <w:bCs/>
+          <w:sz w:val="20"/>
+          <w:szCs w:val="20"/>
+        </w:rPr>
+        <w:t xml:space="preserve">「Google Auth Platform」→「対象」を開く</w:t>
+      </w:r>
+    </w:p>
+    <w:p>
+      <w:pPr>
+        <w:spacing w:after="140" w:line="300"/>
+        <w:ind w:left="720"/>
+      </w:pPr>
+      <w:r>
+        <w:rPr>
+          <w:rFonts w:ascii="Yu Gothic" w:cs="Yu Gothic" w:eastAsia="Yu Gothic" w:hAnsi="Yu Gothic"/>
+          <w:sz w:val="20"/>
+          <w:szCs w:val="20"/>
+        </w:rPr>
+        <w:t xml:space="preserve">以前の画面では「APIとサービス → OAuth同意画面」です。表示が違う場合は、上部の検索窓に「OAuth」と入れると辿り着けます。</w:t>
+      </w:r>
+    </w:p>
+    <w:p>
+      <w:pPr>
+        <w:pStyle w:val="ListParagraph"/>
+        <w:numPr>
+          <w:ilvl w:val="0"/>
+          <w:numId w:val="9"/>
+        </w:numPr>
+        <w:spacing w:after="100" w:line="300"/>
+      </w:pPr>
+      <w:r>
+        <w:rPr>
+          <w:rFonts w:ascii="Yu Gothic" w:cs="Yu Gothic" w:eastAsia="Yu Gothic" w:hAnsi="Yu Gothic"/>
+          <w:b/>
+          <w:bCs/>
+          <w:sz w:val="20"/>
+          <w:szCs w:val="20"/>
+        </w:rPr>
+        <w:t xml:space="preserve">「テストユーザー」の「＋ ユーザーを追加」を押す</w:t>
+      </w:r>
+    </w:p>
+    <w:p>
+      <w:pPr>
+        <w:spacing w:after="140" w:line="300"/>
+        <w:ind w:left="720"/>
+      </w:pPr>
+      <w:r>
+        <w:rPr>
+          <w:rFonts w:ascii="Yu Gothic" w:cs="Yu Gothic" w:eastAsia="Yu Gothic" w:hAnsi="Yu Gothic"/>
+          <w:sz w:val="20"/>
+          <w:szCs w:val="20"/>
+        </w:rPr>
+        <w:t xml:space="preserve">追加したい方の</w:t>
+      </w:r>
+      <w:r>
+        <w:rPr>
+          <w:rFonts w:ascii="Yu Gothic" w:cs="Yu Gothic" w:eastAsia="Yu Gothic" w:hAnsi="Yu Gothic"/>
+          <w:b/>
+          <w:bCs/>
+          <w:sz w:val="20"/>
+          <w:szCs w:val="20"/>
+        </w:rPr>
+        <w:t xml:space="preserve">Gmailアドレス</w:t>
+      </w:r>
+      <w:r>
+        <w:rPr>
+          <w:rFonts w:ascii="Yu Gothic" w:cs="Yu Gothic" w:eastAsia="Yu Gothic" w:hAnsi="Yu Gothic"/>
+          <w:sz w:val="20"/>
+          <w:szCs w:val="20"/>
+        </w:rPr>
+        <w:t xml:space="preserve">を入力して保存します。反映は即時で、審査などの待ち時間はありません。</w:t>
+      </w:r>
+    </w:p>
+    <w:p>
+      <w:pPr>
+        <w:pStyle w:val="ListParagraph"/>
+        <w:numPr>
+          <w:ilvl w:val="0"/>
+          <w:numId w:val="9"/>
+        </w:numPr>
+        <w:spacing w:after="100" w:line="300"/>
+      </w:pPr>
+      <w:r>
+        <w:rPr>
+          <w:rFonts w:ascii="Yu Gothic" w:cs="Yu Gothic" w:eastAsia="Yu Gothic" w:hAnsi="Yu Gothic"/>
+          <w:b/>
+          <w:bCs/>
+          <w:sz w:val="20"/>
+          <w:szCs w:val="20"/>
+        </w:rPr>
+        <w:t xml:space="preserve">本人にURLとこの手引きを渡す</w:t>
+      </w:r>
+    </w:p>
+    <w:p>
+      <w:pPr>
+        <w:spacing w:after="140" w:line="300"/>
+        <w:ind w:left="720"/>
+      </w:pPr>
+      <w:r>
+        <w:rPr>
+          <w:rFonts w:ascii="Yu Gothic" w:cs="Yu Gothic" w:eastAsia="Yu Gothic" w:hAnsi="Yu Gothic"/>
+          <w:sz w:val="20"/>
+          <w:szCs w:val="20"/>
+        </w:rPr>
+        <w:t xml:space="preserve">あとはこの手引きのとおりに進めていただければ使い始められます。</w:t>
+      </w:r>
+    </w:p>
+    <w:p>
+      <w:pPr>
+        <w:pBdr>
+          <w:top w:val="single" w:color="9B3D3D" w:sz="4" w:space="8"/>
+          <w:bottom w:val="single" w:color="9B3D3D" w:sz="4" w:space="8"/>
+          <w:left w:val="single" w:color="9B3D3D" w:sz="18" w:space="10"/>
+          <w:right w:val="single" w:color="9B3D3D" w:sz="4" w:space="8"/>
+        </w:pBdr>
+        <w:shd w:fill="FBF1EF" w:val="clear"/>
+        <w:spacing w:after="0" w:before="160" w:line="280"/>
+        <w:ind w:left="200" w:right="200"/>
+      </w:pPr>
+      <w:r>
+        <w:rPr>
+          <w:rFonts w:ascii="Yu Gothic" w:cs="Yu Gothic" w:eastAsia="Yu Gothic" w:hAnsi="Yu Gothic"/>
+          <w:b/>
+          <w:bCs/>
+          <w:color w:val="9B3D3D"/>
+          <w:sz w:val="18"/>
+          <w:szCs w:val="18"/>
+        </w:rPr>
+        <w:t xml:space="preserve">よくある行き違い</w:t>
+      </w:r>
+    </w:p>
+    <w:p>
+      <w:pPr>
+        <w:pBdr>
+          <w:top w:val="single" w:color="9B3D3D" w:sz="4" w:space="8"/>
+          <w:bottom w:val="single" w:color="9B3D3D" w:sz="4" w:space="8"/>
+          <w:left w:val="single" w:color="9B3D3D" w:sz="18" w:space="10"/>
+          <w:right w:val="single" w:color="9B3D3D" w:sz="4" w:space="8"/>
+        </w:pBdr>
+        <w:shd w:fill="FBF1EF" w:val="clear"/>
+        <w:spacing w:after="60" w:line="280"/>
+        <w:ind w:left="200" w:right="200"/>
+      </w:pPr>
+      <w:r>
+        <w:rPr>
+          <w:rFonts w:ascii="Yu Gothic" w:cs="Yu Gothic" w:eastAsia="Yu Gothic" w:hAnsi="Yu Gothic"/>
+          <w:b/>
+          <w:bCs/>
+          <w:sz w:val="20"/>
+          <w:szCs w:val="20"/>
+        </w:rPr>
+        <w:t xml:space="preserve">登録したアドレスと、本人がログインで選ぶアドレスは一致している必要があります。</w:t>
+      </w:r>
+      <w:r>
+        <w:rPr>
+          <w:rFonts w:ascii="Yu Gothic" w:cs="Yu Gothic" w:eastAsia="Yu Gothic" w:hAnsi="Yu Gothic"/>
+          <w:sz w:val="20"/>
+          <w:szCs w:val="20"/>
+        </w:rPr>
+        <w:t xml:space="preserve">仕事用と個人用の2つのGoogleアカウントをお持ちの方には、どちらで使うか事前にご確認ください。違うアドレスを選ぶと「アクセスをブロックしました」と表示されます。</w:t>
+      </w:r>
+    </w:p>
+    <w:p>
+      <w:pPr>
+        <w:pBdr>
+          <w:top w:val="single" w:color="9B3D3D" w:sz="4" w:space="8"/>
+          <w:bottom w:val="single" w:color="9B3D3D" w:sz="4" w:space="8"/>
+          <w:left w:val="single" w:color="9B3D3D" w:sz="18" w:space="10"/>
+          <w:right w:val="single" w:color="9B3D3D" w:sz="4" w:space="8"/>
+        </w:pBdr>
+        <w:shd w:fill="FBF1EF" w:val="clear"/>
+        <w:spacing w:after="200" w:line="280"/>
+        <w:ind w:left="200" w:right="200"/>
+      </w:pPr>
+      <w:r>
+        <w:rPr>
+          <w:rFonts w:ascii="Yu Gothic" w:cs="Yu Gothic" w:eastAsia="Yu Gothic" w:hAnsi="Yu Gothic"/>
+          <w:sz w:val="20"/>
+          <w:szCs w:val="20"/>
+        </w:rPr>
+        <w:t xml:space="preserve">テストユーザーは100人まで登録できます。現在の人数であれば余裕があります。</w:t>
+      </w:r>
+    </w:p>
+    <w:p>
+      <w:pPr>
+        <w:pStyle w:val="Heading1"/>
+        <w:pBdr>
+          <w:bottom w:val="single" w:color="856732" w:sz="8" w:space="6"/>
+        </w:pBdr>
+        <w:spacing w:after="200" w:before="400"/>
+      </w:pPr>
+      <w:r>
+        <w:rPr>
+          <w:rFonts w:ascii="Yu Gothic" w:cs="Yu Gothic" w:eastAsia="Yu Gothic" w:hAnsi="Yu Gothic"/>
+          <w:b/>
+          <w:bCs/>
+          <w:color w:val="0A1A30"/>
+          <w:sz w:val="30"/>
+          <w:szCs w:val="30"/>
+        </w:rPr>
         <w:t xml:space="preserve">よくある質問</w:t>
       </w:r>
     </w:p>
@@ -2699,6 +3312,12 @@
     </w:lvlOverride>
   </w:num>
   <w:num w:numId="8">
+    <w:abstractNumId w:val="2"/>
+    <w:lvlOverride w:ilvl="0">
+      <w:startOverride w:val="1"/>
+    </w:lvlOverride>
+  </w:num>
+  <w:num w:numId="9">
     <w:abstractNumId w:val="2"/>
     <w:lvlOverride w:ilvl="0">
       <w:startOverride w:val="1"/>

</xml_diff>

<commit_message>
Point the setup guide at the app URL that actually works
The guide listed the-concierge-delta.vercel.app, taken from an investor
sheet without checking where it led. That host serves an abandoned
Vercel project built on 8/8 from code never committed here: no backend
URL compiled in, so it silently runs in demo mode and reports
"連携中（テスト）" however the user connects.

The live app is ai-concierge-nu.vercel.app, confirmed three ways: it is
what the backend redirects OAuth to, the only origin its CORS accepts,
and its bundle carries the Render URL.

Co-Authored-By: Claude Opus 5 <noreply@anthropic.com>
</commit_message>
<xml_diff>
--- a/docs/setup-guide.docx
+++ b/docs/setup-guide.docx
@@ -84,7 +84,7 @@
         </w:rPr>
         <w:t xml:space="preserve">アプリのURL：</w:t>
       </w:r>
-      <w:hyperlink w:history="1" r:id="rIdvbhknaftx5ouryf87p2gc">
+      <w:hyperlink w:history="1" r:id="rIdfedtnwswl_wq781bchlrb">
         <w:r>
           <w:rPr>
             <w:rFonts w:ascii="Consolas" w:cs="Consolas" w:eastAsia="Consolas" w:hAnsi="Consolas"/>
@@ -93,7 +93,7 @@
             <w:szCs w:val="20"/>
             <w:u w:val="single"/>
           </w:rPr>
-          <w:t xml:space="preserve">https://the-concierge-delta.vercel.app</w:t>
+          <w:t xml:space="preserve">https://ai-concierge-nu.vercel.app</w:t>
         </w:r>
       </w:hyperlink>
     </w:p>

</xml_diff>

<commit_message>
Add feature overview + caveats to the manual, and a feedback tracker
The manual jumped straight into setup steps with no summary of what the
app does or doesn't do yet. Testers were finding out about the 7-day
reauth requirement and the Outlook gap by hitting them, not by reading
ahead. A new opening section states both before setup begins.

Adds a feedback spreadsheet for the 4-person test: one row per item,
with reporter/date on the way in, a status workflow (untouched through
closed, plus a legitimate "won't fix"), and a running response log so
resolution isn't a single overwritten cell. Delivered as xlsx into the
synced Drive folder rather than through the Sheets API, since piping a
50KB+ file through inline tool-call content isn't a sane way to create
one file.

Co-Authored-By: Claude Opus 5 <noreply@anthropic.com>
</commit_message>
<xml_diff>
--- a/docs/setup-guide.docx
+++ b/docs/setup-guide.docx
@@ -84,7 +84,7 @@
         </w:rPr>
         <w:t xml:space="preserve">アプリのURL：</w:t>
       </w:r>
-      <w:hyperlink w:history="1" r:id="rIdfedtnwswl_wq781bchlrb">
+      <w:hyperlink w:history="1" r:id="rIdlh39obgrba9x0sdxuvd4p">
         <w:r>
           <w:rPr>
             <w:rFonts w:ascii="Consolas" w:cs="Consolas" w:eastAsia="Consolas" w:hAnsi="Consolas"/>
@@ -196,7 +196,7 @@
           <w:sz w:val="30"/>
           <w:szCs w:val="30"/>
         </w:rPr>
-        <w:t xml:space="preserve">Part 1　Googleカレンダーをつなぐ</w:t>
+        <w:t xml:space="preserve">今できること・できないこと</w:t>
       </w:r>
     </w:p>
     <w:p>
@@ -210,7 +210,24 @@
           <w:sz w:val="20"/>
           <w:szCs w:val="20"/>
         </w:rPr>
-        <w:t xml:space="preserve">アプリに「あなたのカレンダーを読み書きしてよい」と許可を与える作業です。パスワードをアプリに預けることはありません。</w:t>
+        <w:t xml:space="preserve">設定を始める前に、機能の範囲と現時点の制限をご確認ください。読んでおいていただくと、あとで戸惑うことが減ります。</w:t>
+      </w:r>
+    </w:p>
+    <w:p>
+      <w:pPr>
+        <w:pStyle w:val="Heading2"/>
+        <w:spacing w:after="140" w:before="300"/>
+      </w:pPr>
+      <w:r>
+        <w:rPr>
+          <w:rFonts w:ascii="Yu Gothic" w:cs="Yu Gothic" w:eastAsia="Yu Gothic" w:hAnsi="Yu Gothic"/>
+          <w:b/>
+          <w:bCs/>
+          <w:color w:val="1E3A5F"/>
+          <w:sz w:val="24"/>
+          <w:szCs w:val="24"/>
+        </w:rPr>
+        <w:t xml:space="preserve">できること</w:t>
       </w:r>
     </w:p>
     <w:p>
@@ -225,26 +242,10 @@
       <w:r>
         <w:rPr>
           <w:rFonts w:ascii="Yu Gothic" w:cs="Yu Gothic" w:eastAsia="Yu Gothic" w:hAnsi="Yu Gothic"/>
-          <w:b/>
-          <w:bCs/>
-          <w:sz w:val="20"/>
-          <w:szCs w:val="20"/>
-        </w:rPr>
-        <w:t xml:space="preserve">アプリのURLを開く</w:t>
-      </w:r>
-    </w:p>
-    <w:p>
-      <w:pPr>
-        <w:spacing w:after="140" w:line="300"/>
-        <w:ind w:left="720"/>
-      </w:pPr>
-      <w:r>
-        <w:rPr>
-          <w:rFonts w:ascii="Yu Gothic" w:cs="Yu Gothic" w:eastAsia="Yu Gothic" w:hAnsi="Yu Gothic"/>
-          <w:sz w:val="20"/>
-          <w:szCs w:val="20"/>
-        </w:rPr>
-        <w:t xml:space="preserve">上のURLを開くと、金色の「はじめる」ボタンがある画面が出ます。押して進みます。</w:t>
+          <w:sz w:val="20"/>
+          <w:szCs w:val="20"/>
+        </w:rPr>
+        <w:t xml:space="preserve">会話（テキスト・音声）でのご予定登録・変更・空き時間確認</w:t>
       </w:r>
     </w:p>
     <w:p>
@@ -259,26 +260,10 @@
       <w:r>
         <w:rPr>
           <w:rFonts w:ascii="Yu Gothic" w:cs="Yu Gothic" w:eastAsia="Yu Gothic" w:hAnsi="Yu Gothic"/>
-          <w:b/>
-          <w:bCs/>
-          <w:sz w:val="20"/>
-          <w:szCs w:val="20"/>
-        </w:rPr>
-        <w:t xml:space="preserve">お立場を選ぶ（STEP 1/3）</w:t>
-      </w:r>
-    </w:p>
-    <w:p>
-      <w:pPr>
-        <w:spacing w:after="140" w:line="300"/>
-        <w:ind w:left="720"/>
-      </w:pPr>
-      <w:r>
-        <w:rPr>
-          <w:rFonts w:ascii="Yu Gothic" w:cs="Yu Gothic" w:eastAsia="Yu Gothic" w:hAnsi="Yu Gothic"/>
-          <w:sz w:val="20"/>
-          <w:szCs w:val="20"/>
-        </w:rPr>
-        <w:t xml:space="preserve">「社長」「役員」「CFO」から選びます。秘書があなたをどう呼ぶかが変わるだけなので、深く悩まず選んで「次へ」を押してください。あとから設定画面で変更できます。</w:t>
+          <w:sz w:val="20"/>
+          <w:szCs w:val="20"/>
+        </w:rPr>
+        <w:t xml:space="preserve">候補日の仮押さえ（返事待ちの間、他の予定で埋まらないよう自動でブロック）</w:t>
       </w:r>
     </w:p>
     <w:p>
@@ -293,36 +278,10 @@
       <w:r>
         <w:rPr>
           <w:rFonts w:ascii="Yu Gothic" w:cs="Yu Gothic" w:eastAsia="Yu Gothic" w:hAnsi="Yu Gothic"/>
-          <w:b/>
-          <w:bCs/>
-          <w:sz w:val="20"/>
-          <w:szCs w:val="20"/>
-        </w:rPr>
-        <w:t xml:space="preserve">「カレンダーをご連携」でGoogleの「連携する」を押す（STEP 2/3）</w:t>
-      </w:r>
-    </w:p>
-    <w:p>
-      <w:pPr>
-        <w:spacing w:after="140" w:line="300"/>
-        <w:ind w:left="720"/>
-      </w:pPr>
-      <w:r>
-        <w:rPr>
-          <w:rFonts w:ascii="Yu Gothic" w:cs="Yu Gothic" w:eastAsia="Yu Gothic" w:hAnsi="Yu Gothic"/>
-          <w:sz w:val="20"/>
-          <w:szCs w:val="20"/>
-        </w:rPr>
-        <w:t xml:space="preserve">Googleのログイン画面に切り替わります。</w:t>
-      </w:r>
-      <w:r>
-        <w:rPr>
-          <w:rFonts w:ascii="Yu Gothic" w:cs="Yu Gothic" w:eastAsia="Yu Gothic" w:hAnsi="Yu Gothic"/>
-          <w:b/>
-          <w:bCs/>
-          <w:sz w:val="20"/>
-          <w:szCs w:val="20"/>
-        </w:rPr>
-        <w:t xml:space="preserve">ここで1つ以上つながないと次へ進めません。</w:t>
+          <w:sz w:val="20"/>
+          <w:szCs w:val="20"/>
+        </w:rPr>
+        <w:t xml:space="preserve">1つのアカウント内で複数カレンダーを選び、同時登録・重複のない一覧表示</w:t>
       </w:r>
     </w:p>
     <w:p>
@@ -337,44 +296,10 @@
       <w:r>
         <w:rPr>
           <w:rFonts w:ascii="Yu Gothic" w:cs="Yu Gothic" w:eastAsia="Yu Gothic" w:hAnsi="Yu Gothic"/>
-          <w:b/>
-          <w:bCs/>
-          <w:sz w:val="20"/>
-          <w:szCs w:val="20"/>
-        </w:rPr>
-        <w:t xml:space="preserve">使いたいGoogleアカウントを選ぶ</w:t>
-      </w:r>
-    </w:p>
-    <w:p>
-      <w:pPr>
-        <w:spacing w:after="140" w:line="300"/>
-        <w:ind w:left="720"/>
-      </w:pPr>
-      <w:r>
-        <w:rPr>
-          <w:rFonts w:ascii="Yu Gothic" w:cs="Yu Gothic" w:eastAsia="Yu Gothic" w:hAnsi="Yu Gothic"/>
-          <w:sz w:val="20"/>
-          <w:szCs w:val="20"/>
-        </w:rPr>
-        <w:t xml:space="preserve">複数のアカウントでログインしている場合は、</w:t>
-      </w:r>
-      <w:r>
-        <w:rPr>
-          <w:rFonts w:ascii="Yu Gothic" w:cs="Yu Gothic" w:eastAsia="Yu Gothic" w:hAnsi="Yu Gothic"/>
-          <w:b/>
-          <w:bCs/>
-          <w:sz w:val="20"/>
-          <w:szCs w:val="20"/>
-        </w:rPr>
-        <w:t xml:space="preserve">管理者に伝えたアドレス</w:t>
-      </w:r>
-      <w:r>
-        <w:rPr>
-          <w:rFonts w:ascii="Yu Gothic" w:cs="Yu Gothic" w:eastAsia="Yu Gothic" w:hAnsi="Yu Gothic"/>
-          <w:sz w:val="20"/>
-          <w:szCs w:val="20"/>
-        </w:rPr>
-        <w:t xml:space="preserve">を選んでください。別のアドレスを選ぶとブロックされます。</w:t>
+          <w:sz w:val="20"/>
+          <w:szCs w:val="20"/>
+        </w:rPr>
+        <w:t xml:space="preserve">タスク（期限付きのやること）の登録・管理</w:t>
       </w:r>
     </w:p>
     <w:p>
@@ -389,26 +314,45 @@
       <w:r>
         <w:rPr>
           <w:rFonts w:ascii="Yu Gothic" w:cs="Yu Gothic" w:eastAsia="Yu Gothic" w:hAnsi="Yu Gothic"/>
-          <w:b/>
-          <w:bCs/>
-          <w:sz w:val="20"/>
-          <w:szCs w:val="20"/>
-        </w:rPr>
-        <w:t xml:space="preserve">「このアプリはGoogleで確認されていません」を通過する</w:t>
-      </w:r>
-    </w:p>
-    <w:p>
-      <w:pPr>
-        <w:spacing w:after="140" w:line="300"/>
-        <w:ind w:left="720"/>
-      </w:pPr>
-      <w:r>
-        <w:rPr>
-          <w:rFonts w:ascii="Yu Gothic" w:cs="Yu Gothic" w:eastAsia="Yu Gothic" w:hAnsi="Yu Gothic"/>
-          <w:sz w:val="20"/>
-          <w:szCs w:val="20"/>
-        </w:rPr>
-        <w:t xml:space="preserve">審査前の社内テストアプリのため、警告画面が出ます。画面左下の「詳細」を押し、下に出てくる「（安全ではないページ）に移動」を押してください。</w:t>
+          <w:sz w:val="20"/>
+          <w:szCs w:val="20"/>
+        </w:rPr>
+        <w:t xml:space="preserve">毎朝のブリーフィングと、ご予定前のリマインダー（</w:t>
+      </w:r>
+      <w:r>
+        <w:rPr>
+          <w:rFonts w:ascii="Yu Gothic" w:cs="Yu Gothic" w:eastAsia="Yu Gothic" w:hAnsi="Yu Gothic"/>
+          <w:b/>
+          <w:bCs/>
+          <w:sz w:val="20"/>
+          <w:szCs w:val="20"/>
+        </w:rPr>
+        <w:t xml:space="preserve">要設定・後述</w:t>
+      </w:r>
+      <w:r>
+        <w:rPr>
+          <w:rFonts w:ascii="Yu Gothic" w:cs="Yu Gothic" w:eastAsia="Yu Gothic" w:hAnsi="Yu Gothic"/>
+          <w:sz w:val="20"/>
+          <w:szCs w:val="20"/>
+        </w:rPr>
+        <w:t xml:space="preserve">）</w:t>
+      </w:r>
+    </w:p>
+    <w:p>
+      <w:pPr>
+        <w:pStyle w:val="Heading2"/>
+        <w:spacing w:after="140" w:before="300"/>
+      </w:pPr>
+      <w:r>
+        <w:rPr>
+          <w:rFonts w:ascii="Yu Gothic" w:cs="Yu Gothic" w:eastAsia="Yu Gothic" w:hAnsi="Yu Gothic"/>
+          <w:b/>
+          <w:bCs/>
+          <w:color w:val="1E3A5F"/>
+          <w:sz w:val="24"/>
+          <w:szCs w:val="24"/>
+        </w:rPr>
+        <w:t xml:space="preserve">現時点でできないこと・制限があること</w:t>
       </w:r>
     </w:p>
     <w:p>
@@ -432,7 +376,7 @@
           <w:sz w:val="18"/>
           <w:szCs w:val="18"/>
         </w:rPr>
-        <w:t xml:space="preserve">この警告について</w:t>
+        <w:t xml:space="preserve">機能の制限</w:t>
       </w:r>
     </w:p>
     <w:p>
@@ -444,119 +388,6 @@
           <w:right w:val="single" w:color="9B3D3D" w:sz="4" w:space="8"/>
         </w:pBdr>
         <w:shd w:fill="FBF1EF" w:val="clear"/>
-        <w:spacing w:after="200" w:line="280"/>
-        <w:ind w:left="200" w:right="200"/>
-      </w:pPr>
-      <w:r>
-        <w:rPr>
-          <w:rFonts w:ascii="Yu Gothic" w:cs="Yu Gothic" w:eastAsia="Yu Gothic" w:hAnsi="Yu Gothic"/>
-          <w:sz w:val="20"/>
-          <w:szCs w:val="20"/>
-        </w:rPr>
-        <w:t xml:space="preserve">これはGoogleの審査をまだ受けていない開発中アプリすべてに出る表示で、不具合ではありません。今回は自分たちで作ったアプリだと分かっているため進んで問題ありません。一般公開時には審査を通すのでこの画面は出なくなります。</w:t>
-      </w:r>
-    </w:p>
-    <w:p>
-      <w:pPr>
-        <w:pStyle w:val="ListParagraph"/>
-        <w:numPr>
-          <w:ilvl w:val="0"/>
-          <w:numId w:val="3"/>
-        </w:numPr>
-        <w:spacing w:after="100" w:line="300"/>
-      </w:pPr>
-      <w:r>
-        <w:rPr>
-          <w:rFonts w:ascii="Yu Gothic" w:cs="Yu Gothic" w:eastAsia="Yu Gothic" w:hAnsi="Yu Gothic"/>
-          <w:b/>
-          <w:bCs/>
-          <w:sz w:val="20"/>
-          <w:szCs w:val="20"/>
-        </w:rPr>
-        <w:t xml:space="preserve">カレンダーへのアクセスを許可する</w:t>
-      </w:r>
-    </w:p>
-    <w:p>
-      <w:pPr>
-        <w:spacing w:after="140" w:line="300"/>
-        <w:ind w:left="720"/>
-      </w:pPr>
-      <w:r>
-        <w:rPr>
-          <w:rFonts w:ascii="Yu Gothic" w:cs="Yu Gothic" w:eastAsia="Yu Gothic" w:hAnsi="Yu Gothic"/>
-          <w:sz w:val="20"/>
-          <w:szCs w:val="20"/>
-        </w:rPr>
-        <w:t xml:space="preserve">「予定の表示・編集」の許可を求められます。チェックを入れて「続行」を押すと、アプリに戻ります。</w:t>
-      </w:r>
-    </w:p>
-    <w:p>
-      <w:pPr>
-        <w:pStyle w:val="ListParagraph"/>
-        <w:numPr>
-          <w:ilvl w:val="0"/>
-          <w:numId w:val="3"/>
-        </w:numPr>
-        <w:spacing w:after="100" w:line="300"/>
-      </w:pPr>
-      <w:r>
-        <w:rPr>
-          <w:rFonts w:ascii="Yu Gothic" w:cs="Yu Gothic" w:eastAsia="Yu Gothic" w:hAnsi="Yu Gothic"/>
-          <w:b/>
-          <w:bCs/>
-          <w:sz w:val="20"/>
-          <w:szCs w:val="20"/>
-        </w:rPr>
-        <w:t xml:space="preserve">「参照」と「登録先」のカレンダーを選ぶ</w:t>
-      </w:r>
-    </w:p>
-    <w:p>
-      <w:pPr>
-        <w:spacing w:after="140" w:line="300"/>
-        <w:ind w:left="720"/>
-      </w:pPr>
-      <w:r>
-        <w:rPr>
-          <w:rFonts w:ascii="Yu Gothic" w:cs="Yu Gothic" w:eastAsia="Yu Gothic" w:hAnsi="Yu Gothic"/>
-          <w:sz w:val="20"/>
-          <w:szCs w:val="20"/>
-        </w:rPr>
-        <w:t xml:space="preserve">アプリに戻ると、カレンダー連携の画面に戻ってきます。カレンダーを複数お持ちの方は、ここで選択欄が出ます。</w:t>
-      </w:r>
-    </w:p>
-    <w:p>
-      <w:pPr>
-        <w:pBdr>
-          <w:top w:val="single" w:color="856732" w:sz="4" w:space="8"/>
-          <w:bottom w:val="single" w:color="856732" w:sz="4" w:space="8"/>
-          <w:left w:val="single" w:color="856732" w:sz="18" w:space="10"/>
-          <w:right w:val="single" w:color="856732" w:sz="4" w:space="8"/>
-        </w:pBdr>
-        <w:shd w:fill="FBF7EB" w:val="clear"/>
-        <w:spacing w:after="0" w:before="160" w:line="280"/>
-        <w:ind w:left="200" w:right="200"/>
-      </w:pPr>
-      <w:r>
-        <w:rPr>
-          <w:rFonts w:ascii="Yu Gothic" w:cs="Yu Gothic" w:eastAsia="Yu Gothic" w:hAnsi="Yu Gothic"/>
-          <w:b/>
-          <w:bCs/>
-          <w:color w:val="856732"/>
-          <w:sz w:val="18"/>
-          <w:szCs w:val="18"/>
-        </w:rPr>
-        <w:t xml:space="preserve">2つの設定の違い</w:t>
-      </w:r>
-    </w:p>
-    <w:p>
-      <w:pPr>
-        <w:pBdr>
-          <w:top w:val="single" w:color="856732" w:sz="4" w:space="8"/>
-          <w:bottom w:val="single" w:color="856732" w:sz="4" w:space="8"/>
-          <w:left w:val="single" w:color="856732" w:sz="18" w:space="10"/>
-          <w:right w:val="single" w:color="856732" w:sz="4" w:space="8"/>
-        </w:pBdr>
-        <w:shd w:fill="FBF7EB" w:val="clear"/>
         <w:spacing w:after="60" w:line="280"/>
         <w:ind w:left="200" w:right="200"/>
       </w:pPr>
@@ -568,163 +399,15 @@
           <w:sz w:val="20"/>
           <w:szCs w:val="20"/>
         </w:rPr>
-        <w:t xml:space="preserve">参照</w:t>
-      </w:r>
-      <w:r>
-        <w:rPr>
-          <w:rFonts w:ascii="Yu Gothic" w:cs="Yu Gothic" w:eastAsia="Yu Gothic" w:hAnsi="Yu Gothic"/>
-          <w:sz w:val="20"/>
-          <w:szCs w:val="20"/>
-        </w:rPr>
-        <w:t xml:space="preserve">＝空き時間を探すときに「予定が入っている」とみなすカレンダー。仕事用と個人用の両方を選んでおくと、プライベートの予定に会議を入れられずに済みます。</w:t>
-      </w:r>
-    </w:p>
-    <w:p>
-      <w:pPr>
-        <w:pBdr>
-          <w:top w:val="single" w:color="856732" w:sz="4" w:space="8"/>
-          <w:bottom w:val="single" w:color="856732" w:sz="4" w:space="8"/>
-          <w:left w:val="single" w:color="856732" w:sz="18" w:space="10"/>
-          <w:right w:val="single" w:color="856732" w:sz="4" w:space="8"/>
-        </w:pBdr>
-        <w:shd w:fill="FBF7EB" w:val="clear"/>
-        <w:spacing w:after="60" w:line="280"/>
-        <w:ind w:left="200" w:right="200"/>
-      </w:pPr>
-      <w:r>
-        <w:rPr>
-          <w:rFonts w:ascii="Yu Gothic" w:cs="Yu Gothic" w:eastAsia="Yu Gothic" w:hAnsi="Yu Gothic"/>
-          <w:b/>
-          <w:bCs/>
-          <w:sz w:val="20"/>
-          <w:szCs w:val="20"/>
-        </w:rPr>
-        <w:t xml:space="preserve">登録先</w:t>
-      </w:r>
-      <w:r>
-        <w:rPr>
-          <w:rFonts w:ascii="Yu Gothic" w:cs="Yu Gothic" w:eastAsia="Yu Gothic" w:hAnsi="Yu Gothic"/>
-          <w:sz w:val="20"/>
-          <w:szCs w:val="20"/>
-        </w:rPr>
-        <w:t xml:space="preserve">＝新しい予定を書き込むカレンダー。複数選ぶと、その全部に同時に登録されます。</w:t>
-      </w:r>
-    </w:p>
-    <w:p>
-      <w:pPr>
-        <w:pBdr>
-          <w:top w:val="single" w:color="856732" w:sz="4" w:space="8"/>
-          <w:bottom w:val="single" w:color="856732" w:sz="4" w:space="8"/>
-          <w:left w:val="single" w:color="856732" w:sz="18" w:space="10"/>
-          <w:right w:val="single" w:color="856732" w:sz="4" w:space="8"/>
-        </w:pBdr>
-        <w:shd w:fill="FBF7EB" w:val="clear"/>
-        <w:spacing w:after="200" w:line="280"/>
-        <w:ind w:left="200" w:right="200"/>
-      </w:pPr>
-      <w:r>
-        <w:rPr>
-          <w:rFonts w:ascii="Yu Gothic" w:cs="Yu Gothic" w:eastAsia="Yu Gothic" w:hAnsi="Yu Gothic"/>
-          <w:sz w:val="20"/>
-          <w:szCs w:val="20"/>
-        </w:rPr>
-        <w:t xml:space="preserve">どちらも最大3つまで。カレンダーが1つしかない方はこの欄は表示されません（自動でそのカレンダーが使われます）。</w:t>
-      </w:r>
-    </w:p>
-    <w:p>
-      <w:pPr>
-        <w:pStyle w:val="ListParagraph"/>
-        <w:numPr>
-          <w:ilvl w:val="0"/>
-          <w:numId w:val="3"/>
-        </w:numPr>
-        <w:spacing w:after="100" w:line="300"/>
-      </w:pPr>
-      <w:r>
-        <w:rPr>
-          <w:rFonts w:ascii="Yu Gothic" w:cs="Yu Gothic" w:eastAsia="Yu Gothic" w:hAnsi="Yu Gothic"/>
-          <w:b/>
-          <w:bCs/>
-          <w:sz w:val="20"/>
-          <w:szCs w:val="20"/>
-        </w:rPr>
-        <w:t xml:space="preserve">お知らせの時間を決めて完了（STEP 3/3）</w:t>
-      </w:r>
-    </w:p>
-    <w:p>
-      <w:pPr>
-        <w:spacing w:after="140" w:line="300"/>
-        <w:ind w:left="720"/>
-      </w:pPr>
-      <w:r>
-        <w:rPr>
-          <w:rFonts w:ascii="Yu Gothic" w:cs="Yu Gothic" w:eastAsia="Yu Gothic" w:hAnsi="Yu Gothic"/>
-          <w:sz w:val="20"/>
-          <w:szCs w:val="20"/>
-        </w:rPr>
-        <w:t xml:space="preserve">朝のブリーフィングの時刻と、予定の何分前に知らせるかを選び、「利用を開始する」を押せば設定完了です。</w:t>
-      </w:r>
-    </w:p>
-    <w:p>
-      <w:pPr>
-        <w:pStyle w:val="Heading2"/>
-        <w:spacing w:after="140" w:before="300"/>
-      </w:pPr>
-      <w:r>
-        <w:rPr>
-          <w:rFonts w:ascii="Yu Gothic" w:cs="Yu Gothic" w:eastAsia="Yu Gothic" w:hAnsi="Yu Gothic"/>
-          <w:b/>
-          <w:bCs/>
-          <w:color w:val="1E3A5F"/>
-          <w:sz w:val="24"/>
-          <w:szCs w:val="24"/>
-        </w:rPr>
-        <w:t xml:space="preserve">うまくいかないとき</w:t>
-      </w:r>
-    </w:p>
-    <w:p>
-      <w:pPr>
-        <w:pBdr>
-          <w:top w:val="single" w:color="856732" w:sz="4" w:space="8"/>
-          <w:bottom w:val="single" w:color="856732" w:sz="4" w:space="8"/>
-          <w:left w:val="single" w:color="856732" w:sz="18" w:space="10"/>
-          <w:right w:val="single" w:color="856732" w:sz="4" w:space="8"/>
-        </w:pBdr>
-        <w:shd w:fill="FBF7EB" w:val="clear"/>
-        <w:spacing w:after="0" w:before="160" w:line="280"/>
-        <w:ind w:left="200" w:right="200"/>
-      </w:pPr>
-      <w:r>
-        <w:rPr>
-          <w:rFonts w:ascii="Yu Gothic" w:cs="Yu Gothic" w:eastAsia="Yu Gothic" w:hAnsi="Yu Gothic"/>
-          <w:b/>
-          <w:bCs/>
-          <w:color w:val="856732"/>
-          <w:sz w:val="18"/>
-          <w:szCs w:val="18"/>
-        </w:rPr>
-        <w:t xml:space="preserve">エラーと出たら、まずもう一度</w:t>
-      </w:r>
-    </w:p>
-    <w:p>
-      <w:pPr>
-        <w:pBdr>
-          <w:top w:val="single" w:color="856732" w:sz="4" w:space="8"/>
-          <w:bottom w:val="single" w:color="856732" w:sz="4" w:space="8"/>
-          <w:left w:val="single" w:color="856732" w:sz="18" w:space="10"/>
-          <w:right w:val="single" w:color="856732" w:sz="4" w:space="8"/>
-        </w:pBdr>
-        <w:shd w:fill="FBF7EB" w:val="clear"/>
-        <w:spacing w:after="200" w:line="280"/>
-        <w:ind w:left="200" w:right="200"/>
-      </w:pPr>
-      <w:r>
-        <w:rPr>
-          <w:rFonts w:ascii="Yu Gothic" w:cs="Yu Gothic" w:eastAsia="Yu Gothic" w:hAnsi="Yu Gothic"/>
-          <w:sz w:val="20"/>
-          <w:szCs w:val="20"/>
-        </w:rPr>
-        <w:t xml:space="preserve">Googleのログイン途中で「エラーが発生しました」と出ることがあります。多くは一時的なもので、もう一度「連携する」からやり直すと通ります。シークレットウィンドウ／プライベートブラウズでは失敗しやすいので、通常のウィンドウでお試しください。</w:t>
+        <w:t xml:space="preserve">Outlook（Microsoft 365）は現在未対応です。</w:t>
+      </w:r>
+      <w:r>
+        <w:rPr>
+          <w:rFonts w:ascii="Yu Gothic" w:cs="Yu Gothic" w:eastAsia="Yu Gothic" w:hAnsi="Yu Gothic"/>
+          <w:sz w:val="20"/>
+          <w:szCs w:val="20"/>
+        </w:rPr>
+        <w:t xml:space="preserve">設定作業中のため、いましばらくはGoogleカレンダーでご利用ください。</w:t>
       </w:r>
     </w:p>
     <w:p>
@@ -736,19 +419,26 @@
           <w:right w:val="single" w:color="9B3D3D" w:sz="4" w:space="8"/>
         </w:pBdr>
         <w:shd w:fill="FBF1EF" w:val="clear"/>
-        <w:spacing w:after="0" w:before="160" w:line="280"/>
-        <w:ind w:left="200" w:right="200"/>
-      </w:pPr>
-      <w:r>
-        <w:rPr>
-          <w:rFonts w:ascii="Yu Gothic" w:cs="Yu Gothic" w:eastAsia="Yu Gothic" w:hAnsi="Yu Gothic"/>
-          <w:b/>
-          <w:bCs/>
-          <w:color w:val="9B3D3D"/>
-          <w:sz w:val="18"/>
-          <w:szCs w:val="18"/>
-        </w:rPr>
-        <w:t xml:space="preserve">「アクセスをブロックしました」と出る場合</w:t>
+        <w:spacing w:after="60" w:line="280"/>
+        <w:ind w:left="200" w:right="200"/>
+      </w:pPr>
+      <w:r>
+        <w:rPr>
+          <w:rFonts w:ascii="Yu Gothic" w:cs="Yu Gothic" w:eastAsia="Yu Gothic" w:hAnsi="Yu Gothic"/>
+          <w:b/>
+          <w:bCs/>
+          <w:sz w:val="20"/>
+          <w:szCs w:val="20"/>
+        </w:rPr>
+        <w:t xml:space="preserve">オフラインでは使えません。</w:t>
+      </w:r>
+      <w:r>
+        <w:rPr>
+          <w:rFonts w:ascii="Yu Gothic" w:cs="Yu Gothic" w:eastAsia="Yu Gothic" w:hAnsi="Yu Gothic"/>
+          <w:sz w:val="20"/>
+          <w:szCs w:val="20"/>
+        </w:rPr>
+        <w:t xml:space="preserve">通信が必要です。</w:t>
       </w:r>
     </w:p>
     <w:p>
@@ -760,16 +450,191 @@
           <w:right w:val="single" w:color="9B3D3D" w:sz="4" w:space="8"/>
         </w:pBdr>
         <w:shd w:fill="FBF1EF" w:val="clear"/>
+        <w:spacing w:after="60" w:line="280"/>
+        <w:ind w:left="200" w:right="200"/>
+      </w:pPr>
+      <w:r>
+        <w:rPr>
+          <w:rFonts w:ascii="Yu Gothic" w:cs="Yu Gothic" w:eastAsia="Yu Gothic" w:hAnsi="Yu Gothic"/>
+          <w:b/>
+          <w:bCs/>
+          <w:sz w:val="20"/>
+          <w:szCs w:val="20"/>
+        </w:rPr>
+        <w:t xml:space="preserve">音声入力は対応ブラウザのみです。</w:t>
+      </w:r>
+      <w:r>
+        <w:rPr>
+          <w:rFonts w:ascii="Yu Gothic" w:cs="Yu Gothic" w:eastAsia="Yu Gothic" w:hAnsi="Yu Gothic"/>
+          <w:sz w:val="20"/>
+          <w:szCs w:val="20"/>
+        </w:rPr>
+        <w:t xml:space="preserve">iPhoneはSafari、AndroidはChromeでお使いください。それ以外のブラウザでは音声入力が使えないことがあります（テキスト入力は問題なく使えます）。</w:t>
+      </w:r>
+    </w:p>
+    <w:p>
+      <w:pPr>
+        <w:pBdr>
+          <w:top w:val="single" w:color="9B3D3D" w:sz="4" w:space="8"/>
+          <w:bottom w:val="single" w:color="9B3D3D" w:sz="4" w:space="8"/>
+          <w:left w:val="single" w:color="9B3D3D" w:sz="18" w:space="10"/>
+          <w:right w:val="single" w:color="9B3D3D" w:sz="4" w:space="8"/>
+        </w:pBdr>
+        <w:shd w:fill="FBF1EF" w:val="clear"/>
         <w:spacing w:after="200" w:line="280"/>
         <w:ind w:left="200" w:right="200"/>
       </w:pPr>
       <w:r>
         <w:rPr>
           <w:rFonts w:ascii="Yu Gothic" w:cs="Yu Gothic" w:eastAsia="Yu Gothic" w:hAnsi="Yu Gothic"/>
-          <w:sz w:val="20"/>
-          <w:szCs w:val="20"/>
-        </w:rPr>
-        <w:t xml:space="preserve">そのGoogleアドレスがまだ利用登録されていません。使いたいアドレスを管理者に伝えて、登録後にもう一度お試しください。</w:t>
+          <w:b/>
+          <w:bCs/>
+          <w:sz w:val="20"/>
+          <w:szCs w:val="20"/>
+        </w:rPr>
+        <w:t xml:space="preserve">リマインダー・朝のブリーフィングは、設定をしないと届きません。</w:t>
+      </w:r>
+      <w:r>
+        <w:rPr>
+          <w:rFonts w:ascii="Yu Gothic" w:cs="Yu Gothic" w:eastAsia="Yu Gothic" w:hAnsi="Yu Gothic"/>
+          <w:sz w:val="20"/>
+          <w:szCs w:val="20"/>
+        </w:rPr>
+        <w:t xml:space="preserve">既定ではオフです。設定方法は本書内でご案内します。</w:t>
+      </w:r>
+    </w:p>
+    <w:p>
+      <w:pPr>
+        <w:pStyle w:val="Heading2"/>
+        <w:spacing w:after="140" w:before="300"/>
+      </w:pPr>
+      <w:r>
+        <w:rPr>
+          <w:rFonts w:ascii="Yu Gothic" w:cs="Yu Gothic" w:eastAsia="Yu Gothic" w:hAnsi="Yu Gothic"/>
+          <w:b/>
+          <w:bCs/>
+          <w:color w:val="1E3A5F"/>
+          <w:sz w:val="24"/>
+          <w:szCs w:val="24"/>
+        </w:rPr>
+        <w:t xml:space="preserve">テスト運用にあたってのご留意事項</w:t>
+      </w:r>
+    </w:p>
+    <w:p>
+      <w:pPr>
+        <w:pBdr>
+          <w:top w:val="single" w:color="9B3D3D" w:sz="4" w:space="8"/>
+          <w:bottom w:val="single" w:color="9B3D3D" w:sz="4" w:space="8"/>
+          <w:left w:val="single" w:color="9B3D3D" w:sz="18" w:space="10"/>
+          <w:right w:val="single" w:color="9B3D3D" w:sz="4" w:space="8"/>
+        </w:pBdr>
+        <w:shd w:fill="FBF1EF" w:val="clear"/>
+        <w:spacing w:after="0" w:before="160" w:line="280"/>
+        <w:ind w:left="200" w:right="200"/>
+      </w:pPr>
+      <w:r>
+        <w:rPr>
+          <w:rFonts w:ascii="Yu Gothic" w:cs="Yu Gothic" w:eastAsia="Yu Gothic" w:hAnsi="Yu Gothic"/>
+          <w:b/>
+          <w:bCs/>
+          <w:color w:val="9B3D3D"/>
+          <w:sz w:val="18"/>
+          <w:szCs w:val="18"/>
+        </w:rPr>
+        <w:t xml:space="preserve">運用上の注意</w:t>
+      </w:r>
+    </w:p>
+    <w:p>
+      <w:pPr>
+        <w:pBdr>
+          <w:top w:val="single" w:color="9B3D3D" w:sz="4" w:space="8"/>
+          <w:bottom w:val="single" w:color="9B3D3D" w:sz="4" w:space="8"/>
+          <w:left w:val="single" w:color="9B3D3D" w:sz="18" w:space="10"/>
+          <w:right w:val="single" w:color="9B3D3D" w:sz="4" w:space="8"/>
+        </w:pBdr>
+        <w:shd w:fill="FBF1EF" w:val="clear"/>
+        <w:spacing w:after="60" w:line="280"/>
+        <w:ind w:left="200" w:right="200"/>
+      </w:pPr>
+      <w:r>
+        <w:rPr>
+          <w:rFonts w:ascii="Yu Gothic" w:cs="Yu Gothic" w:eastAsia="Yu Gothic" w:hAnsi="Yu Gothic"/>
+          <w:b/>
+          <w:bCs/>
+          <w:sz w:val="20"/>
+          <w:szCs w:val="20"/>
+        </w:rPr>
+        <w:t xml:space="preserve">Googleの審査がまだ完了していません。</w:t>
+      </w:r>
+      <w:r>
+        <w:rPr>
+          <w:rFonts w:ascii="Yu Gothic" w:cs="Yu Gothic" w:eastAsia="Yu Gothic" w:hAnsi="Yu Gothic"/>
+          <w:sz w:val="20"/>
+          <w:szCs w:val="20"/>
+        </w:rPr>
+        <w:t xml:space="preserve">そのため連携時に「このアプリはGoogleで確認されていません」という警告画面が表示されます（後述の手順で通過方法をご案内します）。開発中の社内アプリとして想定どおりの表示で、不具合ではありません。</w:t>
+      </w:r>
+    </w:p>
+    <w:p>
+      <w:pPr>
+        <w:pBdr>
+          <w:top w:val="single" w:color="9B3D3D" w:sz="4" w:space="8"/>
+          <w:bottom w:val="single" w:color="9B3D3D" w:sz="4" w:space="8"/>
+          <w:left w:val="single" w:color="9B3D3D" w:sz="18" w:space="10"/>
+          <w:right w:val="single" w:color="9B3D3D" w:sz="4" w:space="8"/>
+        </w:pBdr>
+        <w:shd w:fill="FBF1EF" w:val="clear"/>
+        <w:spacing w:after="60" w:line="280"/>
+        <w:ind w:left="200" w:right="200"/>
+      </w:pPr>
+      <w:r>
+        <w:rPr>
+          <w:rFonts w:ascii="Yu Gothic" w:cs="Yu Gothic" w:eastAsia="Yu Gothic" w:hAnsi="Yu Gothic"/>
+          <w:b/>
+          <w:bCs/>
+          <w:sz w:val="20"/>
+          <w:szCs w:val="20"/>
+        </w:rPr>
+        <w:t xml:space="preserve">7日間操作がないと、Googleとの連携が自動的に切れることがあります。</w:t>
+      </w:r>
+      <w:r>
+        <w:rPr>
+          <w:rFonts w:ascii="Yu Gothic" w:cs="Yu Gothic" w:eastAsia="Yu Gothic" w:hAnsi="Yu Gothic"/>
+          <w:sz w:val="20"/>
+          <w:szCs w:val="20"/>
+        </w:rPr>
+        <w:t xml:space="preserve">審査完了前の状態に起因する制限です。切れた場合は設定画面から再度「連携する」を押していただくだけで復旧します。なるべく定期的にお使いいただけると発生しにくくなります。</w:t>
+      </w:r>
+    </w:p>
+    <w:p>
+      <w:pPr>
+        <w:pBdr>
+          <w:top w:val="single" w:color="9B3D3D" w:sz="4" w:space="8"/>
+          <w:bottom w:val="single" w:color="9B3D3D" w:sz="4" w:space="8"/>
+          <w:left w:val="single" w:color="9B3D3D" w:sz="18" w:space="10"/>
+          <w:right w:val="single" w:color="9B3D3D" w:sz="4" w:space="8"/>
+        </w:pBdr>
+        <w:shd w:fill="FBF1EF" w:val="clear"/>
+        <w:spacing w:after="200" w:line="280"/>
+        <w:ind w:left="200" w:right="200"/>
+      </w:pPr>
+      <w:r>
+        <w:rPr>
+          <w:rFonts w:ascii="Yu Gothic" w:cs="Yu Gothic" w:eastAsia="Yu Gothic" w:hAnsi="Yu Gothic"/>
+          <w:b/>
+          <w:bCs/>
+          <w:sz w:val="20"/>
+          <w:szCs w:val="20"/>
+        </w:rPr>
+        <w:t xml:space="preserve">開発中のため、不具合や使いにくい点が見つかることがあります。</w:t>
+      </w:r>
+      <w:r>
+        <w:rPr>
+          <w:rFonts w:ascii="Yu Gothic" w:cs="Yu Gothic" w:eastAsia="Yu Gothic" w:hAnsi="Yu Gothic"/>
+          <w:sz w:val="20"/>
+          <w:szCs w:val="20"/>
+        </w:rPr>
+        <w:t xml:space="preserve">お気づきの点は、別途ご案内するフィードバックシートにご記入ください。改善に反映していきます。</w:t>
       </w:r>
     </w:p>
     <w:p>
@@ -789,7 +654,7 @@
           <w:sz w:val="30"/>
           <w:szCs w:val="30"/>
         </w:rPr>
-        <w:t xml:space="preserve">Part 2　スマホのホーム画面からワンタップで開く</w:t>
+        <w:t xml:space="preserve">Part 1　Googleカレンダーをつなぐ</w:t>
       </w:r>
     </w:p>
     <w:p>
@@ -803,24 +668,7 @@
           <w:sz w:val="20"/>
           <w:szCs w:val="20"/>
         </w:rPr>
-        <w:t xml:space="preserve">アプリストアからのインストールは不要です。ホーム画面にアイコンを置けば、普通のアプリと同じように全画面で起動します。毎回URLを入力する必要はありません。</w:t>
-      </w:r>
-    </w:p>
-    <w:p>
-      <w:pPr>
-        <w:pStyle w:val="Heading2"/>
-        <w:spacing w:after="140" w:before="300"/>
-      </w:pPr>
-      <w:r>
-        <w:rPr>
-          <w:rFonts w:ascii="Yu Gothic" w:cs="Yu Gothic" w:eastAsia="Yu Gothic" w:hAnsi="Yu Gothic"/>
-          <w:b/>
-          <w:bCs/>
-          <w:color w:val="1E3A5F"/>
-          <w:sz w:val="24"/>
-          <w:szCs w:val="24"/>
-        </w:rPr>
-        <w:t xml:space="preserve">iPhone・iPad</w:t>
+        <w:t xml:space="preserve">アプリに「あなたのカレンダーを読み書きしてよい」と許可を与える作業です。パスワードをアプリに預けることはありません。</w:t>
       </w:r>
     </w:p>
     <w:p>
@@ -840,15 +688,21 @@
           <w:sz w:val="20"/>
           <w:szCs w:val="20"/>
         </w:rPr>
-        <w:t xml:space="preserve">Safari</w:t>
-      </w:r>
-      <w:r>
-        <w:rPr>
-          <w:rFonts w:ascii="Yu Gothic" w:cs="Yu Gothic" w:eastAsia="Yu Gothic" w:hAnsi="Yu Gothic"/>
-          <w:sz w:val="20"/>
-          <w:szCs w:val="20"/>
-        </w:rPr>
-        <w:t xml:space="preserve">でアプリのURLを開く</w:t>
+        <w:t xml:space="preserve">アプリのURLを開く</w:t>
+      </w:r>
+    </w:p>
+    <w:p>
+      <w:pPr>
+        <w:spacing w:after="140" w:line="300"/>
+        <w:ind w:left="720"/>
+      </w:pPr>
+      <w:r>
+        <w:rPr>
+          <w:rFonts w:ascii="Yu Gothic" w:cs="Yu Gothic" w:eastAsia="Yu Gothic" w:hAnsi="Yu Gothic"/>
+          <w:sz w:val="20"/>
+          <w:szCs w:val="20"/>
+        </w:rPr>
+        <w:t xml:space="preserve">上のURLを開くと、金色の「はじめる」ボタンがある画面が出ます。押して進みます。</w:t>
       </w:r>
     </w:p>
     <w:p>
@@ -863,28 +717,26 @@
       <w:r>
         <w:rPr>
           <w:rFonts w:ascii="Yu Gothic" w:cs="Yu Gothic" w:eastAsia="Yu Gothic" w:hAnsi="Yu Gothic"/>
-          <w:sz w:val="20"/>
-          <w:szCs w:val="20"/>
-        </w:rPr>
-        <w:t xml:space="preserve">画面下中央の</w:t>
-      </w:r>
-      <w:r>
-        <w:rPr>
-          <w:rFonts w:ascii="Yu Gothic" w:cs="Yu Gothic" w:eastAsia="Yu Gothic" w:hAnsi="Yu Gothic"/>
-          <w:b/>
-          <w:bCs/>
-          <w:sz w:val="20"/>
-          <w:szCs w:val="20"/>
-        </w:rPr>
-        <w:t xml:space="preserve">共有ボタン</w:t>
-      </w:r>
-      <w:r>
-        <w:rPr>
-          <w:rFonts w:ascii="Yu Gothic" w:cs="Yu Gothic" w:eastAsia="Yu Gothic" w:hAnsi="Yu Gothic"/>
-          <w:sz w:val="20"/>
-          <w:szCs w:val="20"/>
-        </w:rPr>
-        <w:t xml:space="preserve">（□に↑が刺さったマーク）を押す</w:t>
+          <w:b/>
+          <w:bCs/>
+          <w:sz w:val="20"/>
+          <w:szCs w:val="20"/>
+        </w:rPr>
+        <w:t xml:space="preserve">お立場を選ぶ（STEP 1/3）</w:t>
+      </w:r>
+    </w:p>
+    <w:p>
+      <w:pPr>
+        <w:spacing w:after="140" w:line="300"/>
+        <w:ind w:left="720"/>
+      </w:pPr>
+      <w:r>
+        <w:rPr>
+          <w:rFonts w:ascii="Yu Gothic" w:cs="Yu Gothic" w:eastAsia="Yu Gothic" w:hAnsi="Yu Gothic"/>
+          <w:sz w:val="20"/>
+          <w:szCs w:val="20"/>
+        </w:rPr>
+        <w:t xml:space="preserve">「社長」「役員」「CFO」から選びます。秘書があなたをどう呼ぶかが変わるだけなので、深く悩まず選んで「次へ」を押してください。あとから設定画面で変更できます。</w:t>
       </w:r>
     </w:p>
     <w:p>
@@ -899,10 +751,36 @@
       <w:r>
         <w:rPr>
           <w:rFonts w:ascii="Yu Gothic" w:cs="Yu Gothic" w:eastAsia="Yu Gothic" w:hAnsi="Yu Gothic"/>
-          <w:sz w:val="20"/>
-          <w:szCs w:val="20"/>
-        </w:rPr>
-        <w:t xml:space="preserve">メニューを下にスクロールして「ホーム画面に追加」を押す</w:t>
+          <w:b/>
+          <w:bCs/>
+          <w:sz w:val="20"/>
+          <w:szCs w:val="20"/>
+        </w:rPr>
+        <w:t xml:space="preserve">「カレンダーをご連携」でGoogleの「連携する」を押す（STEP 2/3）</w:t>
+      </w:r>
+    </w:p>
+    <w:p>
+      <w:pPr>
+        <w:spacing w:after="140" w:line="300"/>
+        <w:ind w:left="720"/>
+      </w:pPr>
+      <w:r>
+        <w:rPr>
+          <w:rFonts w:ascii="Yu Gothic" w:cs="Yu Gothic" w:eastAsia="Yu Gothic" w:hAnsi="Yu Gothic"/>
+          <w:sz w:val="20"/>
+          <w:szCs w:val="20"/>
+        </w:rPr>
+        <w:t xml:space="preserve">Googleのログイン画面に切り替わります。</w:t>
+      </w:r>
+      <w:r>
+        <w:rPr>
+          <w:rFonts w:ascii="Yu Gothic" w:cs="Yu Gothic" w:eastAsia="Yu Gothic" w:hAnsi="Yu Gothic"/>
+          <w:b/>
+          <w:bCs/>
+          <w:sz w:val="20"/>
+          <w:szCs w:val="20"/>
+        </w:rPr>
+        <w:t xml:space="preserve">ここで1つ以上つながないと次へ進めません。</w:t>
       </w:r>
     </w:p>
     <w:p>
@@ -917,10 +795,78 @@
       <w:r>
         <w:rPr>
           <w:rFonts w:ascii="Yu Gothic" w:cs="Yu Gothic" w:eastAsia="Yu Gothic" w:hAnsi="Yu Gothic"/>
-          <w:sz w:val="20"/>
-          <w:szCs w:val="20"/>
-        </w:rPr>
-        <w:t xml:space="preserve">名前を確認して右上の「追加」を押す</w:t>
+          <w:b/>
+          <w:bCs/>
+          <w:sz w:val="20"/>
+          <w:szCs w:val="20"/>
+        </w:rPr>
+        <w:t xml:space="preserve">使いたいGoogleアカウントを選ぶ</w:t>
+      </w:r>
+    </w:p>
+    <w:p>
+      <w:pPr>
+        <w:spacing w:after="140" w:line="300"/>
+        <w:ind w:left="720"/>
+      </w:pPr>
+      <w:r>
+        <w:rPr>
+          <w:rFonts w:ascii="Yu Gothic" w:cs="Yu Gothic" w:eastAsia="Yu Gothic" w:hAnsi="Yu Gothic"/>
+          <w:sz w:val="20"/>
+          <w:szCs w:val="20"/>
+        </w:rPr>
+        <w:t xml:space="preserve">複数のアカウントでログインしている場合は、</w:t>
+      </w:r>
+      <w:r>
+        <w:rPr>
+          <w:rFonts w:ascii="Yu Gothic" w:cs="Yu Gothic" w:eastAsia="Yu Gothic" w:hAnsi="Yu Gothic"/>
+          <w:b/>
+          <w:bCs/>
+          <w:sz w:val="20"/>
+          <w:szCs w:val="20"/>
+        </w:rPr>
+        <w:t xml:space="preserve">管理者に伝えたアドレス</w:t>
+      </w:r>
+      <w:r>
+        <w:rPr>
+          <w:rFonts w:ascii="Yu Gothic" w:cs="Yu Gothic" w:eastAsia="Yu Gothic" w:hAnsi="Yu Gothic"/>
+          <w:sz w:val="20"/>
+          <w:szCs w:val="20"/>
+        </w:rPr>
+        <w:t xml:space="preserve">を選んでください。別のアドレスを選ぶとブロックされます。</w:t>
+      </w:r>
+    </w:p>
+    <w:p>
+      <w:pPr>
+        <w:pStyle w:val="ListParagraph"/>
+        <w:numPr>
+          <w:ilvl w:val="0"/>
+          <w:numId w:val="4"/>
+        </w:numPr>
+        <w:spacing w:after="100" w:line="300"/>
+      </w:pPr>
+      <w:r>
+        <w:rPr>
+          <w:rFonts w:ascii="Yu Gothic" w:cs="Yu Gothic" w:eastAsia="Yu Gothic" w:hAnsi="Yu Gothic"/>
+          <w:b/>
+          <w:bCs/>
+          <w:sz w:val="20"/>
+          <w:szCs w:val="20"/>
+        </w:rPr>
+        <w:t xml:space="preserve">「このアプリはGoogleで確認されていません」を通過する</w:t>
+      </w:r>
+    </w:p>
+    <w:p>
+      <w:pPr>
+        <w:spacing w:after="140" w:line="300"/>
+        <w:ind w:left="720"/>
+      </w:pPr>
+      <w:r>
+        <w:rPr>
+          <w:rFonts w:ascii="Yu Gothic" w:cs="Yu Gothic" w:eastAsia="Yu Gothic" w:hAnsi="Yu Gothic"/>
+          <w:sz w:val="20"/>
+          <w:szCs w:val="20"/>
+        </w:rPr>
+        <w:t xml:space="preserve">審査前の社内テストアプリのため、警告画面が出ます。画面左下の「詳細」を押し、下に出てくる「（安全ではないページ）に移動」を押してください。</w:t>
       </w:r>
     </w:p>
     <w:p>
@@ -944,7 +890,7 @@
           <w:sz w:val="18"/>
           <w:szCs w:val="18"/>
         </w:rPr>
-        <w:t xml:space="preserve">注意</w:t>
+        <w:t xml:space="preserve">この警告について</w:t>
       </w:r>
     </w:p>
     <w:p>
@@ -965,7 +911,216 @@
           <w:sz w:val="20"/>
           <w:szCs w:val="20"/>
         </w:rPr>
-        <w:t xml:space="preserve">Chromeなど他のブラウザからだとこの項目が出ないことがあります。必ずSafariで開いてください。</w:t>
+        <w:t xml:space="preserve">これはGoogleの審査をまだ受けていない開発中アプリすべてに出る表示で、不具合ではありません。今回は自分たちで作ったアプリだと分かっているため進んで問題ありません。一般公開時には審査を通すのでこの画面は出なくなります。</w:t>
+      </w:r>
+    </w:p>
+    <w:p>
+      <w:pPr>
+        <w:pStyle w:val="ListParagraph"/>
+        <w:numPr>
+          <w:ilvl w:val="0"/>
+          <w:numId w:val="4"/>
+        </w:numPr>
+        <w:spacing w:after="100" w:line="300"/>
+      </w:pPr>
+      <w:r>
+        <w:rPr>
+          <w:rFonts w:ascii="Yu Gothic" w:cs="Yu Gothic" w:eastAsia="Yu Gothic" w:hAnsi="Yu Gothic"/>
+          <w:b/>
+          <w:bCs/>
+          <w:sz w:val="20"/>
+          <w:szCs w:val="20"/>
+        </w:rPr>
+        <w:t xml:space="preserve">カレンダーへのアクセスを許可する</w:t>
+      </w:r>
+    </w:p>
+    <w:p>
+      <w:pPr>
+        <w:spacing w:after="140" w:line="300"/>
+        <w:ind w:left="720"/>
+      </w:pPr>
+      <w:r>
+        <w:rPr>
+          <w:rFonts w:ascii="Yu Gothic" w:cs="Yu Gothic" w:eastAsia="Yu Gothic" w:hAnsi="Yu Gothic"/>
+          <w:sz w:val="20"/>
+          <w:szCs w:val="20"/>
+        </w:rPr>
+        <w:t xml:space="preserve">「予定の表示・編集」の許可を求められます。チェックを入れて「続行」を押すと、アプリに戻ります。</w:t>
+      </w:r>
+    </w:p>
+    <w:p>
+      <w:pPr>
+        <w:pStyle w:val="ListParagraph"/>
+        <w:numPr>
+          <w:ilvl w:val="0"/>
+          <w:numId w:val="4"/>
+        </w:numPr>
+        <w:spacing w:after="100" w:line="300"/>
+      </w:pPr>
+      <w:r>
+        <w:rPr>
+          <w:rFonts w:ascii="Yu Gothic" w:cs="Yu Gothic" w:eastAsia="Yu Gothic" w:hAnsi="Yu Gothic"/>
+          <w:b/>
+          <w:bCs/>
+          <w:sz w:val="20"/>
+          <w:szCs w:val="20"/>
+        </w:rPr>
+        <w:t xml:space="preserve">「参照」と「登録先」のカレンダーを選ぶ</w:t>
+      </w:r>
+    </w:p>
+    <w:p>
+      <w:pPr>
+        <w:spacing w:after="140" w:line="300"/>
+        <w:ind w:left="720"/>
+      </w:pPr>
+      <w:r>
+        <w:rPr>
+          <w:rFonts w:ascii="Yu Gothic" w:cs="Yu Gothic" w:eastAsia="Yu Gothic" w:hAnsi="Yu Gothic"/>
+          <w:sz w:val="20"/>
+          <w:szCs w:val="20"/>
+        </w:rPr>
+        <w:t xml:space="preserve">アプリに戻ると、カレンダー連携の画面に戻ってきます。カレンダーを複数お持ちの方は、ここで選択欄が出ます。</w:t>
+      </w:r>
+    </w:p>
+    <w:p>
+      <w:pPr>
+        <w:pBdr>
+          <w:top w:val="single" w:color="856732" w:sz="4" w:space="8"/>
+          <w:bottom w:val="single" w:color="856732" w:sz="4" w:space="8"/>
+          <w:left w:val="single" w:color="856732" w:sz="18" w:space="10"/>
+          <w:right w:val="single" w:color="856732" w:sz="4" w:space="8"/>
+        </w:pBdr>
+        <w:shd w:fill="FBF7EB" w:val="clear"/>
+        <w:spacing w:after="0" w:before="160" w:line="280"/>
+        <w:ind w:left="200" w:right="200"/>
+      </w:pPr>
+      <w:r>
+        <w:rPr>
+          <w:rFonts w:ascii="Yu Gothic" w:cs="Yu Gothic" w:eastAsia="Yu Gothic" w:hAnsi="Yu Gothic"/>
+          <w:b/>
+          <w:bCs/>
+          <w:color w:val="856732"/>
+          <w:sz w:val="18"/>
+          <w:szCs w:val="18"/>
+        </w:rPr>
+        <w:t xml:space="preserve">2つの設定の違い</w:t>
+      </w:r>
+    </w:p>
+    <w:p>
+      <w:pPr>
+        <w:pBdr>
+          <w:top w:val="single" w:color="856732" w:sz="4" w:space="8"/>
+          <w:bottom w:val="single" w:color="856732" w:sz="4" w:space="8"/>
+          <w:left w:val="single" w:color="856732" w:sz="18" w:space="10"/>
+          <w:right w:val="single" w:color="856732" w:sz="4" w:space="8"/>
+        </w:pBdr>
+        <w:shd w:fill="FBF7EB" w:val="clear"/>
+        <w:spacing w:after="60" w:line="280"/>
+        <w:ind w:left="200" w:right="200"/>
+      </w:pPr>
+      <w:r>
+        <w:rPr>
+          <w:rFonts w:ascii="Yu Gothic" w:cs="Yu Gothic" w:eastAsia="Yu Gothic" w:hAnsi="Yu Gothic"/>
+          <w:b/>
+          <w:bCs/>
+          <w:sz w:val="20"/>
+          <w:szCs w:val="20"/>
+        </w:rPr>
+        <w:t xml:space="preserve">参照</w:t>
+      </w:r>
+      <w:r>
+        <w:rPr>
+          <w:rFonts w:ascii="Yu Gothic" w:cs="Yu Gothic" w:eastAsia="Yu Gothic" w:hAnsi="Yu Gothic"/>
+          <w:sz w:val="20"/>
+          <w:szCs w:val="20"/>
+        </w:rPr>
+        <w:t xml:space="preserve">＝空き時間を探すときに「予定が入っている」とみなすカレンダー。仕事用と個人用の両方を選んでおくと、プライベートの予定に会議を入れられずに済みます。</w:t>
+      </w:r>
+    </w:p>
+    <w:p>
+      <w:pPr>
+        <w:pBdr>
+          <w:top w:val="single" w:color="856732" w:sz="4" w:space="8"/>
+          <w:bottom w:val="single" w:color="856732" w:sz="4" w:space="8"/>
+          <w:left w:val="single" w:color="856732" w:sz="18" w:space="10"/>
+          <w:right w:val="single" w:color="856732" w:sz="4" w:space="8"/>
+        </w:pBdr>
+        <w:shd w:fill="FBF7EB" w:val="clear"/>
+        <w:spacing w:after="60" w:line="280"/>
+        <w:ind w:left="200" w:right="200"/>
+      </w:pPr>
+      <w:r>
+        <w:rPr>
+          <w:rFonts w:ascii="Yu Gothic" w:cs="Yu Gothic" w:eastAsia="Yu Gothic" w:hAnsi="Yu Gothic"/>
+          <w:b/>
+          <w:bCs/>
+          <w:sz w:val="20"/>
+          <w:szCs w:val="20"/>
+        </w:rPr>
+        <w:t xml:space="preserve">登録先</w:t>
+      </w:r>
+      <w:r>
+        <w:rPr>
+          <w:rFonts w:ascii="Yu Gothic" w:cs="Yu Gothic" w:eastAsia="Yu Gothic" w:hAnsi="Yu Gothic"/>
+          <w:sz w:val="20"/>
+          <w:szCs w:val="20"/>
+        </w:rPr>
+        <w:t xml:space="preserve">＝新しい予定を書き込むカレンダー。複数選ぶと、その全部に同時に登録されます。</w:t>
+      </w:r>
+    </w:p>
+    <w:p>
+      <w:pPr>
+        <w:pBdr>
+          <w:top w:val="single" w:color="856732" w:sz="4" w:space="8"/>
+          <w:bottom w:val="single" w:color="856732" w:sz="4" w:space="8"/>
+          <w:left w:val="single" w:color="856732" w:sz="18" w:space="10"/>
+          <w:right w:val="single" w:color="856732" w:sz="4" w:space="8"/>
+        </w:pBdr>
+        <w:shd w:fill="FBF7EB" w:val="clear"/>
+        <w:spacing w:after="200" w:line="280"/>
+        <w:ind w:left="200" w:right="200"/>
+      </w:pPr>
+      <w:r>
+        <w:rPr>
+          <w:rFonts w:ascii="Yu Gothic" w:cs="Yu Gothic" w:eastAsia="Yu Gothic" w:hAnsi="Yu Gothic"/>
+          <w:sz w:val="20"/>
+          <w:szCs w:val="20"/>
+        </w:rPr>
+        <w:t xml:space="preserve">どちらも最大3つまで。カレンダーが1つしかない方はこの欄は表示されません（自動でそのカレンダーが使われます）。</w:t>
+      </w:r>
+    </w:p>
+    <w:p>
+      <w:pPr>
+        <w:pStyle w:val="ListParagraph"/>
+        <w:numPr>
+          <w:ilvl w:val="0"/>
+          <w:numId w:val="4"/>
+        </w:numPr>
+        <w:spacing w:after="100" w:line="300"/>
+      </w:pPr>
+      <w:r>
+        <w:rPr>
+          <w:rFonts w:ascii="Yu Gothic" w:cs="Yu Gothic" w:eastAsia="Yu Gothic" w:hAnsi="Yu Gothic"/>
+          <w:b/>
+          <w:bCs/>
+          <w:sz w:val="20"/>
+          <w:szCs w:val="20"/>
+        </w:rPr>
+        <w:t xml:space="preserve">お知らせの時間を決めて完了（STEP 3/3）</w:t>
+      </w:r>
+    </w:p>
+    <w:p>
+      <w:pPr>
+        <w:spacing w:after="140" w:line="300"/>
+        <w:ind w:left="720"/>
+      </w:pPr>
+      <w:r>
+        <w:rPr>
+          <w:rFonts w:ascii="Yu Gothic" w:cs="Yu Gothic" w:eastAsia="Yu Gothic" w:hAnsi="Yu Gothic"/>
+          <w:sz w:val="20"/>
+          <w:szCs w:val="20"/>
+        </w:rPr>
+        <w:t xml:space="preserve">朝のブリーフィングの時刻と、予定の何分前に知らせるかを選び、「利用を開始する」を押せば設定完了です。</w:t>
       </w:r>
     </w:p>
     <w:p>
@@ -982,7 +1137,148 @@
           <w:sz w:val="24"/>
           <w:szCs w:val="24"/>
         </w:rPr>
-        <w:t xml:space="preserve">Android</w:t>
+        <w:t xml:space="preserve">うまくいかないとき</w:t>
+      </w:r>
+    </w:p>
+    <w:p>
+      <w:pPr>
+        <w:pBdr>
+          <w:top w:val="single" w:color="856732" w:sz="4" w:space="8"/>
+          <w:bottom w:val="single" w:color="856732" w:sz="4" w:space="8"/>
+          <w:left w:val="single" w:color="856732" w:sz="18" w:space="10"/>
+          <w:right w:val="single" w:color="856732" w:sz="4" w:space="8"/>
+        </w:pBdr>
+        <w:shd w:fill="FBF7EB" w:val="clear"/>
+        <w:spacing w:after="0" w:before="160" w:line="280"/>
+        <w:ind w:left="200" w:right="200"/>
+      </w:pPr>
+      <w:r>
+        <w:rPr>
+          <w:rFonts w:ascii="Yu Gothic" w:cs="Yu Gothic" w:eastAsia="Yu Gothic" w:hAnsi="Yu Gothic"/>
+          <w:b/>
+          <w:bCs/>
+          <w:color w:val="856732"/>
+          <w:sz w:val="18"/>
+          <w:szCs w:val="18"/>
+        </w:rPr>
+        <w:t xml:space="preserve">エラーと出たら、まずもう一度</w:t>
+      </w:r>
+    </w:p>
+    <w:p>
+      <w:pPr>
+        <w:pBdr>
+          <w:top w:val="single" w:color="856732" w:sz="4" w:space="8"/>
+          <w:bottom w:val="single" w:color="856732" w:sz="4" w:space="8"/>
+          <w:left w:val="single" w:color="856732" w:sz="18" w:space="10"/>
+          <w:right w:val="single" w:color="856732" w:sz="4" w:space="8"/>
+        </w:pBdr>
+        <w:shd w:fill="FBF7EB" w:val="clear"/>
+        <w:spacing w:after="200" w:line="280"/>
+        <w:ind w:left="200" w:right="200"/>
+      </w:pPr>
+      <w:r>
+        <w:rPr>
+          <w:rFonts w:ascii="Yu Gothic" w:cs="Yu Gothic" w:eastAsia="Yu Gothic" w:hAnsi="Yu Gothic"/>
+          <w:sz w:val="20"/>
+          <w:szCs w:val="20"/>
+        </w:rPr>
+        <w:t xml:space="preserve">Googleのログイン途中で「エラーが発生しました」と出ることがあります。多くは一時的なもので、もう一度「連携する」からやり直すと通ります。シークレットウィンドウ／プライベートブラウズでは失敗しやすいので、通常のウィンドウでお試しください。</w:t>
+      </w:r>
+    </w:p>
+    <w:p>
+      <w:pPr>
+        <w:pBdr>
+          <w:top w:val="single" w:color="9B3D3D" w:sz="4" w:space="8"/>
+          <w:bottom w:val="single" w:color="9B3D3D" w:sz="4" w:space="8"/>
+          <w:left w:val="single" w:color="9B3D3D" w:sz="18" w:space="10"/>
+          <w:right w:val="single" w:color="9B3D3D" w:sz="4" w:space="8"/>
+        </w:pBdr>
+        <w:shd w:fill="FBF1EF" w:val="clear"/>
+        <w:spacing w:after="0" w:before="160" w:line="280"/>
+        <w:ind w:left="200" w:right="200"/>
+      </w:pPr>
+      <w:r>
+        <w:rPr>
+          <w:rFonts w:ascii="Yu Gothic" w:cs="Yu Gothic" w:eastAsia="Yu Gothic" w:hAnsi="Yu Gothic"/>
+          <w:b/>
+          <w:bCs/>
+          <w:color w:val="9B3D3D"/>
+          <w:sz w:val="18"/>
+          <w:szCs w:val="18"/>
+        </w:rPr>
+        <w:t xml:space="preserve">「アクセスをブロックしました」と出る場合</w:t>
+      </w:r>
+    </w:p>
+    <w:p>
+      <w:pPr>
+        <w:pBdr>
+          <w:top w:val="single" w:color="9B3D3D" w:sz="4" w:space="8"/>
+          <w:bottom w:val="single" w:color="9B3D3D" w:sz="4" w:space="8"/>
+          <w:left w:val="single" w:color="9B3D3D" w:sz="18" w:space="10"/>
+          <w:right w:val="single" w:color="9B3D3D" w:sz="4" w:space="8"/>
+        </w:pBdr>
+        <w:shd w:fill="FBF1EF" w:val="clear"/>
+        <w:spacing w:after="200" w:line="280"/>
+        <w:ind w:left="200" w:right="200"/>
+      </w:pPr>
+      <w:r>
+        <w:rPr>
+          <w:rFonts w:ascii="Yu Gothic" w:cs="Yu Gothic" w:eastAsia="Yu Gothic" w:hAnsi="Yu Gothic"/>
+          <w:sz w:val="20"/>
+          <w:szCs w:val="20"/>
+        </w:rPr>
+        <w:t xml:space="preserve">そのGoogleアドレスがまだ利用登録されていません。使いたいアドレスを管理者に伝えて、登録後にもう一度お試しください。</w:t>
+      </w:r>
+    </w:p>
+    <w:p>
+      <w:pPr>
+        <w:pStyle w:val="Heading1"/>
+        <w:pBdr>
+          <w:bottom w:val="single" w:color="856732" w:sz="8" w:space="6"/>
+        </w:pBdr>
+        <w:spacing w:after="200" w:before="400"/>
+      </w:pPr>
+      <w:r>
+        <w:rPr>
+          <w:rFonts w:ascii="Yu Gothic" w:cs="Yu Gothic" w:eastAsia="Yu Gothic" w:hAnsi="Yu Gothic"/>
+          <w:b/>
+          <w:bCs/>
+          <w:color w:val="0A1A30"/>
+          <w:sz w:val="30"/>
+          <w:szCs w:val="30"/>
+        </w:rPr>
+        <w:t xml:space="preserve">Part 2　スマホのホーム画面からワンタップで開く</w:t>
+      </w:r>
+    </w:p>
+    <w:p>
+      <w:pPr>
+        <w:spacing w:after="120" w:line="300"/>
+      </w:pPr>
+      <w:r>
+        <w:rPr>
+          <w:rFonts w:ascii="Yu Gothic" w:cs="Yu Gothic" w:eastAsia="Yu Gothic" w:hAnsi="Yu Gothic"/>
+          <w:color w:val="5C739A"/>
+          <w:sz w:val="20"/>
+          <w:szCs w:val="20"/>
+        </w:rPr>
+        <w:t xml:space="preserve">アプリストアからのインストールは不要です。ホーム画面にアイコンを置けば、普通のアプリと同じように全画面で起動します。毎回URLを入力する必要はありません。</w:t>
+      </w:r>
+    </w:p>
+    <w:p>
+      <w:pPr>
+        <w:pStyle w:val="Heading2"/>
+        <w:spacing w:after="140" w:before="300"/>
+      </w:pPr>
+      <w:r>
+        <w:rPr>
+          <w:rFonts w:ascii="Yu Gothic" w:cs="Yu Gothic" w:eastAsia="Yu Gothic" w:hAnsi="Yu Gothic"/>
+          <w:b/>
+          <w:bCs/>
+          <w:color w:val="1E3A5F"/>
+          <w:sz w:val="24"/>
+          <w:szCs w:val="24"/>
+        </w:rPr>
+        <w:t xml:space="preserve">iPhone・iPad</w:t>
       </w:r>
     </w:p>
     <w:p>
@@ -1002,7 +1298,7 @@
           <w:sz w:val="20"/>
           <w:szCs w:val="20"/>
         </w:rPr>
-        <w:t xml:space="preserve">Chrome</w:t>
+        <w:t xml:space="preserve">Safari</w:t>
       </w:r>
       <w:r>
         <w:rPr>
@@ -1028,25 +1324,25 @@
           <w:sz w:val="20"/>
           <w:szCs w:val="20"/>
         </w:rPr>
-        <w:t xml:space="preserve">右上の</w:t>
-      </w:r>
-      <w:r>
-        <w:rPr>
-          <w:rFonts w:ascii="Yu Gothic" w:cs="Yu Gothic" w:eastAsia="Yu Gothic" w:hAnsi="Yu Gothic"/>
-          <w:b/>
-          <w:bCs/>
-          <w:sz w:val="20"/>
-          <w:szCs w:val="20"/>
-        </w:rPr>
-        <w:t xml:space="preserve">︙</w:t>
-      </w:r>
-      <w:r>
-        <w:rPr>
-          <w:rFonts w:ascii="Yu Gothic" w:cs="Yu Gothic" w:eastAsia="Yu Gothic" w:hAnsi="Yu Gothic"/>
-          <w:sz w:val="20"/>
-          <w:szCs w:val="20"/>
-        </w:rPr>
-        <w:t xml:space="preserve">（三点メニュー）を押す</w:t>
+        <w:t xml:space="preserve">画面下中央の</w:t>
+      </w:r>
+      <w:r>
+        <w:rPr>
+          <w:rFonts w:ascii="Yu Gothic" w:cs="Yu Gothic" w:eastAsia="Yu Gothic" w:hAnsi="Yu Gothic"/>
+          <w:b/>
+          <w:bCs/>
+          <w:sz w:val="20"/>
+          <w:szCs w:val="20"/>
+        </w:rPr>
+        <w:t xml:space="preserve">共有ボタン</w:t>
+      </w:r>
+      <w:r>
+        <w:rPr>
+          <w:rFonts w:ascii="Yu Gothic" w:cs="Yu Gothic" w:eastAsia="Yu Gothic" w:hAnsi="Yu Gothic"/>
+          <w:sz w:val="20"/>
+          <w:szCs w:val="20"/>
+        </w:rPr>
+        <w:t xml:space="preserve">（□に↑が刺さったマーク）を押す</w:t>
       </w:r>
     </w:p>
     <w:p>
@@ -1064,7 +1360,7 @@
           <w:sz w:val="20"/>
           <w:szCs w:val="20"/>
         </w:rPr>
-        <w:t xml:space="preserve">「ホーム画面に追加」または「アプリをインストール」を押す</w:t>
+        <w:t xml:space="preserve">メニューを下にスクロールして「ホーム画面に追加」を押す</w:t>
       </w:r>
     </w:p>
     <w:p>
@@ -1082,32 +1378,18 @@
           <w:sz w:val="20"/>
           <w:szCs w:val="20"/>
         </w:rPr>
-        <w:t xml:space="preserve">確認画面で「追加」／「インストール」を押す</w:t>
-      </w:r>
-    </w:p>
-    <w:p>
-      <w:pPr>
-        <w:spacing w:after="120" w:line="300"/>
-      </w:pPr>
-      <w:r>
-        <w:rPr>
-          <w:rFonts w:ascii="Yu Gothic" w:cs="Yu Gothic" w:eastAsia="Yu Gothic" w:hAnsi="Yu Gothic"/>
-          <w:color w:val="5C739A"/>
-          <w:sz w:val="20"/>
-          <w:szCs w:val="20"/>
-        </w:rPr>
-        <w:t xml:space="preserve">機種によっては画面下部に「アプリをインストール」の案内が自動で出ます。そちらを押しても同じです。</w:t>
-      </w:r>
-    </w:p>
-    <w:p>
-      <w:pPr>
-        <w:pBdr>
-          <w:top w:val="single" w:color="856732" w:sz="4" w:space="8"/>
-          <w:bottom w:val="single" w:color="856732" w:sz="4" w:space="8"/>
-          <w:left w:val="single" w:color="856732" w:sz="18" w:space="10"/>
-          <w:right w:val="single" w:color="856732" w:sz="4" w:space="8"/>
-        </w:pBdr>
-        <w:shd w:fill="FBF7EB" w:val="clear"/>
+        <w:t xml:space="preserve">名前を確認して右上の「追加」を押す</w:t>
+      </w:r>
+    </w:p>
+    <w:p>
+      <w:pPr>
+        <w:pBdr>
+          <w:top w:val="single" w:color="9B3D3D" w:sz="4" w:space="8"/>
+          <w:bottom w:val="single" w:color="9B3D3D" w:sz="4" w:space="8"/>
+          <w:left w:val="single" w:color="9B3D3D" w:sz="18" w:space="10"/>
+          <w:right w:val="single" w:color="9B3D3D" w:sz="4" w:space="8"/>
+        </w:pBdr>
+        <w:shd w:fill="FBF1EF" w:val="clear"/>
         <w:spacing w:after="0" w:before="160" w:line="280"/>
         <w:ind w:left="200" w:right="200"/>
       </w:pPr>
@@ -1116,22 +1398,22 @@
           <w:rFonts w:ascii="Yu Gothic" w:cs="Yu Gothic" w:eastAsia="Yu Gothic" w:hAnsi="Yu Gothic"/>
           <w:b/>
           <w:bCs/>
-          <w:color w:val="856732"/>
+          <w:color w:val="9B3D3D"/>
           <w:sz w:val="18"/>
           <w:szCs w:val="18"/>
         </w:rPr>
-        <w:t xml:space="preserve">追加したあと</w:t>
-      </w:r>
-    </w:p>
-    <w:p>
-      <w:pPr>
-        <w:pBdr>
-          <w:top w:val="single" w:color="856732" w:sz="4" w:space="8"/>
-          <w:bottom w:val="single" w:color="856732" w:sz="4" w:space="8"/>
-          <w:left w:val="single" w:color="856732" w:sz="18" w:space="10"/>
-          <w:right w:val="single" w:color="856732" w:sz="4" w:space="8"/>
-        </w:pBdr>
-        <w:shd w:fill="FBF7EB" w:val="clear"/>
+        <w:t xml:space="preserve">注意</w:t>
+      </w:r>
+    </w:p>
+    <w:p>
+      <w:pPr>
+        <w:pBdr>
+          <w:top w:val="single" w:color="9B3D3D" w:sz="4" w:space="8"/>
+          <w:bottom w:val="single" w:color="9B3D3D" w:sz="4" w:space="8"/>
+          <w:left w:val="single" w:color="9B3D3D" w:sz="18" w:space="10"/>
+          <w:right w:val="single" w:color="9B3D3D" w:sz="4" w:space="8"/>
+        </w:pBdr>
+        <w:shd w:fill="FBF1EF" w:val="clear"/>
         <w:spacing w:after="200" w:line="280"/>
         <w:ind w:left="200" w:right="200"/>
       </w:pPr>
@@ -1141,7 +1423,7 @@
           <w:sz w:val="20"/>
           <w:szCs w:val="20"/>
         </w:rPr>
-        <w:t xml:space="preserve">ホーム画面のアイコンから開くと、ブラウザのアドレスバーが消えて全画面になります。ログイン状態も保持されるので、次からはタップするだけで秘書が立ち上がります。</w:t>
+        <w:t xml:space="preserve">Chromeなど他のブラウザからだとこの項目が出ないことがあります。必ずSafariで開いてください。</w:t>
       </w:r>
     </w:p>
     <w:p>
@@ -1158,38 +1440,7 @@
           <w:sz w:val="24"/>
           <w:szCs w:val="24"/>
         </w:rPr>
-        <w:t xml:space="preserve">お知らせを受け取る設定（この設定だけは必須です）</w:t>
-      </w:r>
-    </w:p>
-    <w:p>
-      <w:pPr>
-        <w:spacing w:after="120" w:line="300"/>
-      </w:pPr>
-      <w:r>
-        <w:rPr>
-          <w:rFonts w:ascii="Yu Gothic" w:cs="Yu Gothic" w:eastAsia="Yu Gothic" w:hAnsi="Yu Gothic"/>
-          <w:sz w:val="20"/>
-          <w:szCs w:val="20"/>
-        </w:rPr>
-        <w:t xml:space="preserve">アプリを閉じていてもご予定の前にお知らせが届くようにします。</w:t>
-      </w:r>
-      <w:r>
-        <w:rPr>
-          <w:rFonts w:ascii="Yu Gothic" w:cs="Yu Gothic" w:eastAsia="Yu Gothic" w:hAnsi="Yu Gothic"/>
-          <w:b/>
-          <w:bCs/>
-          <w:sz w:val="20"/>
-          <w:szCs w:val="20"/>
-        </w:rPr>
-        <w:t xml:space="preserve">この設定をしないと通知は鳴りません。</w:t>
-      </w:r>
-      <w:r>
-        <w:rPr>
-          <w:rFonts w:ascii="Yu Gothic" w:cs="Yu Gothic" w:eastAsia="Yu Gothic" w:hAnsi="Yu Gothic"/>
-          <w:sz w:val="20"/>
-          <w:szCs w:val="20"/>
-        </w:rPr>
-        <w:t xml:space="preserve">ホーム画面への追加を済ませてから行ってください。</w:t>
+        <w:t xml:space="preserve">Android</w:t>
       </w:r>
     </w:p>
     <w:p>
@@ -1209,39 +1460,15 @@
           <w:sz w:val="20"/>
           <w:szCs w:val="20"/>
         </w:rPr>
-        <w:t xml:space="preserve">ホーム画面のアイコンからアプリを開く</w:t>
-      </w:r>
-    </w:p>
-    <w:p>
-      <w:pPr>
-        <w:spacing w:after="140" w:line="300"/>
-        <w:ind w:left="720"/>
-      </w:pPr>
-      <w:r>
-        <w:rPr>
-          <w:rFonts w:ascii="Yu Gothic" w:cs="Yu Gothic" w:eastAsia="Yu Gothic" w:hAnsi="Yu Gothic"/>
-          <w:sz w:val="20"/>
-          <w:szCs w:val="20"/>
-        </w:rPr>
-        <w:t xml:space="preserve">Safariのタブから開いた状態では設定できません。</w:t>
-      </w:r>
-      <w:r>
-        <w:rPr>
-          <w:rFonts w:ascii="Yu Gothic" w:cs="Yu Gothic" w:eastAsia="Yu Gothic" w:hAnsi="Yu Gothic"/>
-          <w:b/>
-          <w:bCs/>
-          <w:sz w:val="20"/>
-          <w:szCs w:val="20"/>
-        </w:rPr>
-        <w:t xml:space="preserve">必ずホーム画面のアイコンから</w:t>
-      </w:r>
-      <w:r>
-        <w:rPr>
-          <w:rFonts w:ascii="Yu Gothic" w:cs="Yu Gothic" w:eastAsia="Yu Gothic" w:hAnsi="Yu Gothic"/>
-          <w:sz w:val="20"/>
-          <w:szCs w:val="20"/>
-        </w:rPr>
-        <w:t xml:space="preserve">起動してください（iPhoneの仕様です）。</w:t>
+        <w:t xml:space="preserve">Chrome</w:t>
+      </w:r>
+      <w:r>
+        <w:rPr>
+          <w:rFonts w:ascii="Yu Gothic" w:cs="Yu Gothic" w:eastAsia="Yu Gothic" w:hAnsi="Yu Gothic"/>
+          <w:sz w:val="20"/>
+          <w:szCs w:val="20"/>
+        </w:rPr>
+        <w:t xml:space="preserve">でアプリのURLを開く</w:t>
       </w:r>
     </w:p>
     <w:p>
@@ -1256,26 +1483,28 @@
       <w:r>
         <w:rPr>
           <w:rFonts w:ascii="Yu Gothic" w:cs="Yu Gothic" w:eastAsia="Yu Gothic" w:hAnsi="Yu Gothic"/>
-          <w:b/>
-          <w:bCs/>
-          <w:sz w:val="20"/>
-          <w:szCs w:val="20"/>
-        </w:rPr>
-        <w:t xml:space="preserve">「PROFILE」（設定）→「リマインダー」を開く</w:t>
-      </w:r>
-    </w:p>
-    <w:p>
-      <w:pPr>
-        <w:spacing w:after="140" w:line="300"/>
-        <w:ind w:left="720"/>
-      </w:pPr>
-      <w:r>
-        <w:rPr>
-          <w:rFonts w:ascii="Yu Gothic" w:cs="Yu Gothic" w:eastAsia="Yu Gothic" w:hAnsi="Yu Gothic"/>
-          <w:sz w:val="20"/>
-          <w:szCs w:val="20"/>
-        </w:rPr>
-        <w:t xml:space="preserve">いちばん下に「端末へのお知らせ」という項目があります。</w:t>
+          <w:sz w:val="20"/>
+          <w:szCs w:val="20"/>
+        </w:rPr>
+        <w:t xml:space="preserve">右上の</w:t>
+      </w:r>
+      <w:r>
+        <w:rPr>
+          <w:rFonts w:ascii="Yu Gothic" w:cs="Yu Gothic" w:eastAsia="Yu Gothic" w:hAnsi="Yu Gothic"/>
+          <w:b/>
+          <w:bCs/>
+          <w:sz w:val="20"/>
+          <w:szCs w:val="20"/>
+        </w:rPr>
+        <w:t xml:space="preserve">︙</w:t>
+      </w:r>
+      <w:r>
+        <w:rPr>
+          <w:rFonts w:ascii="Yu Gothic" w:cs="Yu Gothic" w:eastAsia="Yu Gothic" w:hAnsi="Yu Gothic"/>
+          <w:sz w:val="20"/>
+          <w:szCs w:val="20"/>
+        </w:rPr>
+        <w:t xml:space="preserve">（三点メニュー）を押す</w:t>
       </w:r>
     </w:p>
     <w:p>
@@ -1290,26 +1519,10 @@
       <w:r>
         <w:rPr>
           <w:rFonts w:ascii="Yu Gothic" w:cs="Yu Gothic" w:eastAsia="Yu Gothic" w:hAnsi="Yu Gothic"/>
-          <w:b/>
-          <w:bCs/>
-          <w:sz w:val="20"/>
-          <w:szCs w:val="20"/>
-        </w:rPr>
-        <w:t xml:space="preserve">「有効にする」を押して、許可する</w:t>
-      </w:r>
-    </w:p>
-    <w:p>
-      <w:pPr>
-        <w:spacing w:after="140" w:line="300"/>
-        <w:ind w:left="720"/>
-      </w:pPr>
-      <w:r>
-        <w:rPr>
-          <w:rFonts w:ascii="Yu Gothic" w:cs="Yu Gothic" w:eastAsia="Yu Gothic" w:hAnsi="Yu Gothic"/>
-          <w:sz w:val="20"/>
-          <w:szCs w:val="20"/>
-        </w:rPr>
-        <w:t xml:space="preserve">「通知を送信します。よろしいですか？」と聞かれるので「許可」を押します。</w:t>
+          <w:sz w:val="20"/>
+          <w:szCs w:val="20"/>
+        </w:rPr>
+        <w:t xml:space="preserve">「ホーム画面に追加」または「アプリをインストール」を押す</w:t>
       </w:r>
     </w:p>
     <w:p>
@@ -1318,6 +1531,251 @@
         <w:numPr>
           <w:ilvl w:val="0"/>
           <w:numId w:val="6"/>
+        </w:numPr>
+        <w:spacing w:after="100" w:line="300"/>
+      </w:pPr>
+      <w:r>
+        <w:rPr>
+          <w:rFonts w:ascii="Yu Gothic" w:cs="Yu Gothic" w:eastAsia="Yu Gothic" w:hAnsi="Yu Gothic"/>
+          <w:sz w:val="20"/>
+          <w:szCs w:val="20"/>
+        </w:rPr>
+        <w:t xml:space="preserve">確認画面で「追加」／「インストール」を押す</w:t>
+      </w:r>
+    </w:p>
+    <w:p>
+      <w:pPr>
+        <w:spacing w:after="120" w:line="300"/>
+      </w:pPr>
+      <w:r>
+        <w:rPr>
+          <w:rFonts w:ascii="Yu Gothic" w:cs="Yu Gothic" w:eastAsia="Yu Gothic" w:hAnsi="Yu Gothic"/>
+          <w:color w:val="5C739A"/>
+          <w:sz w:val="20"/>
+          <w:szCs w:val="20"/>
+        </w:rPr>
+        <w:t xml:space="preserve">機種によっては画面下部に「アプリをインストール」の案内が自動で出ます。そちらを押しても同じです。</w:t>
+      </w:r>
+    </w:p>
+    <w:p>
+      <w:pPr>
+        <w:pBdr>
+          <w:top w:val="single" w:color="856732" w:sz="4" w:space="8"/>
+          <w:bottom w:val="single" w:color="856732" w:sz="4" w:space="8"/>
+          <w:left w:val="single" w:color="856732" w:sz="18" w:space="10"/>
+          <w:right w:val="single" w:color="856732" w:sz="4" w:space="8"/>
+        </w:pBdr>
+        <w:shd w:fill="FBF7EB" w:val="clear"/>
+        <w:spacing w:after="0" w:before="160" w:line="280"/>
+        <w:ind w:left="200" w:right="200"/>
+      </w:pPr>
+      <w:r>
+        <w:rPr>
+          <w:rFonts w:ascii="Yu Gothic" w:cs="Yu Gothic" w:eastAsia="Yu Gothic" w:hAnsi="Yu Gothic"/>
+          <w:b/>
+          <w:bCs/>
+          <w:color w:val="856732"/>
+          <w:sz w:val="18"/>
+          <w:szCs w:val="18"/>
+        </w:rPr>
+        <w:t xml:space="preserve">追加したあと</w:t>
+      </w:r>
+    </w:p>
+    <w:p>
+      <w:pPr>
+        <w:pBdr>
+          <w:top w:val="single" w:color="856732" w:sz="4" w:space="8"/>
+          <w:bottom w:val="single" w:color="856732" w:sz="4" w:space="8"/>
+          <w:left w:val="single" w:color="856732" w:sz="18" w:space="10"/>
+          <w:right w:val="single" w:color="856732" w:sz="4" w:space="8"/>
+        </w:pBdr>
+        <w:shd w:fill="FBF7EB" w:val="clear"/>
+        <w:spacing w:after="200" w:line="280"/>
+        <w:ind w:left="200" w:right="200"/>
+      </w:pPr>
+      <w:r>
+        <w:rPr>
+          <w:rFonts w:ascii="Yu Gothic" w:cs="Yu Gothic" w:eastAsia="Yu Gothic" w:hAnsi="Yu Gothic"/>
+          <w:sz w:val="20"/>
+          <w:szCs w:val="20"/>
+        </w:rPr>
+        <w:t xml:space="preserve">ホーム画面のアイコンから開くと、ブラウザのアドレスバーが消えて全画面になります。ログイン状態も保持されるので、次からはタップするだけで秘書が立ち上がります。</w:t>
+      </w:r>
+    </w:p>
+    <w:p>
+      <w:pPr>
+        <w:pStyle w:val="Heading2"/>
+        <w:spacing w:after="140" w:before="300"/>
+      </w:pPr>
+      <w:r>
+        <w:rPr>
+          <w:rFonts w:ascii="Yu Gothic" w:cs="Yu Gothic" w:eastAsia="Yu Gothic" w:hAnsi="Yu Gothic"/>
+          <w:b/>
+          <w:bCs/>
+          <w:color w:val="1E3A5F"/>
+          <w:sz w:val="24"/>
+          <w:szCs w:val="24"/>
+        </w:rPr>
+        <w:t xml:space="preserve">お知らせを受け取る設定（この設定だけは必須です）</w:t>
+      </w:r>
+    </w:p>
+    <w:p>
+      <w:pPr>
+        <w:spacing w:after="120" w:line="300"/>
+      </w:pPr>
+      <w:r>
+        <w:rPr>
+          <w:rFonts w:ascii="Yu Gothic" w:cs="Yu Gothic" w:eastAsia="Yu Gothic" w:hAnsi="Yu Gothic"/>
+          <w:sz w:val="20"/>
+          <w:szCs w:val="20"/>
+        </w:rPr>
+        <w:t xml:space="preserve">アプリを閉じていてもご予定の前にお知らせが届くようにします。</w:t>
+      </w:r>
+      <w:r>
+        <w:rPr>
+          <w:rFonts w:ascii="Yu Gothic" w:cs="Yu Gothic" w:eastAsia="Yu Gothic" w:hAnsi="Yu Gothic"/>
+          <w:b/>
+          <w:bCs/>
+          <w:sz w:val="20"/>
+          <w:szCs w:val="20"/>
+        </w:rPr>
+        <w:t xml:space="preserve">この設定をしないと通知は鳴りません。</w:t>
+      </w:r>
+      <w:r>
+        <w:rPr>
+          <w:rFonts w:ascii="Yu Gothic" w:cs="Yu Gothic" w:eastAsia="Yu Gothic" w:hAnsi="Yu Gothic"/>
+          <w:sz w:val="20"/>
+          <w:szCs w:val="20"/>
+        </w:rPr>
+        <w:t xml:space="preserve">ホーム画面への追加を済ませてから行ってください。</w:t>
+      </w:r>
+    </w:p>
+    <w:p>
+      <w:pPr>
+        <w:pStyle w:val="ListParagraph"/>
+        <w:numPr>
+          <w:ilvl w:val="0"/>
+          <w:numId w:val="7"/>
+        </w:numPr>
+        <w:spacing w:after="100" w:line="300"/>
+      </w:pPr>
+      <w:r>
+        <w:rPr>
+          <w:rFonts w:ascii="Yu Gothic" w:cs="Yu Gothic" w:eastAsia="Yu Gothic" w:hAnsi="Yu Gothic"/>
+          <w:b/>
+          <w:bCs/>
+          <w:sz w:val="20"/>
+          <w:szCs w:val="20"/>
+        </w:rPr>
+        <w:t xml:space="preserve">ホーム画面のアイコンからアプリを開く</w:t>
+      </w:r>
+    </w:p>
+    <w:p>
+      <w:pPr>
+        <w:spacing w:after="140" w:line="300"/>
+        <w:ind w:left="720"/>
+      </w:pPr>
+      <w:r>
+        <w:rPr>
+          <w:rFonts w:ascii="Yu Gothic" w:cs="Yu Gothic" w:eastAsia="Yu Gothic" w:hAnsi="Yu Gothic"/>
+          <w:sz w:val="20"/>
+          <w:szCs w:val="20"/>
+        </w:rPr>
+        <w:t xml:space="preserve">Safariのタブから開いた状態では設定できません。</w:t>
+      </w:r>
+      <w:r>
+        <w:rPr>
+          <w:rFonts w:ascii="Yu Gothic" w:cs="Yu Gothic" w:eastAsia="Yu Gothic" w:hAnsi="Yu Gothic"/>
+          <w:b/>
+          <w:bCs/>
+          <w:sz w:val="20"/>
+          <w:szCs w:val="20"/>
+        </w:rPr>
+        <w:t xml:space="preserve">必ずホーム画面のアイコンから</w:t>
+      </w:r>
+      <w:r>
+        <w:rPr>
+          <w:rFonts w:ascii="Yu Gothic" w:cs="Yu Gothic" w:eastAsia="Yu Gothic" w:hAnsi="Yu Gothic"/>
+          <w:sz w:val="20"/>
+          <w:szCs w:val="20"/>
+        </w:rPr>
+        <w:t xml:space="preserve">起動してください（iPhoneの仕様です）。</w:t>
+      </w:r>
+    </w:p>
+    <w:p>
+      <w:pPr>
+        <w:pStyle w:val="ListParagraph"/>
+        <w:numPr>
+          <w:ilvl w:val="0"/>
+          <w:numId w:val="7"/>
+        </w:numPr>
+        <w:spacing w:after="100" w:line="300"/>
+      </w:pPr>
+      <w:r>
+        <w:rPr>
+          <w:rFonts w:ascii="Yu Gothic" w:cs="Yu Gothic" w:eastAsia="Yu Gothic" w:hAnsi="Yu Gothic"/>
+          <w:b/>
+          <w:bCs/>
+          <w:sz w:val="20"/>
+          <w:szCs w:val="20"/>
+        </w:rPr>
+        <w:t xml:space="preserve">「PROFILE」（設定）→「リマインダー」を開く</w:t>
+      </w:r>
+    </w:p>
+    <w:p>
+      <w:pPr>
+        <w:spacing w:after="140" w:line="300"/>
+        <w:ind w:left="720"/>
+      </w:pPr>
+      <w:r>
+        <w:rPr>
+          <w:rFonts w:ascii="Yu Gothic" w:cs="Yu Gothic" w:eastAsia="Yu Gothic" w:hAnsi="Yu Gothic"/>
+          <w:sz w:val="20"/>
+          <w:szCs w:val="20"/>
+        </w:rPr>
+        <w:t xml:space="preserve">いちばん下に「端末へのお知らせ」という項目があります。</w:t>
+      </w:r>
+    </w:p>
+    <w:p>
+      <w:pPr>
+        <w:pStyle w:val="ListParagraph"/>
+        <w:numPr>
+          <w:ilvl w:val="0"/>
+          <w:numId w:val="7"/>
+        </w:numPr>
+        <w:spacing w:after="100" w:line="300"/>
+      </w:pPr>
+      <w:r>
+        <w:rPr>
+          <w:rFonts w:ascii="Yu Gothic" w:cs="Yu Gothic" w:eastAsia="Yu Gothic" w:hAnsi="Yu Gothic"/>
+          <w:b/>
+          <w:bCs/>
+          <w:sz w:val="20"/>
+          <w:szCs w:val="20"/>
+        </w:rPr>
+        <w:t xml:space="preserve">「有効にする」を押して、許可する</w:t>
+      </w:r>
+    </w:p>
+    <w:p>
+      <w:pPr>
+        <w:spacing w:after="140" w:line="300"/>
+        <w:ind w:left="720"/>
+      </w:pPr>
+      <w:r>
+        <w:rPr>
+          <w:rFonts w:ascii="Yu Gothic" w:cs="Yu Gothic" w:eastAsia="Yu Gothic" w:hAnsi="Yu Gothic"/>
+          <w:sz w:val="20"/>
+          <w:szCs w:val="20"/>
+        </w:rPr>
+        <w:t xml:space="preserve">「通知を送信します。よろしいですか？」と聞かれるので「許可」を押します。</w:t>
+      </w:r>
+    </w:p>
+    <w:p>
+      <w:pPr>
+        <w:pStyle w:val="ListParagraph"/>
+        <w:numPr>
+          <w:ilvl w:val="0"/>
+          <w:numId w:val="7"/>
         </w:numPr>
         <w:spacing w:after="100" w:line="300"/>
       </w:pPr>
@@ -1973,7 +2431,7 @@
         <w:pStyle w:val="ListParagraph"/>
         <w:numPr>
           <w:ilvl w:val="0"/>
-          <w:numId w:val="6"/>
+          <w:numId w:val="7"/>
         </w:numPr>
         <w:spacing w:after="100" w:line="300"/>
       </w:pPr>
@@ -2016,211 +2474,6 @@
           <w:szCs w:val="20"/>
         </w:rPr>
         <w:t xml:space="preserve">iOS 17以前の場合は「設定 → カレンダー → アカウント → アカウントを追加」です。お使いのバージョンで表示が違うときは、設定画面の検索窓に「カレンダー」と入れると早く辿り着けます。</w:t>
-      </w:r>
-    </w:p>
-    <w:p>
-      <w:pPr>
-        <w:pStyle w:val="ListParagraph"/>
-        <w:numPr>
-          <w:ilvl w:val="0"/>
-          <w:numId w:val="6"/>
-        </w:numPr>
-        <w:spacing w:after="100" w:line="300"/>
-      </w:pPr>
-      <w:r>
-        <w:rPr>
-          <w:rFonts w:ascii="Yu Gothic" w:cs="Yu Gothic" w:eastAsia="Yu Gothic" w:hAnsi="Yu Gothic"/>
-          <w:b/>
-          <w:bCs/>
-          <w:sz w:val="20"/>
-          <w:szCs w:val="20"/>
-        </w:rPr>
-        <w:t xml:space="preserve">「Google」を選んでログインする</w:t>
-      </w:r>
-    </w:p>
-    <w:p>
-      <w:pPr>
-        <w:spacing w:after="140" w:line="300"/>
-        <w:ind w:left="720"/>
-      </w:pPr>
-      <w:r>
-        <w:rPr>
-          <w:rFonts w:ascii="Yu Gothic" w:cs="Yu Gothic" w:eastAsia="Yu Gothic" w:hAnsi="Yu Gothic"/>
-          <w:sz w:val="20"/>
-          <w:szCs w:val="20"/>
-        </w:rPr>
-        <w:t xml:space="preserve">秘書アプリで連携したのと</w:t>
-      </w:r>
-      <w:r>
-        <w:rPr>
-          <w:rFonts w:ascii="Yu Gothic" w:cs="Yu Gothic" w:eastAsia="Yu Gothic" w:hAnsi="Yu Gothic"/>
-          <w:b/>
-          <w:bCs/>
-          <w:sz w:val="20"/>
-          <w:szCs w:val="20"/>
-        </w:rPr>
-        <w:t xml:space="preserve">同じGoogleアドレス</w:t>
-      </w:r>
-      <w:r>
-        <w:rPr>
-          <w:rFonts w:ascii="Yu Gothic" w:cs="Yu Gothic" w:eastAsia="Yu Gothic" w:hAnsi="Yu Gothic"/>
-          <w:sz w:val="20"/>
-          <w:szCs w:val="20"/>
-        </w:rPr>
-        <w:t xml:space="preserve">でログインしてください。</w:t>
-      </w:r>
-    </w:p>
-    <w:p>
-      <w:pPr>
-        <w:pStyle w:val="ListParagraph"/>
-        <w:numPr>
-          <w:ilvl w:val="0"/>
-          <w:numId w:val="6"/>
-        </w:numPr>
-        <w:spacing w:after="100" w:line="300"/>
-      </w:pPr>
-      <w:r>
-        <w:rPr>
-          <w:rFonts w:ascii="Yu Gothic" w:cs="Yu Gothic" w:eastAsia="Yu Gothic" w:hAnsi="Yu Gothic"/>
-          <w:b/>
-          <w:bCs/>
-          <w:sz w:val="20"/>
-          <w:szCs w:val="20"/>
-        </w:rPr>
-        <w:t xml:space="preserve">「カレンダー」をオンにする</w:t>
-      </w:r>
-    </w:p>
-    <w:p>
-      <w:pPr>
-        <w:spacing w:after="140" w:line="300"/>
-        <w:ind w:left="720"/>
-      </w:pPr>
-      <w:r>
-        <w:rPr>
-          <w:rFonts w:ascii="Yu Gothic" w:cs="Yu Gothic" w:eastAsia="Yu Gothic" w:hAnsi="Yu Gothic"/>
-          <w:sz w:val="20"/>
-          <w:szCs w:val="20"/>
-        </w:rPr>
-        <w:t xml:space="preserve">メール・連絡先などの一覧が出るので、少なくとも「カレンダー」をオンにして保存します。</w:t>
-      </w:r>
-    </w:p>
-    <w:p>
-      <w:pPr>
-        <w:pStyle w:val="ListParagraph"/>
-        <w:numPr>
-          <w:ilvl w:val="0"/>
-          <w:numId w:val="6"/>
-        </w:numPr>
-        <w:spacing w:after="100" w:line="300"/>
-      </w:pPr>
-      <w:r>
-        <w:rPr>
-          <w:rFonts w:ascii="Yu Gothic" w:cs="Yu Gothic" w:eastAsia="Yu Gothic" w:hAnsi="Yu Gothic"/>
-          <w:b/>
-          <w:bCs/>
-          <w:sz w:val="20"/>
-          <w:szCs w:val="20"/>
-        </w:rPr>
-        <w:t xml:space="preserve">新規予定の保存先をGoogleに変える</w:t>
-      </w:r>
-    </w:p>
-    <w:p>
-      <w:pPr>
-        <w:spacing w:after="140" w:line="300"/>
-        <w:ind w:left="720"/>
-      </w:pPr>
-      <w:r>
-        <w:rPr>
-          <w:rFonts w:ascii="Yu Gothic" w:cs="Yu Gothic" w:eastAsia="Yu Gothic" w:hAnsi="Yu Gothic"/>
-          <w:b/>
-          <w:bCs/>
-          <w:sz w:val="20"/>
-          <w:szCs w:val="20"/>
-        </w:rPr>
-        <w:t xml:space="preserve">設定 → アプリ → カレンダー → デフォルトカレンダー</w:t>
-      </w:r>
-      <w:r>
-        <w:rPr>
-          <w:rFonts w:ascii="Yu Gothic" w:cs="Yu Gothic" w:eastAsia="Yu Gothic" w:hAnsi="Yu Gothic"/>
-          <w:sz w:val="20"/>
-          <w:szCs w:val="20"/>
-        </w:rPr>
-        <w:t xml:space="preserve"> で、Googleアカウント側のカレンダーを選びます。</w:t>
-      </w:r>
-    </w:p>
-    <w:p>
-      <w:pPr>
-        <w:pBdr>
-          <w:top w:val="single" w:color="856732" w:sz="4" w:space="8"/>
-          <w:bottom w:val="single" w:color="856732" w:sz="4" w:space="8"/>
-          <w:left w:val="single" w:color="856732" w:sz="18" w:space="10"/>
-          <w:right w:val="single" w:color="856732" w:sz="4" w:space="8"/>
-        </w:pBdr>
-        <w:shd w:fill="FBF7EB" w:val="clear"/>
-        <w:spacing w:after="0" w:before="160" w:line="280"/>
-        <w:ind w:left="200" w:right="200"/>
-      </w:pPr>
-      <w:r>
-        <w:rPr>
-          <w:rFonts w:ascii="Yu Gothic" w:cs="Yu Gothic" w:eastAsia="Yu Gothic" w:hAnsi="Yu Gothic"/>
-          <w:b/>
-          <w:bCs/>
-          <w:color w:val="856732"/>
-          <w:sz w:val="18"/>
-          <w:szCs w:val="18"/>
-        </w:rPr>
-        <w:t xml:space="preserve">この一手間が肝心です</w:t>
-      </w:r>
-    </w:p>
-    <w:p>
-      <w:pPr>
-        <w:pBdr>
-          <w:top w:val="single" w:color="856732" w:sz="4" w:space="8"/>
-          <w:bottom w:val="single" w:color="856732" w:sz="4" w:space="8"/>
-          <w:left w:val="single" w:color="856732" w:sz="18" w:space="10"/>
-          <w:right w:val="single" w:color="856732" w:sz="4" w:space="8"/>
-        </w:pBdr>
-        <w:shd w:fill="FBF7EB" w:val="clear"/>
-        <w:spacing w:after="200" w:line="280"/>
-        <w:ind w:left="200" w:right="200"/>
-      </w:pPr>
-      <w:r>
-        <w:rPr>
-          <w:rFonts w:ascii="Yu Gothic" w:cs="Yu Gothic" w:eastAsia="Yu Gothic" w:hAnsi="Yu Gothic"/>
-          <w:sz w:val="20"/>
-          <w:szCs w:val="20"/>
-        </w:rPr>
-        <w:t xml:space="preserve">ここを変えないと、iPhoneで作った予定はこれまでどおりiCloudに保存され、秘書からは見えないままになります。</w:t>
-      </w:r>
-    </w:p>
-    <w:p>
-      <w:pPr>
-        <w:pStyle w:val="Heading2"/>
-        <w:spacing w:after="140" w:before="300"/>
-      </w:pPr>
-      <w:r>
-        <w:rPr>
-          <w:rFonts w:ascii="Yu Gothic" w:cs="Yu Gothic" w:eastAsia="Yu Gothic" w:hAnsi="Yu Gothic"/>
-          <w:b/>
-          <w:bCs/>
-          <w:color w:val="1E3A5F"/>
-          <w:sz w:val="24"/>
-          <w:szCs w:val="24"/>
-        </w:rPr>
-        <w:t xml:space="preserve">方法B：iCloudカレンダーをGoogleに購読させる</w:t>
-      </w:r>
-    </w:p>
-    <w:p>
-      <w:pPr>
-        <w:spacing w:after="120" w:line="300"/>
-      </w:pPr>
-      <w:r>
-        <w:rPr>
-          <w:rFonts w:ascii="Yu Gothic" w:cs="Yu Gothic" w:eastAsia="Yu Gothic" w:hAnsi="Yu Gothic"/>
-          <w:sz w:val="20"/>
-          <w:szCs w:val="20"/>
-        </w:rPr>
-        <w:t xml:space="preserve">iCloudに予定を貯めたまま、Googleカレンダー側から覗くだけの方法です。手軽ですが制約が大きいので、上の方法Aが使えるならそちらをおすすめします。</w:t>
       </w:r>
     </w:p>
     <w:p>
@@ -2240,7 +2493,7 @@
           <w:sz w:val="20"/>
           <w:szCs w:val="20"/>
         </w:rPr>
-        <w:t xml:space="preserve">iPhoneでカレンダーを公開する</w:t>
+        <w:t xml:space="preserve">「Google」を選んでログインする</w:t>
       </w:r>
     </w:p>
     <w:p>
@@ -2254,7 +2507,25 @@
           <w:sz w:val="20"/>
           <w:szCs w:val="20"/>
         </w:rPr>
-        <w:t xml:space="preserve">カレンダーアプリ → 下部の「カレンダー」→ 共有したいカレンダーの「ⓘ」→「公開カレンダー」をオン →「共有リンクをコピー」。</w:t>
+        <w:t xml:space="preserve">秘書アプリで連携したのと</w:t>
+      </w:r>
+      <w:r>
+        <w:rPr>
+          <w:rFonts w:ascii="Yu Gothic" w:cs="Yu Gothic" w:eastAsia="Yu Gothic" w:hAnsi="Yu Gothic"/>
+          <w:b/>
+          <w:bCs/>
+          <w:sz w:val="20"/>
+          <w:szCs w:val="20"/>
+        </w:rPr>
+        <w:t xml:space="preserve">同じGoogleアドレス</w:t>
+      </w:r>
+      <w:r>
+        <w:rPr>
+          <w:rFonts w:ascii="Yu Gothic" w:cs="Yu Gothic" w:eastAsia="Yu Gothic" w:hAnsi="Yu Gothic"/>
+          <w:sz w:val="20"/>
+          <w:szCs w:val="20"/>
+        </w:rPr>
+        <w:t xml:space="preserve">でログインしてください。</w:t>
       </w:r>
     </w:p>
     <w:p>
@@ -2274,7 +2545,7 @@
           <w:sz w:val="20"/>
           <w:szCs w:val="20"/>
         </w:rPr>
-        <w:t xml:space="preserve">GoogleカレンダーにURLで追加する</w:t>
+        <w:t xml:space="preserve">「カレンダー」をオンにする</w:t>
       </w:r>
     </w:p>
     <w:p>
@@ -2288,18 +2559,62 @@
           <w:sz w:val="20"/>
           <w:szCs w:val="20"/>
         </w:rPr>
-        <w:t xml:space="preserve">パソコンでGoogleカレンダーを開き、左側の「他のカレンダー」の「＋」→「URLで追加」。コピーしたリンクを貼り付けます。先頭が webcal:// の場合は https:// に書き換えてください。</w:t>
-      </w:r>
-    </w:p>
-    <w:p>
-      <w:pPr>
-        <w:pBdr>
-          <w:top w:val="single" w:color="9B3D3D" w:sz="4" w:space="8"/>
-          <w:bottom w:val="single" w:color="9B3D3D" w:sz="4" w:space="8"/>
-          <w:left w:val="single" w:color="9B3D3D" w:sz="18" w:space="10"/>
-          <w:right w:val="single" w:color="9B3D3D" w:sz="4" w:space="8"/>
-        </w:pBdr>
-        <w:shd w:fill="FBF1EF" w:val="clear"/>
+        <w:t xml:space="preserve">メール・連絡先などの一覧が出るので、少なくとも「カレンダー」をオンにして保存します。</w:t>
+      </w:r>
+    </w:p>
+    <w:p>
+      <w:pPr>
+        <w:pStyle w:val="ListParagraph"/>
+        <w:numPr>
+          <w:ilvl w:val="0"/>
+          <w:numId w:val="7"/>
+        </w:numPr>
+        <w:spacing w:after="100" w:line="300"/>
+      </w:pPr>
+      <w:r>
+        <w:rPr>
+          <w:rFonts w:ascii="Yu Gothic" w:cs="Yu Gothic" w:eastAsia="Yu Gothic" w:hAnsi="Yu Gothic"/>
+          <w:b/>
+          <w:bCs/>
+          <w:sz w:val="20"/>
+          <w:szCs w:val="20"/>
+        </w:rPr>
+        <w:t xml:space="preserve">新規予定の保存先をGoogleに変える</w:t>
+      </w:r>
+    </w:p>
+    <w:p>
+      <w:pPr>
+        <w:spacing w:after="140" w:line="300"/>
+        <w:ind w:left="720"/>
+      </w:pPr>
+      <w:r>
+        <w:rPr>
+          <w:rFonts w:ascii="Yu Gothic" w:cs="Yu Gothic" w:eastAsia="Yu Gothic" w:hAnsi="Yu Gothic"/>
+          <w:b/>
+          <w:bCs/>
+          <w:sz w:val="20"/>
+          <w:szCs w:val="20"/>
+        </w:rPr>
+        <w:t xml:space="preserve">設定 → アプリ → カレンダー → デフォルトカレンダー</w:t>
+      </w:r>
+      <w:r>
+        <w:rPr>
+          <w:rFonts w:ascii="Yu Gothic" w:cs="Yu Gothic" w:eastAsia="Yu Gothic" w:hAnsi="Yu Gothic"/>
+          <w:sz w:val="20"/>
+          <w:szCs w:val="20"/>
+        </w:rPr>
+        <w:t xml:space="preserve"> で、Googleアカウント側のカレンダーを選びます。</w:t>
+      </w:r>
+    </w:p>
+    <w:p>
+      <w:pPr>
+        <w:pBdr>
+          <w:top w:val="single" w:color="856732" w:sz="4" w:space="8"/>
+          <w:bottom w:val="single" w:color="856732" w:sz="4" w:space="8"/>
+          <w:left w:val="single" w:color="856732" w:sz="18" w:space="10"/>
+          <w:right w:val="single" w:color="856732" w:sz="4" w:space="8"/>
+        </w:pBdr>
+        <w:shd w:fill="FBF7EB" w:val="clear"/>
         <w:spacing w:after="0" w:before="160" w:line="280"/>
         <w:ind w:left="200" w:right="200"/>
       </w:pPr>
@@ -2308,53 +2623,22 @@
           <w:rFonts w:ascii="Yu Gothic" w:cs="Yu Gothic" w:eastAsia="Yu Gothic" w:hAnsi="Yu Gothic"/>
           <w:b/>
           <w:bCs/>
-          <w:color w:val="9B3D3D"/>
+          <w:color w:val="856732"/>
           <w:sz w:val="18"/>
           <w:szCs w:val="18"/>
         </w:rPr>
-        <w:t xml:space="preserve">方法Bの制約</w:t>
-      </w:r>
-    </w:p>
-    <w:p>
-      <w:pPr>
-        <w:pBdr>
-          <w:top w:val="single" w:color="9B3D3D" w:sz="4" w:space="8"/>
-          <w:bottom w:val="single" w:color="9B3D3D" w:sz="4" w:space="8"/>
-          <w:left w:val="single" w:color="9B3D3D" w:sz="18" w:space="10"/>
-          <w:right w:val="single" w:color="9B3D3D" w:sz="4" w:space="8"/>
-        </w:pBdr>
-        <w:shd w:fill="FBF1EF" w:val="clear"/>
-        <w:spacing w:after="60" w:line="280"/>
-        <w:ind w:left="200" w:right="200"/>
-      </w:pPr>
-      <w:r>
-        <w:rPr>
-          <w:rFonts w:ascii="Yu Gothic" w:cs="Yu Gothic" w:eastAsia="Yu Gothic" w:hAnsi="Yu Gothic"/>
-          <w:b/>
-          <w:bCs/>
-          <w:sz w:val="20"/>
-          <w:szCs w:val="20"/>
-        </w:rPr>
-        <w:t xml:space="preserve">読み取り専用です。</w:t>
-      </w:r>
-      <w:r>
-        <w:rPr>
-          <w:rFonts w:ascii="Yu Gothic" w:cs="Yu Gothic" w:eastAsia="Yu Gothic" w:hAnsi="Yu Gothic"/>
-          <w:sz w:val="20"/>
-          <w:szCs w:val="20"/>
-        </w:rPr>
-        <w:t xml:space="preserve">秘書から予定を入れたり動かしたりはできません。また、Google側への反映は即時ではなく最大1日ほど遅れることがあるため、直前の予定変更が空き時間チェックに反映されない可能性があります。</w:t>
-      </w:r>
-    </w:p>
-    <w:p>
-      <w:pPr>
-        <w:pBdr>
-          <w:top w:val="single" w:color="9B3D3D" w:sz="4" w:space="8"/>
-          <w:bottom w:val="single" w:color="9B3D3D" w:sz="4" w:space="8"/>
-          <w:left w:val="single" w:color="9B3D3D" w:sz="18" w:space="10"/>
-          <w:right w:val="single" w:color="9B3D3D" w:sz="4" w:space="8"/>
-        </w:pBdr>
-        <w:shd w:fill="FBF1EF" w:val="clear"/>
+        <w:t xml:space="preserve">この一手間が肝心です</w:t>
+      </w:r>
+    </w:p>
+    <w:p>
+      <w:pPr>
+        <w:pBdr>
+          <w:top w:val="single" w:color="856732" w:sz="4" w:space="8"/>
+          <w:bottom w:val="single" w:color="856732" w:sz="4" w:space="8"/>
+          <w:left w:val="single" w:color="856732" w:sz="18" w:space="10"/>
+          <w:right w:val="single" w:color="856732" w:sz="4" w:space="8"/>
+        </w:pBdr>
+        <w:shd w:fill="FBF7EB" w:val="clear"/>
         <w:spacing w:after="200" w:line="280"/>
         <w:ind w:left="200" w:right="200"/>
       </w:pPr>
@@ -2364,7 +2648,7 @@
           <w:sz w:val="20"/>
           <w:szCs w:val="20"/>
         </w:rPr>
-        <w:t xml:space="preserve">公開カレンダーのリンクを知っている人は誰でも予定を閲覧できます。仕事の機密予定が入っているカレンダーでは使わないでください。</w:t>
+        <w:t xml:space="preserve">ここを変えないと、iPhoneで作った予定はこれまでどおりiCloudに保存され、秘書からは見えないままになります。</w:t>
       </w:r>
     </w:p>
     <w:p>
@@ -2381,7 +2665,20 @@
           <w:sz w:val="24"/>
           <w:szCs w:val="24"/>
         </w:rPr>
-        <w:t xml:space="preserve">方法C：これまでの予定を一度だけ移す</w:t>
+        <w:t xml:space="preserve">方法B：iCloudカレンダーをGoogleに購読させる</w:t>
+      </w:r>
+    </w:p>
+    <w:p>
+      <w:pPr>
+        <w:spacing w:after="120" w:line="300"/>
+      </w:pPr>
+      <w:r>
+        <w:rPr>
+          <w:rFonts w:ascii="Yu Gothic" w:cs="Yu Gothic" w:eastAsia="Yu Gothic" w:hAnsi="Yu Gothic"/>
+          <w:sz w:val="20"/>
+          <w:szCs w:val="20"/>
+        </w:rPr>
+        <w:t xml:space="preserve">iCloudに予定を貯めたまま、Googleカレンダー側から覗くだけの方法です。手軽ですが制約が大きいので、上の方法Aが使えるならそちらをおすすめします。</w:t>
       </w:r>
     </w:p>
     <w:p>
@@ -2401,7 +2698,7 @@
           <w:sz w:val="20"/>
           <w:szCs w:val="20"/>
         </w:rPr>
-        <w:t xml:space="preserve">パソコンでiCloud.comからカレンダーを書き出す</w:t>
+        <w:t xml:space="preserve">iPhoneでカレンダーを公開する</w:t>
       </w:r>
     </w:p>
     <w:p>
@@ -2415,7 +2712,7 @@
           <w:sz w:val="20"/>
           <w:szCs w:val="20"/>
         </w:rPr>
-        <w:t xml:space="preserve">iCloud.comのカレンダーを開き、対象カレンダーを共有設定から公開して、そのリンクをブラウザで開くと .ics ファイルが手に入ります。Macをお使いなら、カレンダーアプリの「ファイル → 書き出す」のほうが簡単です。</w:t>
+        <w:t xml:space="preserve">カレンダーアプリ → 下部の「カレンダー」→ 共有したいカレンダーの「ⓘ」→「公開カレンダー」をオン →「共有リンクをコピー」。</w:t>
       </w:r>
     </w:p>
     <w:p>
@@ -2435,7 +2732,7 @@
           <w:sz w:val="20"/>
           <w:szCs w:val="20"/>
         </w:rPr>
-        <w:t xml:space="preserve">Googleカレンダーに読み込む</w:t>
+        <w:t xml:space="preserve">GoogleカレンダーにURLで追加する</w:t>
       </w:r>
     </w:p>
     <w:p>
@@ -2449,18 +2746,18 @@
           <w:sz w:val="20"/>
           <w:szCs w:val="20"/>
         </w:rPr>
-        <w:t xml:space="preserve">Googleカレンダーの「設定 → インポート/エクスポート → インポート」で .ics を選び、取り込み先のカレンダーを指定します。</w:t>
-      </w:r>
-    </w:p>
-    <w:p>
-      <w:pPr>
-        <w:pBdr>
-          <w:top w:val="single" w:color="856732" w:sz="4" w:space="8"/>
-          <w:bottom w:val="single" w:color="856732" w:sz="4" w:space="8"/>
-          <w:left w:val="single" w:color="856732" w:sz="18" w:space="10"/>
-          <w:right w:val="single" w:color="856732" w:sz="4" w:space="8"/>
-        </w:pBdr>
-        <w:shd w:fill="FBF7EB" w:val="clear"/>
+        <w:t xml:space="preserve">パソコンでGoogleカレンダーを開き、左側の「他のカレンダー」の「＋」→「URLで追加」。コピーしたリンクを貼り付けます。先頭が webcal:// の場合は https:// に書き換えてください。</w:t>
+      </w:r>
+    </w:p>
+    <w:p>
+      <w:pPr>
+        <w:pBdr>
+          <w:top w:val="single" w:color="9B3D3D" w:sz="4" w:space="8"/>
+          <w:bottom w:val="single" w:color="9B3D3D" w:sz="4" w:space="8"/>
+          <w:left w:val="single" w:color="9B3D3D" w:sz="18" w:space="10"/>
+          <w:right w:val="single" w:color="9B3D3D" w:sz="4" w:space="8"/>
+        </w:pBdr>
+        <w:shd w:fill="FBF1EF" w:val="clear"/>
         <w:spacing w:after="0" w:before="160" w:line="280"/>
         <w:ind w:left="200" w:right="200"/>
       </w:pPr>
@@ -2469,22 +2766,53 @@
           <w:rFonts w:ascii="Yu Gothic" w:cs="Yu Gothic" w:eastAsia="Yu Gothic" w:hAnsi="Yu Gothic"/>
           <w:b/>
           <w:bCs/>
-          <w:color w:val="856732"/>
+          <w:color w:val="9B3D3D"/>
           <w:sz w:val="18"/>
           <w:szCs w:val="18"/>
         </w:rPr>
-        <w:t xml:space="preserve">仕上げに</w:t>
-      </w:r>
-    </w:p>
-    <w:p>
-      <w:pPr>
-        <w:pBdr>
-          <w:top w:val="single" w:color="856732" w:sz="4" w:space="8"/>
-          <w:bottom w:val="single" w:color="856732" w:sz="4" w:space="8"/>
-          <w:left w:val="single" w:color="856732" w:sz="18" w:space="10"/>
-          <w:right w:val="single" w:color="856732" w:sz="4" w:space="8"/>
-        </w:pBdr>
-        <w:shd w:fill="FBF7EB" w:val="clear"/>
+        <w:t xml:space="preserve">方法Bの制約</w:t>
+      </w:r>
+    </w:p>
+    <w:p>
+      <w:pPr>
+        <w:pBdr>
+          <w:top w:val="single" w:color="9B3D3D" w:sz="4" w:space="8"/>
+          <w:bottom w:val="single" w:color="9B3D3D" w:sz="4" w:space="8"/>
+          <w:left w:val="single" w:color="9B3D3D" w:sz="18" w:space="10"/>
+          <w:right w:val="single" w:color="9B3D3D" w:sz="4" w:space="8"/>
+        </w:pBdr>
+        <w:shd w:fill="FBF1EF" w:val="clear"/>
+        <w:spacing w:after="60" w:line="280"/>
+        <w:ind w:left="200" w:right="200"/>
+      </w:pPr>
+      <w:r>
+        <w:rPr>
+          <w:rFonts w:ascii="Yu Gothic" w:cs="Yu Gothic" w:eastAsia="Yu Gothic" w:hAnsi="Yu Gothic"/>
+          <w:b/>
+          <w:bCs/>
+          <w:sz w:val="20"/>
+          <w:szCs w:val="20"/>
+        </w:rPr>
+        <w:t xml:space="preserve">読み取り専用です。</w:t>
+      </w:r>
+      <w:r>
+        <w:rPr>
+          <w:rFonts w:ascii="Yu Gothic" w:cs="Yu Gothic" w:eastAsia="Yu Gothic" w:hAnsi="Yu Gothic"/>
+          <w:sz w:val="20"/>
+          <w:szCs w:val="20"/>
+        </w:rPr>
+        <w:t xml:space="preserve">秘書から予定を入れたり動かしたりはできません。また、Google側への反映は即時ではなく最大1日ほど遅れることがあるため、直前の予定変更が空き時間チェックに反映されない可能性があります。</w:t>
+      </w:r>
+    </w:p>
+    <w:p>
+      <w:pPr>
+        <w:pBdr>
+          <w:top w:val="single" w:color="9B3D3D" w:sz="4" w:space="8"/>
+          <w:bottom w:val="single" w:color="9B3D3D" w:sz="4" w:space="8"/>
+          <w:left w:val="single" w:color="9B3D3D" w:sz="18" w:space="10"/>
+          <w:right w:val="single" w:color="9B3D3D" w:sz="4" w:space="8"/>
+        </w:pBdr>
+        <w:shd w:fill="FBF1EF" w:val="clear"/>
         <w:spacing w:after="200" w:line="280"/>
         <w:ind w:left="200" w:right="200"/>
       </w:pPr>
@@ -2494,86 +2822,24 @@
           <w:sz w:val="20"/>
           <w:szCs w:val="20"/>
         </w:rPr>
-        <w:t xml:space="preserve">方法Cは過去分のコピーです。これから作る予定も秘書に見せたい場合は、あわせて方法Aの設定もしておいてください。</w:t>
-      </w:r>
-    </w:p>
-    <w:p>
-      <w:pPr>
-        <w:pStyle w:val="Heading1"/>
-        <w:pBdr>
-          <w:bottom w:val="single" w:color="856732" w:sz="8" w:space="6"/>
-        </w:pBdr>
-        <w:spacing w:after="200" w:before="400"/>
-      </w:pPr>
-      <w:r>
-        <w:rPr>
-          <w:rFonts w:ascii="Yu Gothic" w:cs="Yu Gothic" w:eastAsia="Yu Gothic" w:hAnsi="Yu Gothic"/>
-          <w:b/>
-          <w:bCs/>
-          <w:color w:val="0A1A30"/>
-          <w:sz w:val="30"/>
-          <w:szCs w:val="30"/>
-        </w:rPr>
-        <w:t xml:space="preserve">管理者の方へ　メンバーを追加する</w:t>
-      </w:r>
-    </w:p>
-    <w:p>
-      <w:pPr>
-        <w:spacing w:after="120" w:line="300"/>
-      </w:pPr>
-      <w:r>
-        <w:rPr>
-          <w:rFonts w:ascii="Yu Gothic" w:cs="Yu Gothic" w:eastAsia="Yu Gothic" w:hAnsi="Yu Gothic"/>
-          <w:color w:val="5C739A"/>
-          <w:sz w:val="20"/>
-          <w:szCs w:val="20"/>
-        </w:rPr>
-        <w:t xml:space="preserve">新しく使う方が増えたときの作業です。ご利用される方はこの章を読み飛ばしていただいて構いません。</w:t>
-      </w:r>
-    </w:p>
-    <w:p>
-      <w:pPr>
-        <w:pBdr>
-          <w:top w:val="single" w:color="856732" w:sz="4" w:space="8"/>
-          <w:bottom w:val="single" w:color="856732" w:sz="4" w:space="8"/>
-          <w:left w:val="single" w:color="856732" w:sz="18" w:space="10"/>
-          <w:right w:val="single" w:color="856732" w:sz="4" w:space="8"/>
-        </w:pBdr>
-        <w:shd w:fill="FBF7EB" w:val="clear"/>
-        <w:spacing w:after="0" w:before="160" w:line="280"/>
-        <w:ind w:left="200" w:right="200"/>
-      </w:pPr>
-      <w:r>
-        <w:rPr>
-          <w:rFonts w:ascii="Yu Gothic" w:cs="Yu Gothic" w:eastAsia="Yu Gothic" w:hAnsi="Yu Gothic"/>
-          <w:b/>
-          <w:bCs/>
-          <w:color w:val="856732"/>
-          <w:sz w:val="18"/>
-          <w:szCs w:val="18"/>
-        </w:rPr>
-        <w:t xml:space="preserve">アプリ側の作業は不要です</w:t>
-      </w:r>
-    </w:p>
-    <w:p>
-      <w:pPr>
-        <w:pBdr>
-          <w:top w:val="single" w:color="856732" w:sz="4" w:space="8"/>
-          <w:bottom w:val="single" w:color="856732" w:sz="4" w:space="8"/>
-          <w:left w:val="single" w:color="856732" w:sz="18" w:space="10"/>
-          <w:right w:val="single" w:color="856732" w:sz="4" w:space="8"/>
-        </w:pBdr>
-        <w:shd w:fill="FBF7EB" w:val="clear"/>
-        <w:spacing w:after="200" w:line="280"/>
-        <w:ind w:left="200" w:right="200"/>
-      </w:pPr>
-      <w:r>
-        <w:rPr>
-          <w:rFonts w:ascii="Yu Gothic" w:cs="Yu Gothic" w:eastAsia="Yu Gothic" w:hAnsi="Yu Gothic"/>
-          <w:sz w:val="20"/>
-          <w:szCs w:val="20"/>
-        </w:rPr>
-        <w:t xml:space="preserve">追加した方がご自身のGoogleアカウントで連携すれば、その方専用のデータ領域が自動で作られます。必要なのは、Googleの利用許可リストに1名を加えることだけです。</w:t>
+        <w:t xml:space="preserve">公開カレンダーのリンクを知っている人は誰でも予定を閲覧できます。仕事の機密予定が入っているカレンダーでは使わないでください。</w:t>
+      </w:r>
+    </w:p>
+    <w:p>
+      <w:pPr>
+        <w:pStyle w:val="Heading2"/>
+        <w:spacing w:after="140" w:before="300"/>
+      </w:pPr>
+      <w:r>
+        <w:rPr>
+          <w:rFonts w:ascii="Yu Gothic" w:cs="Yu Gothic" w:eastAsia="Yu Gothic" w:hAnsi="Yu Gothic"/>
+          <w:b/>
+          <w:bCs/>
+          <w:color w:val="1E3A5F"/>
+          <w:sz w:val="24"/>
+          <w:szCs w:val="24"/>
+        </w:rPr>
+        <w:t xml:space="preserve">方法C：これまでの予定を一度だけ移す</w:t>
       </w:r>
     </w:p>
     <w:p>
@@ -2593,7 +2859,7 @@
           <w:sz w:val="20"/>
           <w:szCs w:val="20"/>
         </w:rPr>
-        <w:t xml:space="preserve">Google Cloud Console を開く</w:t>
+        <w:t xml:space="preserve">パソコンでiCloud.comからカレンダーを書き出す</w:t>
       </w:r>
     </w:p>
     <w:p>
@@ -2607,7 +2873,7 @@
           <w:sz w:val="20"/>
           <w:szCs w:val="20"/>
         </w:rPr>
-        <w:t xml:space="preserve">console.cloud.google.com を開き、画面上部でこのアプリのプロジェクトが選ばれているかご確認ください。</w:t>
+        <w:t xml:space="preserve">iCloud.comのカレンダーを開き、対象カレンダーを共有設定から公開して、そのリンクをブラウザで開くと .ics ファイルが手に入ります。Macをお使いなら、カレンダーアプリの「ファイル → 書き出す」のほうが簡単です。</w:t>
       </w:r>
     </w:p>
     <w:p>
@@ -2627,7 +2893,7 @@
           <w:sz w:val="20"/>
           <w:szCs w:val="20"/>
         </w:rPr>
-        <w:t xml:space="preserve">「Google Auth Platform」→「対象」を開く</w:t>
+        <w:t xml:space="preserve">Googleカレンダーに読み込む</w:t>
       </w:r>
     </w:p>
     <w:p>
@@ -2641,7 +2907,131 @@
           <w:sz w:val="20"/>
           <w:szCs w:val="20"/>
         </w:rPr>
-        <w:t xml:space="preserve">以前の画面では「APIとサービス → OAuth同意画面」です。表示が違う場合は、上部の検索窓に「OAuth」と入れると辿り着けます。</w:t>
+        <w:t xml:space="preserve">Googleカレンダーの「設定 → インポート/エクスポート → インポート」で .ics を選び、取り込み先のカレンダーを指定します。</w:t>
+      </w:r>
+    </w:p>
+    <w:p>
+      <w:pPr>
+        <w:pBdr>
+          <w:top w:val="single" w:color="856732" w:sz="4" w:space="8"/>
+          <w:bottom w:val="single" w:color="856732" w:sz="4" w:space="8"/>
+          <w:left w:val="single" w:color="856732" w:sz="18" w:space="10"/>
+          <w:right w:val="single" w:color="856732" w:sz="4" w:space="8"/>
+        </w:pBdr>
+        <w:shd w:fill="FBF7EB" w:val="clear"/>
+        <w:spacing w:after="0" w:before="160" w:line="280"/>
+        <w:ind w:left="200" w:right="200"/>
+      </w:pPr>
+      <w:r>
+        <w:rPr>
+          <w:rFonts w:ascii="Yu Gothic" w:cs="Yu Gothic" w:eastAsia="Yu Gothic" w:hAnsi="Yu Gothic"/>
+          <w:b/>
+          <w:bCs/>
+          <w:color w:val="856732"/>
+          <w:sz w:val="18"/>
+          <w:szCs w:val="18"/>
+        </w:rPr>
+        <w:t xml:space="preserve">仕上げに</w:t>
+      </w:r>
+    </w:p>
+    <w:p>
+      <w:pPr>
+        <w:pBdr>
+          <w:top w:val="single" w:color="856732" w:sz="4" w:space="8"/>
+          <w:bottom w:val="single" w:color="856732" w:sz="4" w:space="8"/>
+          <w:left w:val="single" w:color="856732" w:sz="18" w:space="10"/>
+          <w:right w:val="single" w:color="856732" w:sz="4" w:space="8"/>
+        </w:pBdr>
+        <w:shd w:fill="FBF7EB" w:val="clear"/>
+        <w:spacing w:after="200" w:line="280"/>
+        <w:ind w:left="200" w:right="200"/>
+      </w:pPr>
+      <w:r>
+        <w:rPr>
+          <w:rFonts w:ascii="Yu Gothic" w:cs="Yu Gothic" w:eastAsia="Yu Gothic" w:hAnsi="Yu Gothic"/>
+          <w:sz w:val="20"/>
+          <w:szCs w:val="20"/>
+        </w:rPr>
+        <w:t xml:space="preserve">方法Cは過去分のコピーです。これから作る予定も秘書に見せたい場合は、あわせて方法Aの設定もしておいてください。</w:t>
+      </w:r>
+    </w:p>
+    <w:p>
+      <w:pPr>
+        <w:pStyle w:val="Heading1"/>
+        <w:pBdr>
+          <w:bottom w:val="single" w:color="856732" w:sz="8" w:space="6"/>
+        </w:pBdr>
+        <w:spacing w:after="200" w:before="400"/>
+      </w:pPr>
+      <w:r>
+        <w:rPr>
+          <w:rFonts w:ascii="Yu Gothic" w:cs="Yu Gothic" w:eastAsia="Yu Gothic" w:hAnsi="Yu Gothic"/>
+          <w:b/>
+          <w:bCs/>
+          <w:color w:val="0A1A30"/>
+          <w:sz w:val="30"/>
+          <w:szCs w:val="30"/>
+        </w:rPr>
+        <w:t xml:space="preserve">管理者の方へ　メンバーを追加する</w:t>
+      </w:r>
+    </w:p>
+    <w:p>
+      <w:pPr>
+        <w:spacing w:after="120" w:line="300"/>
+      </w:pPr>
+      <w:r>
+        <w:rPr>
+          <w:rFonts w:ascii="Yu Gothic" w:cs="Yu Gothic" w:eastAsia="Yu Gothic" w:hAnsi="Yu Gothic"/>
+          <w:color w:val="5C739A"/>
+          <w:sz w:val="20"/>
+          <w:szCs w:val="20"/>
+        </w:rPr>
+        <w:t xml:space="preserve">新しく使う方が増えたときの作業です。ご利用される方はこの章を読み飛ばしていただいて構いません。</w:t>
+      </w:r>
+    </w:p>
+    <w:p>
+      <w:pPr>
+        <w:pBdr>
+          <w:top w:val="single" w:color="856732" w:sz="4" w:space="8"/>
+          <w:bottom w:val="single" w:color="856732" w:sz="4" w:space="8"/>
+          <w:left w:val="single" w:color="856732" w:sz="18" w:space="10"/>
+          <w:right w:val="single" w:color="856732" w:sz="4" w:space="8"/>
+        </w:pBdr>
+        <w:shd w:fill="FBF7EB" w:val="clear"/>
+        <w:spacing w:after="0" w:before="160" w:line="280"/>
+        <w:ind w:left="200" w:right="200"/>
+      </w:pPr>
+      <w:r>
+        <w:rPr>
+          <w:rFonts w:ascii="Yu Gothic" w:cs="Yu Gothic" w:eastAsia="Yu Gothic" w:hAnsi="Yu Gothic"/>
+          <w:b/>
+          <w:bCs/>
+          <w:color w:val="856732"/>
+          <w:sz w:val="18"/>
+          <w:szCs w:val="18"/>
+        </w:rPr>
+        <w:t xml:space="preserve">アプリ側の作業は不要です</w:t>
+      </w:r>
+    </w:p>
+    <w:p>
+      <w:pPr>
+        <w:pBdr>
+          <w:top w:val="single" w:color="856732" w:sz="4" w:space="8"/>
+          <w:bottom w:val="single" w:color="856732" w:sz="4" w:space="8"/>
+          <w:left w:val="single" w:color="856732" w:sz="18" w:space="10"/>
+          <w:right w:val="single" w:color="856732" w:sz="4" w:space="8"/>
+        </w:pBdr>
+        <w:shd w:fill="FBF7EB" w:val="clear"/>
+        <w:spacing w:after="200" w:line="280"/>
+        <w:ind w:left="200" w:right="200"/>
+      </w:pPr>
+      <w:r>
+        <w:rPr>
+          <w:rFonts w:ascii="Yu Gothic" w:cs="Yu Gothic" w:eastAsia="Yu Gothic" w:hAnsi="Yu Gothic"/>
+          <w:sz w:val="20"/>
+          <w:szCs w:val="20"/>
+        </w:rPr>
+        <w:t xml:space="preserve">追加した方がご自身のGoogleアカウントで連携すれば、その方専用のデータ領域が自動で作られます。必要なのは、Googleの利用許可リストに1名を加えることだけです。</w:t>
       </w:r>
     </w:p>
     <w:p>
@@ -2649,7 +3039,7 @@
         <w:pStyle w:val="ListParagraph"/>
         <w:numPr>
           <w:ilvl w:val="0"/>
-          <w:numId w:val="9"/>
+          <w:numId w:val="10"/>
         </w:numPr>
         <w:spacing w:after="100" w:line="300"/>
       </w:pPr>
@@ -2661,7 +3051,7 @@
           <w:sz w:val="20"/>
           <w:szCs w:val="20"/>
         </w:rPr>
-        <w:t xml:space="preserve">「テストユーザー」の「＋ ユーザーを追加」を押す</w:t>
+        <w:t xml:space="preserve">Google Cloud Console を開く</w:t>
       </w:r>
     </w:p>
     <w:p>
@@ -2675,25 +3065,7 @@
           <w:sz w:val="20"/>
           <w:szCs w:val="20"/>
         </w:rPr>
-        <w:t xml:space="preserve">追加したい方の</w:t>
-      </w:r>
-      <w:r>
-        <w:rPr>
-          <w:rFonts w:ascii="Yu Gothic" w:cs="Yu Gothic" w:eastAsia="Yu Gothic" w:hAnsi="Yu Gothic"/>
-          <w:b/>
-          <w:bCs/>
-          <w:sz w:val="20"/>
-          <w:szCs w:val="20"/>
-        </w:rPr>
-        <w:t xml:space="preserve">Gmailアドレス</w:t>
-      </w:r>
-      <w:r>
-        <w:rPr>
-          <w:rFonts w:ascii="Yu Gothic" w:cs="Yu Gothic" w:eastAsia="Yu Gothic" w:hAnsi="Yu Gothic"/>
-          <w:sz w:val="20"/>
-          <w:szCs w:val="20"/>
-        </w:rPr>
-        <w:t xml:space="preserve">を入力して保存します。反映は即時で、審査などの待ち時間はありません。</w:t>
+        <w:t xml:space="preserve">console.cloud.google.com を開き、画面上部でこのアプリのプロジェクトが選ばれているかご確認ください。</w:t>
       </w:r>
     </w:p>
     <w:p>
@@ -2701,7 +3073,93 @@
         <w:pStyle w:val="ListParagraph"/>
         <w:numPr>
           <w:ilvl w:val="0"/>
-          <w:numId w:val="9"/>
+          <w:numId w:val="10"/>
+        </w:numPr>
+        <w:spacing w:after="100" w:line="300"/>
+      </w:pPr>
+      <w:r>
+        <w:rPr>
+          <w:rFonts w:ascii="Yu Gothic" w:cs="Yu Gothic" w:eastAsia="Yu Gothic" w:hAnsi="Yu Gothic"/>
+          <w:b/>
+          <w:bCs/>
+          <w:sz w:val="20"/>
+          <w:szCs w:val="20"/>
+        </w:rPr>
+        <w:t xml:space="preserve">「Google Auth Platform」→「対象」を開く</w:t>
+      </w:r>
+    </w:p>
+    <w:p>
+      <w:pPr>
+        <w:spacing w:after="140" w:line="300"/>
+        <w:ind w:left="720"/>
+      </w:pPr>
+      <w:r>
+        <w:rPr>
+          <w:rFonts w:ascii="Yu Gothic" w:cs="Yu Gothic" w:eastAsia="Yu Gothic" w:hAnsi="Yu Gothic"/>
+          <w:sz w:val="20"/>
+          <w:szCs w:val="20"/>
+        </w:rPr>
+        <w:t xml:space="preserve">以前の画面では「APIとサービス → OAuth同意画面」です。表示が違う場合は、上部の検索窓に「OAuth」と入れると辿り着けます。</w:t>
+      </w:r>
+    </w:p>
+    <w:p>
+      <w:pPr>
+        <w:pStyle w:val="ListParagraph"/>
+        <w:numPr>
+          <w:ilvl w:val="0"/>
+          <w:numId w:val="10"/>
+        </w:numPr>
+        <w:spacing w:after="100" w:line="300"/>
+      </w:pPr>
+      <w:r>
+        <w:rPr>
+          <w:rFonts w:ascii="Yu Gothic" w:cs="Yu Gothic" w:eastAsia="Yu Gothic" w:hAnsi="Yu Gothic"/>
+          <w:b/>
+          <w:bCs/>
+          <w:sz w:val="20"/>
+          <w:szCs w:val="20"/>
+        </w:rPr>
+        <w:t xml:space="preserve">「テストユーザー」の「＋ ユーザーを追加」を押す</w:t>
+      </w:r>
+    </w:p>
+    <w:p>
+      <w:pPr>
+        <w:spacing w:after="140" w:line="300"/>
+        <w:ind w:left="720"/>
+      </w:pPr>
+      <w:r>
+        <w:rPr>
+          <w:rFonts w:ascii="Yu Gothic" w:cs="Yu Gothic" w:eastAsia="Yu Gothic" w:hAnsi="Yu Gothic"/>
+          <w:sz w:val="20"/>
+          <w:szCs w:val="20"/>
+        </w:rPr>
+        <w:t xml:space="preserve">追加したい方の</w:t>
+      </w:r>
+      <w:r>
+        <w:rPr>
+          <w:rFonts w:ascii="Yu Gothic" w:cs="Yu Gothic" w:eastAsia="Yu Gothic" w:hAnsi="Yu Gothic"/>
+          <w:b/>
+          <w:bCs/>
+          <w:sz w:val="20"/>
+          <w:szCs w:val="20"/>
+        </w:rPr>
+        <w:t xml:space="preserve">Gmailアドレス</w:t>
+      </w:r>
+      <w:r>
+        <w:rPr>
+          <w:rFonts w:ascii="Yu Gothic" w:cs="Yu Gothic" w:eastAsia="Yu Gothic" w:hAnsi="Yu Gothic"/>
+          <w:sz w:val="20"/>
+          <w:szCs w:val="20"/>
+        </w:rPr>
+        <w:t xml:space="preserve">を入力して保存します。反映は即時で、審査などの待ち時間はありません。</w:t>
+      </w:r>
+    </w:p>
+    <w:p>
+      <w:pPr>
+        <w:pStyle w:val="ListParagraph"/>
+        <w:numPr>
+          <w:ilvl w:val="0"/>
+          <w:numId w:val="10"/>
         </w:numPr>
         <w:spacing w:after="100" w:line="300"/>
       </w:pPr>
@@ -3282,7 +3740,7 @@
     </w:lvlOverride>
   </w:num>
   <w:num w:numId="3">
-    <w:abstractNumId w:val="2"/>
+    <w:abstractNumId w:val="3"/>
     <w:lvlOverride w:ilvl="0">
       <w:startOverride w:val="1"/>
     </w:lvlOverride>
@@ -3318,6 +3776,12 @@
     </w:lvlOverride>
   </w:num>
   <w:num w:numId="9">
+    <w:abstractNumId w:val="2"/>
+    <w:lvlOverride w:ilvl="0">
+      <w:startOverride w:val="1"/>
+    </w:lvlOverride>
+  </w:num>
+  <w:num w:numId="10">
     <w:abstractNumId w:val="2"/>
     <w:lvlOverride w:ilvl="0">
       <w:startOverride w:val="1"/>

</xml_diff>

<commit_message>
Fix Method C wording: it copies future events too, not just past ones
"過去分のコピー" implied the .ics export only carried over history.
It actually snapshots everything on the calendar at export time, future
appointments included — the real constraint is that it's one-time, not
that it's backward-looking. Left as written, a tester could conclude
their upcoming meetings wouldn't transfer and re-enter them by hand.

Co-Authored-By: Claude Opus 5 <noreply@anthropic.com>
</commit_message>
<xml_diff>
--- a/docs/setup-guide.docx
+++ b/docs/setup-guide.docx
@@ -84,7 +84,7 @@
         </w:rPr>
         <w:t xml:space="preserve">アプリのURL：</w:t>
       </w:r>
-      <w:hyperlink w:history="1" r:id="rIdlh39obgrba9x0sdxuvd4p">
+      <w:hyperlink w:history="1" r:id="rIds360_vvsrxdbq4vyasol-">
         <w:r>
           <w:rPr>
             <w:rFonts w:ascii="Consolas" w:cs="Consolas" w:eastAsia="Consolas" w:hAnsi="Consolas"/>
@@ -2342,7 +2342,7 @@
                 <w:sz w:val="20"/>
                 <w:szCs w:val="20"/>
               </w:rPr>
-              <w:t xml:space="preserve">C. 過去分を一度だけ移す</w:t>
+              <w:t xml:space="preserve">C. 今ある予定を一度だけ移す</w:t>
             </w:r>
           </w:p>
         </w:tc>
@@ -2366,7 +2366,7 @@
                 <w:sz w:val="20"/>
                 <w:szCs w:val="20"/>
               </w:rPr>
-              <w:t xml:space="preserve">これまでの予定も持っていきたい人</w:t>
+              <w:t xml:space="preserve">過去・未来問わず今の予定を丸ごと持っていきたい人</w:t>
             </w:r>
           </w:p>
         </w:tc>
@@ -2390,7 +2390,7 @@
                 <w:sz w:val="20"/>
                 <w:szCs w:val="20"/>
               </w:rPr>
-              <w:t xml:space="preserve">一回きりのコピー。以降は同期しない</w:t>
+              <w:t xml:space="preserve">一回きりのコピー（実行時点の予定を過去・未来とも反映）。以降の新規作成分は同期しない</w:t>
             </w:r>
           </w:p>
         </w:tc>
@@ -2839,7 +2839,7 @@
           <w:sz w:val="24"/>
           <w:szCs w:val="24"/>
         </w:rPr>
-        <w:t xml:space="preserve">方法C：これまでの予定を一度だけ移す</w:t>
+        <w:t xml:space="preserve">方法C：今あるiCloudの予定を一度だけ移す</w:t>
       </w:r>
     </w:p>
     <w:p>
@@ -2952,7 +2952,43 @@
           <w:sz w:val="20"/>
           <w:szCs w:val="20"/>
         </w:rPr>
-        <w:t xml:space="preserve">方法Cは過去分のコピーです。これから作る予定も秘書に見せたい場合は、あわせて方法Aの設定もしておいてください。</w:t>
+        <w:t xml:space="preserve">方法Cは、実行した時点でiCloudに入っている予定を</w:t>
+      </w:r>
+      <w:r>
+        <w:rPr>
+          <w:rFonts w:ascii="Yu Gothic" w:cs="Yu Gothic" w:eastAsia="Yu Gothic" w:hAnsi="Yu Gothic"/>
+          <w:b/>
+          <w:bCs/>
+          <w:sz w:val="20"/>
+          <w:szCs w:val="20"/>
+        </w:rPr>
+        <w:t xml:space="preserve">過去・未来問わずまとめて</w:t>
+      </w:r>
+      <w:r>
+        <w:rPr>
+          <w:rFonts w:ascii="Yu Gothic" w:cs="Yu Gothic" w:eastAsia="Yu Gothic" w:hAnsi="Yu Gothic"/>
+          <w:sz w:val="20"/>
+          <w:szCs w:val="20"/>
+        </w:rPr>
+        <w:t xml:space="preserve">Googleカレンダーへコピーします。ただし</w:t>
+      </w:r>
+      <w:r>
+        <w:rPr>
+          <w:rFonts w:ascii="Yu Gothic" w:cs="Yu Gothic" w:eastAsia="Yu Gothic" w:hAnsi="Yu Gothic"/>
+          <w:b/>
+          <w:bCs/>
+          <w:sz w:val="20"/>
+          <w:szCs w:val="20"/>
+        </w:rPr>
+        <w:t xml:space="preserve">一度きりのコピー</w:t>
+      </w:r>
+      <w:r>
+        <w:rPr>
+          <w:rFonts w:ascii="Yu Gothic" w:cs="Yu Gothic" w:eastAsia="Yu Gothic" w:hAnsi="Yu Gothic"/>
+          <w:sz w:val="20"/>
+          <w:szCs w:val="20"/>
+        </w:rPr>
+        <w:t xml:space="preserve">のため、これ以降iPhone側で新しく作る予定は自動では連携されません。今後の分も秘書に見せ続けたい場合は、あわせて方法Aの設定もしておいてください。</w:t>
       </w:r>
     </w:p>
     <w:p>

</xml_diff>

<commit_message>
Spell out the actual iCloud export steps for Method C
Step 1 previously said "publish the calendar and open the link" without
saying where that setting lives, so a reader with no Mac had nothing to
follow. Adds the exact iPhone and iCloud.com paths (per Apple's own
support docs — the info button, the Public Calendar toggle, Copy),
the webcal→https rewrite, and a reminder to turn Public Calendar back
off afterward, since leaving it on makes the calendar viewable by
anyone with the link.

Co-Authored-By: Claude Opus 5 <noreply@anthropic.com>
</commit_message>
<xml_diff>
--- a/docs/setup-guide.docx
+++ b/docs/setup-guide.docx
@@ -84,7 +84,7 @@
         </w:rPr>
         <w:t xml:space="preserve">アプリのURL：</w:t>
       </w:r>
-      <w:hyperlink w:history="1" r:id="rIds360_vvsrxdbq4vyasol-">
+      <w:hyperlink w:history="1" r:id="rIdedftmyfk2emphzvqdhnvn">
         <w:r>
           <w:rPr>
             <w:rFonts w:ascii="Consolas" w:cs="Consolas" w:eastAsia="Consolas" w:hAnsi="Consolas"/>
@@ -2844,6 +2844,19 @@
     </w:p>
     <w:p>
       <w:pPr>
+        <w:spacing w:after="120" w:line="300"/>
+      </w:pPr>
+      <w:r>
+        <w:rPr>
+          <w:rFonts w:ascii="Yu Gothic" w:cs="Yu Gothic" w:eastAsia="Yu Gothic" w:hAnsi="Yu Gothic"/>
+          <w:sz w:val="20"/>
+          <w:szCs w:val="20"/>
+        </w:rPr>
+        <w:t xml:space="preserve">Macをお持ちなら、カレンダーアプリの「ファイル → 書き出す」から直接 .ics ファイルを保存できます（いちばん簡単です）。お持ちでない場合は、以下の手順でiPhoneまたはパソコンから同じものを用意できます。</w:t>
+      </w:r>
+    </w:p>
+    <w:p>
+      <w:pPr>
         <w:pStyle w:val="ListParagraph"/>
         <w:numPr>
           <w:ilvl w:val="0"/>
@@ -2859,7 +2872,7 @@
           <w:sz w:val="20"/>
           <w:szCs w:val="20"/>
         </w:rPr>
-        <w:t xml:space="preserve">パソコンでiCloud.comからカレンダーを書き出す</w:t>
+        <w:t xml:space="preserve">カレンダーを「公開」にして、共有リンクを取得する</w:t>
       </w:r>
     </w:p>
     <w:p>
@@ -2873,7 +2886,181 @@
           <w:sz w:val="20"/>
           <w:szCs w:val="20"/>
         </w:rPr>
-        <w:t xml:space="preserve">iCloud.comのカレンダーを開き、対象カレンダーを共有設定から公開して、そのリンクをブラウザで開くと .ics ファイルが手に入ります。Macをお使いなら、カレンダーアプリの「ファイル → 書き出す」のほうが簡単です。</w:t>
+        <w:t xml:space="preserve">iPhone・パソコンいずれかで行います。どちらも所要1分程度です。</w:t>
+      </w:r>
+    </w:p>
+    <w:p>
+      <w:pPr>
+        <w:spacing w:after="120" w:line="300"/>
+      </w:pPr>
+      <w:r>
+        <w:rPr>
+          <w:rFonts w:ascii="Yu Gothic" w:cs="Yu Gothic" w:eastAsia="Yu Gothic" w:hAnsi="Yu Gothic"/>
+          <w:b/>
+          <w:bCs/>
+          <w:sz w:val="20"/>
+          <w:szCs w:val="20"/>
+        </w:rPr>
+        <w:t xml:space="preserve">　iPhoneで行う場合</w:t>
+      </w:r>
+    </w:p>
+    <w:p>
+      <w:pPr>
+        <w:pStyle w:val="ListParagraph"/>
+        <w:numPr>
+          <w:ilvl w:val="0"/>
+          <w:numId w:val="10"/>
+        </w:numPr>
+        <w:spacing w:after="100" w:line="300"/>
+      </w:pPr>
+      <w:r>
+        <w:rPr>
+          <w:rFonts w:ascii="Yu Gothic" w:cs="Yu Gothic" w:eastAsia="Yu Gothic" w:hAnsi="Yu Gothic"/>
+          <w:sz w:val="20"/>
+          <w:szCs w:val="20"/>
+        </w:rPr>
+        <w:t xml:space="preserve">「カレンダー」アプリを開き、下部の「カレンダー」をタップ</w:t>
+      </w:r>
+    </w:p>
+    <w:p>
+      <w:pPr>
+        <w:pStyle w:val="ListParagraph"/>
+        <w:numPr>
+          <w:ilvl w:val="0"/>
+          <w:numId w:val="10"/>
+        </w:numPr>
+        <w:spacing w:after="100" w:line="300"/>
+      </w:pPr>
+      <w:r>
+        <w:rPr>
+          <w:rFonts w:ascii="Yu Gothic" w:cs="Yu Gothic" w:eastAsia="Yu Gothic" w:hAnsi="Yu Gothic"/>
+          <w:sz w:val="20"/>
+          <w:szCs w:val="20"/>
+        </w:rPr>
+        <w:t xml:space="preserve">書き出したいカレンダーの右側にある「ⓘ」をタップ</w:t>
+      </w:r>
+    </w:p>
+    <w:p>
+      <w:pPr>
+        <w:pStyle w:val="ListParagraph"/>
+        <w:numPr>
+          <w:ilvl w:val="0"/>
+          <w:numId w:val="10"/>
+        </w:numPr>
+        <w:spacing w:after="100" w:line="300"/>
+      </w:pPr>
+      <w:r>
+        <w:rPr>
+          <w:rFonts w:ascii="Yu Gothic" w:cs="Yu Gothic" w:eastAsia="Yu Gothic" w:hAnsi="Yu Gothic"/>
+          <w:sz w:val="20"/>
+          <w:szCs w:val="20"/>
+        </w:rPr>
+        <w:t xml:space="preserve">「パブリックカレンダー」をオンにする</w:t>
+      </w:r>
+    </w:p>
+    <w:p>
+      <w:pPr>
+        <w:pStyle w:val="ListParagraph"/>
+        <w:numPr>
+          <w:ilvl w:val="0"/>
+          <w:numId w:val="10"/>
+        </w:numPr>
+        <w:spacing w:after="100" w:line="300"/>
+      </w:pPr>
+      <w:r>
+        <w:rPr>
+          <w:rFonts w:ascii="Yu Gothic" w:cs="Yu Gothic" w:eastAsia="Yu Gothic" w:hAnsi="Yu Gothic"/>
+          <w:sz w:val="20"/>
+          <w:szCs w:val="20"/>
+        </w:rPr>
+        <w:t xml:space="preserve">「リンクを共有」をタップし、「コピー」を選ぶ</w:t>
+      </w:r>
+    </w:p>
+    <w:p>
+      <w:pPr>
+        <w:spacing w:after="120" w:line="300"/>
+      </w:pPr>
+      <w:r>
+        <w:rPr>
+          <w:rFonts w:ascii="Yu Gothic" w:cs="Yu Gothic" w:eastAsia="Yu Gothic" w:hAnsi="Yu Gothic"/>
+          <w:b/>
+          <w:bCs/>
+          <w:sz w:val="20"/>
+          <w:szCs w:val="20"/>
+        </w:rPr>
+        <w:t xml:space="preserve">　パソコンで行う場合</w:t>
+      </w:r>
+    </w:p>
+    <w:p>
+      <w:pPr>
+        <w:pStyle w:val="ListParagraph"/>
+        <w:numPr>
+          <w:ilvl w:val="0"/>
+          <w:numId w:val="11"/>
+        </w:numPr>
+        <w:spacing w:after="100" w:line="300"/>
+      </w:pPr>
+      <w:r>
+        <w:rPr>
+          <w:rFonts w:ascii="Yu Gothic" w:cs="Yu Gothic" w:eastAsia="Yu Gothic" w:hAnsi="Yu Gothic"/>
+          <w:sz w:val="20"/>
+          <w:szCs w:val="20"/>
+        </w:rPr>
+        <w:t xml:space="preserve">icloud.com/calendar を開いてサインイン</w:t>
+      </w:r>
+    </w:p>
+    <w:p>
+      <w:pPr>
+        <w:pStyle w:val="ListParagraph"/>
+        <w:numPr>
+          <w:ilvl w:val="0"/>
+          <w:numId w:val="11"/>
+        </w:numPr>
+        <w:spacing w:after="100" w:line="300"/>
+      </w:pPr>
+      <w:r>
+        <w:rPr>
+          <w:rFonts w:ascii="Yu Gothic" w:cs="Yu Gothic" w:eastAsia="Yu Gothic" w:hAnsi="Yu Gothic"/>
+          <w:sz w:val="20"/>
+          <w:szCs w:val="20"/>
+        </w:rPr>
+        <w:t xml:space="preserve">左側のカレンダー名にポインタを合わせ、表示される「ⓘ」（情報）を選ぶ</w:t>
+      </w:r>
+    </w:p>
+    <w:p>
+      <w:pPr>
+        <w:pStyle w:val="ListParagraph"/>
+        <w:numPr>
+          <w:ilvl w:val="0"/>
+          <w:numId w:val="11"/>
+        </w:numPr>
+        <w:spacing w:after="100" w:line="300"/>
+      </w:pPr>
+      <w:r>
+        <w:rPr>
+          <w:rFonts w:ascii="Yu Gothic" w:cs="Yu Gothic" w:eastAsia="Yu Gothic" w:hAnsi="Yu Gothic"/>
+          <w:sz w:val="20"/>
+          <w:szCs w:val="20"/>
+        </w:rPr>
+        <w:t xml:space="preserve">「パブリックカレンダー」をオンにする</w:t>
+      </w:r>
+    </w:p>
+    <w:p>
+      <w:pPr>
+        <w:pStyle w:val="ListParagraph"/>
+        <w:numPr>
+          <w:ilvl w:val="0"/>
+          <w:numId w:val="11"/>
+        </w:numPr>
+        <w:spacing w:after="100" w:line="300"/>
+      </w:pPr>
+      <w:r>
+        <w:rPr>
+          <w:rFonts w:ascii="Yu Gothic" w:cs="Yu Gothic" w:eastAsia="Yu Gothic" w:hAnsi="Yu Gothic"/>
+          <w:sz w:val="20"/>
+          <w:szCs w:val="20"/>
+        </w:rPr>
+        <w:t xml:space="preserve">「コピー」を選んでリンクをコピー</w:t>
       </w:r>
     </w:p>
     <w:p>
@@ -2893,7 +3080,7 @@
           <w:sz w:val="20"/>
           <w:szCs w:val="20"/>
         </w:rPr>
-        <w:t xml:space="preserve">Googleカレンダーに読み込む</w:t>
+        <w:t xml:space="preserve">コピーしたリンクを書き換えて、ファイルとして保存する</w:t>
       </w:r>
     </w:p>
     <w:p>
@@ -2907,7 +3094,100 @@
           <w:sz w:val="20"/>
           <w:szCs w:val="20"/>
         </w:rPr>
-        <w:t xml:space="preserve">Googleカレンダーの「設定 → インポート/エクスポート → インポート」で .ics を選び、取り込み先のカレンダーを指定します。</w:t>
+        <w:t xml:space="preserve">コピーされるのは webcal://p12-caldav.icloud.com/published/2/… のようなリンクです。メモ帳など好きな場所に一度貼り付け、先頭の webcal:// だけを https:// に手で書き換えてください。</w:t>
+      </w:r>
+    </w:p>
+    <w:p>
+      <w:pPr>
+        <w:spacing w:after="140" w:line="300"/>
+        <w:ind w:left="720"/>
+      </w:pPr>
+      <w:r>
+        <w:rPr>
+          <w:rFonts w:ascii="Yu Gothic" w:cs="Yu Gothic" w:eastAsia="Yu Gothic" w:hAnsi="Yu Gothic"/>
+          <w:sz w:val="20"/>
+          <w:szCs w:val="20"/>
+        </w:rPr>
+        <w:t xml:space="preserve">書き換えたURLをブラウザの新しいタブのアドレス欄に貼り付けてEnterを押すと、.ics ファイルが自動でダウンロードされます。テキストがそのまま画面に表示された場合は、「ファイル → 名前を付けて保存」（Windowsは Ctrl+S）で、拡張子を .ics にして保存してください。</w:t>
+      </w:r>
+    </w:p>
+    <w:p>
+      <w:pPr>
+        <w:pStyle w:val="ListParagraph"/>
+        <w:numPr>
+          <w:ilvl w:val="0"/>
+          <w:numId w:val="9"/>
+        </w:numPr>
+        <w:spacing w:after="100" w:line="300"/>
+      </w:pPr>
+      <w:r>
+        <w:rPr>
+          <w:rFonts w:ascii="Yu Gothic" w:cs="Yu Gothic" w:eastAsia="Yu Gothic" w:hAnsi="Yu Gothic"/>
+          <w:b/>
+          <w:bCs/>
+          <w:sz w:val="20"/>
+          <w:szCs w:val="20"/>
+        </w:rPr>
+        <w:t xml:space="preserve">Googleカレンダーに読み込む</w:t>
+      </w:r>
+    </w:p>
+    <w:p>
+      <w:pPr>
+        <w:spacing w:after="140" w:line="300"/>
+        <w:ind w:left="720"/>
+      </w:pPr>
+      <w:r>
+        <w:rPr>
+          <w:rFonts w:ascii="Yu Gothic" w:cs="Yu Gothic" w:eastAsia="Yu Gothic" w:hAnsi="Yu Gothic"/>
+          <w:sz w:val="20"/>
+          <w:szCs w:val="20"/>
+        </w:rPr>
+        <w:t xml:space="preserve">Googleカレンダーの「設定 → インポート/エクスポート → インポート」で、保存した .ics ファイルを選び、取り込み先のカレンダーを指定します。</w:t>
+      </w:r>
+    </w:p>
+    <w:p>
+      <w:pPr>
+        <w:pBdr>
+          <w:top w:val="single" w:color="9B3D3D" w:sz="4" w:space="8"/>
+          <w:bottom w:val="single" w:color="9B3D3D" w:sz="4" w:space="8"/>
+          <w:left w:val="single" w:color="9B3D3D" w:sz="18" w:space="10"/>
+          <w:right w:val="single" w:color="9B3D3D" w:sz="4" w:space="8"/>
+        </w:pBdr>
+        <w:shd w:fill="FBF1EF" w:val="clear"/>
+        <w:spacing w:after="0" w:before="160" w:line="280"/>
+        <w:ind w:left="200" w:right="200"/>
+      </w:pPr>
+      <w:r>
+        <w:rPr>
+          <w:rFonts w:ascii="Yu Gothic" w:cs="Yu Gothic" w:eastAsia="Yu Gothic" w:hAnsi="Yu Gothic"/>
+          <w:b/>
+          <w:bCs/>
+          <w:color w:val="9B3D3D"/>
+          <w:sz w:val="18"/>
+          <w:szCs w:val="18"/>
+        </w:rPr>
+        <w:t xml:space="preserve">終わったら「パブリックカレンダー」をオフに戻す</w:t>
+      </w:r>
+    </w:p>
+    <w:p>
+      <w:pPr>
+        <w:pBdr>
+          <w:top w:val="single" w:color="9B3D3D" w:sz="4" w:space="8"/>
+          <w:bottom w:val="single" w:color="9B3D3D" w:sz="4" w:space="8"/>
+          <w:left w:val="single" w:color="9B3D3D" w:sz="18" w:space="10"/>
+          <w:right w:val="single" w:color="9B3D3D" w:sz="4" w:space="8"/>
+        </w:pBdr>
+        <w:shd w:fill="FBF1EF" w:val="clear"/>
+        <w:spacing w:after="200" w:line="280"/>
+        <w:ind w:left="200" w:right="200"/>
+      </w:pPr>
+      <w:r>
+        <w:rPr>
+          <w:rFonts w:ascii="Yu Gothic" w:cs="Yu Gothic" w:eastAsia="Yu Gothic" w:hAnsi="Yu Gothic"/>
+          <w:sz w:val="20"/>
+          <w:szCs w:val="20"/>
+        </w:rPr>
+        <w:t xml:space="preserve">オンのままにしておくと、リンクを知っている人なら誰でもその予定を閲覧できてしまいます。.ics ファイルを保存し終えたら、iPhoneまたはiCloud.comの同じ画面で「パブリックカレンダー」をオフに戻してください（保存済みの .ics ファイルには影響しません）。</w:t>
       </w:r>
     </w:p>
     <w:p>
@@ -2952,7 +3232,7 @@
           <w:sz w:val="20"/>
           <w:szCs w:val="20"/>
         </w:rPr>
-        <w:t xml:space="preserve">方法Cは、実行した時点でiCloudに入っている予定を</w:t>
+        <w:t xml:space="preserve">方法Cは、書き出した時点でiCloudに入っている予定を</w:t>
       </w:r>
       <w:r>
         <w:rPr>
@@ -3075,7 +3355,7 @@
         <w:pStyle w:val="ListParagraph"/>
         <w:numPr>
           <w:ilvl w:val="0"/>
-          <w:numId w:val="10"/>
+          <w:numId w:val="12"/>
         </w:numPr>
         <w:spacing w:after="100" w:line="300"/>
       </w:pPr>
@@ -3109,7 +3389,7 @@
         <w:pStyle w:val="ListParagraph"/>
         <w:numPr>
           <w:ilvl w:val="0"/>
-          <w:numId w:val="10"/>
+          <w:numId w:val="12"/>
         </w:numPr>
         <w:spacing w:after="100" w:line="300"/>
       </w:pPr>
@@ -3143,7 +3423,7 @@
         <w:pStyle w:val="ListParagraph"/>
         <w:numPr>
           <w:ilvl w:val="0"/>
-          <w:numId w:val="10"/>
+          <w:numId w:val="12"/>
         </w:numPr>
         <w:spacing w:after="100" w:line="300"/>
       </w:pPr>
@@ -3195,7 +3475,7 @@
         <w:pStyle w:val="ListParagraph"/>
         <w:numPr>
           <w:ilvl w:val="0"/>
-          <w:numId w:val="10"/>
+          <w:numId w:val="12"/>
         </w:numPr>
         <w:spacing w:after="100" w:line="300"/>
       </w:pPr>
@@ -3818,6 +4098,18 @@
     </w:lvlOverride>
   </w:num>
   <w:num w:numId="10">
+    <w:abstractNumId w:val="3"/>
+    <w:lvlOverride w:ilvl="0">
+      <w:startOverride w:val="1"/>
+    </w:lvlOverride>
+  </w:num>
+  <w:num w:numId="11">
+    <w:abstractNumId w:val="3"/>
+    <w:lvlOverride w:ilvl="0">
+      <w:startOverride w:val="1"/>
+    </w:lvlOverride>
+  </w:num>
+  <w:num w:numId="12">
     <w:abstractNumId w:val="2"/>
     <w:lvlOverride w:ilvl="0">
       <w:startOverride w:val="1"/>

</xml_diff>